<commit_message>
Bổ sung mục "Tính mới và khả năng ứng dụng" cho báo cáo, bám rubric GVHD
- Thêm mục 5.2 (tính mới, khả năng ứng dụng, triển vọng) nhắm tiêu chí 4 của rubric
- Đánh số lại 5.3 Hạn chế, 5.4 Hướng phát triển
- Sinh lại BaoCao_RAG_DATN.docx (validate OOXML PASSED)
</commit_message>
<xml_diff>
--- a/report/BaoCao_RAG_DATN.docx
+++ b/report/BaoCao_RAG_DATN.docx
@@ -4369,7 +4369,40 @@
           <w:color w:val="000000"/>
           <w:sz w:val="26"/>
         </w:rPr>
-        <w:t>5.2. Hạn chế</w:t>
+        <w:t>5.2. Tính mới và khả năng ứng dụng</w:t>
+      </w:r>
+    </w:p>
+    <w:p>
+      <w:pPr>
+        <w:spacing w:line="360" w:lineRule="auto" w:after="120"/>
+        <w:ind w:firstLine="567"/>
+        <w:jc w:val="both"/>
+      </w:pPr>
+      <w:r>
+        <w:rPr>
+          <w:rFonts w:ascii="Times New Roman" w:hAnsi="Times New Roman" w:cs="Times New Roman"/>
+          <w:b w:val="0"/>
+          <w:i w:val="0"/>
+          <w:sz w:val="26"/>
+        </w:rPr>
+        <w:t>Tính mới: đồ án kết hợp một cách có hệ thống các kỹ thuật phù hợp tiếng Việt và miền pháp luật — bi-encoder dựa trên PhoBERT, hybrid BM25+vector kèm nhận diện số hiệu văn bản, reranker PhoRanker và sinh có ràng buộc trích dẫn bằng PhoGPT — đồng thời chứng minh đóng góp của từng thành phần bằng thực nghiệm A/B. Điểm khác biệt so với các hệ RAG phổ thông là cơ chế nhận diện số hiệu văn bản nhằm khắc phục điểm yếu của tìm kiếm ngữ nghĩa đối với các định danh chính xác. Khả năng ứng dụng: hệ thống có thể dùng làm công cụ hỗ trợ tra cứu cho người dân, cán bộ y tế và sinh viên; vận hành trên máy phổ thông (CPU) nên dễ triển khai trong điều kiện hạn chế. Triển vọng: kiến trúc mang tính tổng quát, có thể mở rộng sang các lĩnh vực pháp luật khác và nâng cấp thành dịch vụ trực tuyến khi có hạ tầng mạnh hơn.</w:t>
+      </w:r>
+    </w:p>
+    <w:p>
+      <w:pPr>
+        <w:pStyle w:val="Heading2"/>
+        <w:keepNext/>
+        <w:spacing w:before="200" w:after="80"/>
+      </w:pPr>
+      <w:r>
+        <w:rPr>
+          <w:rFonts w:ascii="Times New Roman" w:hAnsi="Times New Roman" w:cs="Times New Roman"/>
+          <w:b/>
+          <w:i w:val="0"/>
+          <w:color w:val="000000"/>
+          <w:sz w:val="26"/>
+        </w:rPr>
+        <w:t>5.3. Hạn chế</w:t>
       </w:r>
     </w:p>
     <w:p>
@@ -4431,7 +4464,7 @@
           <w:color w:val="000000"/>
           <w:sz w:val="26"/>
         </w:rPr>
-        <w:t>5.3. Hướng phát triển</w:t>
+        <w:t>5.4. Hướng phát triển</w:t>
       </w:r>
     </w:p>
     <w:p>

</xml_diff>

<commit_message>
Mở rộng nội dung 1st draft: so sánh RAG, lý thuyết sâu hơn, mẫu prompt, thời gian phản hồi
</commit_message>
<xml_diff>
--- a/report/BaoCao_RAG_DATN.docx
+++ b/report/BaoCao_RAG_DATN.docx
@@ -414,7 +414,37 @@
           <w:i w:val="0"/>
           <w:sz w:val="26"/>
         </w:rPr>
+        <w:t>Bảng 1.1. So sánh các hướng tiếp cận trả lời câu hỏi chuyên ngành</w:t>
+      </w:r>
+    </w:p>
+    <w:p>
+      <w:pPr>
+        <w:spacing w:line="360" w:lineRule="auto" w:after="120"/>
+        <w:jc w:val="left"/>
+      </w:pPr>
+      <w:r>
+        <w:rPr>
+          <w:rFonts w:ascii="Times New Roman" w:hAnsi="Times New Roman" w:cs="Times New Roman"/>
+          <w:b w:val="0"/>
+          <w:i w:val="0"/>
+          <w:sz w:val="26"/>
+        </w:rPr>
         <w:t>Bảng 2.1. Phân bố loại văn bản trong corpus</w:t>
+      </w:r>
+    </w:p>
+    <w:p>
+      <w:pPr>
+        <w:spacing w:line="360" w:lineRule="auto" w:after="120"/>
+        <w:jc w:val="left"/>
+      </w:pPr>
+      <w:r>
+        <w:rPr>
+          <w:rFonts w:ascii="Times New Roman" w:hAnsi="Times New Roman" w:cs="Times New Roman"/>
+          <w:b w:val="0"/>
+          <w:i w:val="0"/>
+          <w:sz w:val="26"/>
+        </w:rPr>
+        <w:t>Bảng 3.1. Các module chính của hệ thống</w:t>
       </w:r>
     </w:p>
     <w:p>
@@ -990,6 +1020,466 @@
     </w:p>
     <w:p>
       <w:pPr>
+        <w:spacing w:line="360" w:lineRule="auto" w:after="120"/>
+        <w:ind w:firstLine="567"/>
+        <w:jc w:val="both"/>
+      </w:pPr>
+      <w:r>
+        <w:rPr>
+          <w:rFonts w:ascii="Times New Roman" w:hAnsi="Times New Roman" w:cs="Times New Roman"/>
+          <w:b w:val="0"/>
+          <w:i w:val="0"/>
+          <w:sz w:val="26"/>
+        </w:rPr>
+        <w:t>Có ba hướng tiếp cận chính để một mô hình ngôn ngữ trả lời câu hỏi chuyên ngành: (1) chỉ dùng LLM với tri thức sẵn có trong tham số; (2) tinh chỉnh (fine-tuning) LLM trên dữ liệu chuyên ngành; và (3) RAG. Bảng 1.1 so sánh ba hướng theo các tiêu chí quan trọng với bài toán pháp luật.</w:t>
+      </w:r>
+    </w:p>
+    <w:p>
+      <w:pPr>
+        <w:spacing w:before="120"/>
+        <w:jc w:val="center"/>
+      </w:pPr>
+      <w:r>
+        <w:rPr>
+          <w:rFonts w:ascii="Times New Roman" w:hAnsi="Times New Roman" w:cs="Times New Roman"/>
+          <w:b/>
+          <w:i w:val="0"/>
+          <w:sz w:val="24"/>
+        </w:rPr>
+        <w:t>Bảng 1.1. So sánh các hướng tiếp cận trả lời câu hỏi chuyên ngành</w:t>
+      </w:r>
+    </w:p>
+    <w:tbl>
+      <w:tblPr>
+        <w:tblStyle w:val="TableGrid"/>
+        <w:tblW w:type="auto" w:w="0"/>
+        <w:jc w:val="center"/>
+        <w:tblLook w:firstColumn="1" w:firstRow="1" w:lastColumn="0" w:lastRow="0" w:noHBand="0" w:noVBand="1" w:val="04A0"/>
+      </w:tblPr>
+      <w:tblGrid>
+        <w:gridCol w:w="2268"/>
+        <w:gridCol w:w="2268"/>
+        <w:gridCol w:w="2268"/>
+        <w:gridCol w:w="2268"/>
+      </w:tblGrid>
+      <w:tr>
+        <w:tc>
+          <w:tcPr>
+            <w:tcW w:type="dxa" w:w="2268"/>
+            <w:shd w:val="clear" w:fill="D9E2F3"/>
+          </w:tcPr>
+          <w:p>
+            <w:pPr>
+              <w:jc w:val="center"/>
+            </w:pPr>
+            <w:r>
+              <w:rPr>
+                <w:rFonts w:ascii="Times New Roman" w:hAnsi="Times New Roman" w:cs="Times New Roman"/>
+                <w:b/>
+                <w:i w:val="0"/>
+                <w:sz w:val="24"/>
+              </w:rPr>
+              <w:t>Tiêu chí</w:t>
+            </w:r>
+          </w:p>
+        </w:tc>
+        <w:tc>
+          <w:tcPr>
+            <w:tcW w:type="dxa" w:w="2268"/>
+            <w:shd w:val="clear" w:fill="D9E2F3"/>
+          </w:tcPr>
+          <w:p>
+            <w:pPr>
+              <w:jc w:val="center"/>
+            </w:pPr>
+            <w:r>
+              <w:rPr>
+                <w:rFonts w:ascii="Times New Roman" w:hAnsi="Times New Roman" w:cs="Times New Roman"/>
+                <w:b/>
+                <w:i w:val="0"/>
+                <w:sz w:val="24"/>
+              </w:rPr>
+              <w:t>LLM thuần</w:t>
+            </w:r>
+          </w:p>
+        </w:tc>
+        <w:tc>
+          <w:tcPr>
+            <w:tcW w:type="dxa" w:w="2268"/>
+            <w:shd w:val="clear" w:fill="D9E2F3"/>
+          </w:tcPr>
+          <w:p>
+            <w:pPr>
+              <w:jc w:val="center"/>
+            </w:pPr>
+            <w:r>
+              <w:rPr>
+                <w:rFonts w:ascii="Times New Roman" w:hAnsi="Times New Roman" w:cs="Times New Roman"/>
+                <w:b/>
+                <w:i w:val="0"/>
+                <w:sz w:val="24"/>
+              </w:rPr>
+              <w:t>Fine-tuning</w:t>
+            </w:r>
+          </w:p>
+        </w:tc>
+        <w:tc>
+          <w:tcPr>
+            <w:tcW w:type="dxa" w:w="2268"/>
+            <w:shd w:val="clear" w:fill="D9E2F3"/>
+          </w:tcPr>
+          <w:p>
+            <w:pPr>
+              <w:jc w:val="center"/>
+            </w:pPr>
+            <w:r>
+              <w:rPr>
+                <w:rFonts w:ascii="Times New Roman" w:hAnsi="Times New Roman" w:cs="Times New Roman"/>
+                <w:b/>
+                <w:i w:val="0"/>
+                <w:sz w:val="24"/>
+              </w:rPr>
+              <w:t>RAG</w:t>
+            </w:r>
+          </w:p>
+        </w:tc>
+      </w:tr>
+      <w:tr>
+        <w:tc>
+          <w:tcPr>
+            <w:tcW w:type="dxa" w:w="2268"/>
+          </w:tcPr>
+          <w:p>
+            <w:pPr>
+              <w:jc w:val="left"/>
+            </w:pPr>
+            <w:r>
+              <w:rPr>
+                <w:rFonts w:ascii="Times New Roman" w:hAnsi="Times New Roman" w:cs="Times New Roman"/>
+                <w:b w:val="0"/>
+                <w:i w:val="0"/>
+                <w:sz w:val="24"/>
+              </w:rPr>
+              <w:t>Cập nhật tri thức</w:t>
+            </w:r>
+          </w:p>
+        </w:tc>
+        <w:tc>
+          <w:tcPr>
+            <w:tcW w:type="dxa" w:w="2268"/>
+          </w:tcPr>
+          <w:p>
+            <w:pPr>
+              <w:jc w:val="center"/>
+            </w:pPr>
+            <w:r>
+              <w:rPr>
+                <w:rFonts w:ascii="Times New Roman" w:hAnsi="Times New Roman" w:cs="Times New Roman"/>
+                <w:b w:val="0"/>
+                <w:i w:val="0"/>
+                <w:sz w:val="24"/>
+              </w:rPr>
+              <w:t>Khó</w:t>
+            </w:r>
+          </w:p>
+        </w:tc>
+        <w:tc>
+          <w:tcPr>
+            <w:tcW w:type="dxa" w:w="2268"/>
+          </w:tcPr>
+          <w:p>
+            <w:pPr>
+              <w:jc w:val="center"/>
+            </w:pPr>
+            <w:r>
+              <w:rPr>
+                <w:rFonts w:ascii="Times New Roman" w:hAnsi="Times New Roman" w:cs="Times New Roman"/>
+                <w:b w:val="0"/>
+                <w:i w:val="0"/>
+                <w:sz w:val="24"/>
+              </w:rPr>
+              <w:t>Huấn luyện lại</w:t>
+            </w:r>
+          </w:p>
+        </w:tc>
+        <w:tc>
+          <w:tcPr>
+            <w:tcW w:type="dxa" w:w="2268"/>
+          </w:tcPr>
+          <w:p>
+            <w:pPr>
+              <w:jc w:val="center"/>
+            </w:pPr>
+            <w:r>
+              <w:rPr>
+                <w:rFonts w:ascii="Times New Roman" w:hAnsi="Times New Roman" w:cs="Times New Roman"/>
+                <w:b w:val="0"/>
+                <w:i w:val="0"/>
+                <w:sz w:val="24"/>
+              </w:rPr>
+              <w:t>Đổi kho dữ liệu</w:t>
+            </w:r>
+          </w:p>
+        </w:tc>
+      </w:tr>
+      <w:tr>
+        <w:tc>
+          <w:tcPr>
+            <w:tcW w:type="dxa" w:w="2268"/>
+          </w:tcPr>
+          <w:p>
+            <w:pPr>
+              <w:jc w:val="left"/>
+            </w:pPr>
+            <w:r>
+              <w:rPr>
+                <w:rFonts w:ascii="Times New Roman" w:hAnsi="Times New Roman" w:cs="Times New Roman"/>
+                <w:b w:val="0"/>
+                <w:i w:val="0"/>
+                <w:sz w:val="24"/>
+              </w:rPr>
+              <w:t>Trích dẫn nguồn</w:t>
+            </w:r>
+          </w:p>
+        </w:tc>
+        <w:tc>
+          <w:tcPr>
+            <w:tcW w:type="dxa" w:w="2268"/>
+          </w:tcPr>
+          <w:p>
+            <w:pPr>
+              <w:jc w:val="center"/>
+            </w:pPr>
+            <w:r>
+              <w:rPr>
+                <w:rFonts w:ascii="Times New Roman" w:hAnsi="Times New Roman" w:cs="Times New Roman"/>
+                <w:b w:val="0"/>
+                <w:i w:val="0"/>
+                <w:sz w:val="24"/>
+              </w:rPr>
+              <w:t>Không</w:t>
+            </w:r>
+          </w:p>
+        </w:tc>
+        <w:tc>
+          <w:tcPr>
+            <w:tcW w:type="dxa" w:w="2268"/>
+          </w:tcPr>
+          <w:p>
+            <w:pPr>
+              <w:jc w:val="center"/>
+            </w:pPr>
+            <w:r>
+              <w:rPr>
+                <w:rFonts w:ascii="Times New Roman" w:hAnsi="Times New Roman" w:cs="Times New Roman"/>
+                <w:b w:val="0"/>
+                <w:i w:val="0"/>
+                <w:sz w:val="24"/>
+              </w:rPr>
+              <w:t>Không</w:t>
+            </w:r>
+          </w:p>
+        </w:tc>
+        <w:tc>
+          <w:tcPr>
+            <w:tcW w:type="dxa" w:w="2268"/>
+          </w:tcPr>
+          <w:p>
+            <w:pPr>
+              <w:jc w:val="center"/>
+            </w:pPr>
+            <w:r>
+              <w:rPr>
+                <w:rFonts w:ascii="Times New Roman" w:hAnsi="Times New Roman" w:cs="Times New Roman"/>
+                <w:b w:val="0"/>
+                <w:i w:val="0"/>
+                <w:sz w:val="24"/>
+              </w:rPr>
+              <w:t>Có</w:t>
+            </w:r>
+          </w:p>
+        </w:tc>
+      </w:tr>
+      <w:tr>
+        <w:tc>
+          <w:tcPr>
+            <w:tcW w:type="dxa" w:w="2268"/>
+          </w:tcPr>
+          <w:p>
+            <w:pPr>
+              <w:jc w:val="left"/>
+            </w:pPr>
+            <w:r>
+              <w:rPr>
+                <w:rFonts w:ascii="Times New Roman" w:hAnsi="Times New Roman" w:cs="Times New Roman"/>
+                <w:b w:val="0"/>
+                <w:i w:val="0"/>
+                <w:sz w:val="24"/>
+              </w:rPr>
+              <w:t>Nguy cơ bịa đặt</w:t>
+            </w:r>
+          </w:p>
+        </w:tc>
+        <w:tc>
+          <w:tcPr>
+            <w:tcW w:type="dxa" w:w="2268"/>
+          </w:tcPr>
+          <w:p>
+            <w:pPr>
+              <w:jc w:val="center"/>
+            </w:pPr>
+            <w:r>
+              <w:rPr>
+                <w:rFonts w:ascii="Times New Roman" w:hAnsi="Times New Roman" w:cs="Times New Roman"/>
+                <w:b w:val="0"/>
+                <w:i w:val="0"/>
+                <w:sz w:val="24"/>
+              </w:rPr>
+              <w:t>Cao</w:t>
+            </w:r>
+          </w:p>
+        </w:tc>
+        <w:tc>
+          <w:tcPr>
+            <w:tcW w:type="dxa" w:w="2268"/>
+          </w:tcPr>
+          <w:p>
+            <w:pPr>
+              <w:jc w:val="center"/>
+            </w:pPr>
+            <w:r>
+              <w:rPr>
+                <w:rFonts w:ascii="Times New Roman" w:hAnsi="Times New Roman" w:cs="Times New Roman"/>
+                <w:b w:val="0"/>
+                <w:i w:val="0"/>
+                <w:sz w:val="24"/>
+              </w:rPr>
+              <w:t>Trung bình</w:t>
+            </w:r>
+          </w:p>
+        </w:tc>
+        <w:tc>
+          <w:tcPr>
+            <w:tcW w:type="dxa" w:w="2268"/>
+          </w:tcPr>
+          <w:p>
+            <w:pPr>
+              <w:jc w:val="center"/>
+            </w:pPr>
+            <w:r>
+              <w:rPr>
+                <w:rFonts w:ascii="Times New Roman" w:hAnsi="Times New Roman" w:cs="Times New Roman"/>
+                <w:b w:val="0"/>
+                <w:i w:val="0"/>
+                <w:sz w:val="24"/>
+              </w:rPr>
+              <w:t>Thấp</w:t>
+            </w:r>
+          </w:p>
+        </w:tc>
+      </w:tr>
+      <w:tr>
+        <w:tc>
+          <w:tcPr>
+            <w:tcW w:type="dxa" w:w="2268"/>
+          </w:tcPr>
+          <w:p>
+            <w:pPr>
+              <w:jc w:val="left"/>
+            </w:pPr>
+            <w:r>
+              <w:rPr>
+                <w:rFonts w:ascii="Times New Roman" w:hAnsi="Times New Roman" w:cs="Times New Roman"/>
+                <w:b w:val="0"/>
+                <w:i w:val="0"/>
+                <w:sz w:val="24"/>
+              </w:rPr>
+              <w:t>Chi phí tài nguyên</w:t>
+            </w:r>
+          </w:p>
+        </w:tc>
+        <w:tc>
+          <w:tcPr>
+            <w:tcW w:type="dxa" w:w="2268"/>
+          </w:tcPr>
+          <w:p>
+            <w:pPr>
+              <w:jc w:val="center"/>
+            </w:pPr>
+            <w:r>
+              <w:rPr>
+                <w:rFonts w:ascii="Times New Roman" w:hAnsi="Times New Roman" w:cs="Times New Roman"/>
+                <w:b w:val="0"/>
+                <w:i w:val="0"/>
+                <w:sz w:val="24"/>
+              </w:rPr>
+              <w:t>Thấp</w:t>
+            </w:r>
+          </w:p>
+        </w:tc>
+        <w:tc>
+          <w:tcPr>
+            <w:tcW w:type="dxa" w:w="2268"/>
+          </w:tcPr>
+          <w:p>
+            <w:pPr>
+              <w:jc w:val="center"/>
+            </w:pPr>
+            <w:r>
+              <w:rPr>
+                <w:rFonts w:ascii="Times New Roman" w:hAnsi="Times New Roman" w:cs="Times New Roman"/>
+                <w:b w:val="0"/>
+                <w:i w:val="0"/>
+                <w:sz w:val="24"/>
+              </w:rPr>
+              <w:t>Rất cao</w:t>
+            </w:r>
+          </w:p>
+        </w:tc>
+        <w:tc>
+          <w:tcPr>
+            <w:tcW w:type="dxa" w:w="2268"/>
+          </w:tcPr>
+          <w:p>
+            <w:pPr>
+              <w:jc w:val="center"/>
+            </w:pPr>
+            <w:r>
+              <w:rPr>
+                <w:rFonts w:ascii="Times New Roman" w:hAnsi="Times New Roman" w:cs="Times New Roman"/>
+                <w:b w:val="0"/>
+                <w:i w:val="0"/>
+                <w:sz w:val="24"/>
+              </w:rPr>
+              <w:t>Trung bình</w:t>
+            </w:r>
+          </w:p>
+        </w:tc>
+      </w:tr>
+    </w:tbl>
+    <w:p>
+      <w:pPr>
+        <w:spacing w:after="120"/>
+      </w:pPr>
+    </w:p>
+    <w:p>
+      <w:pPr>
+        <w:spacing w:line="360" w:lineRule="auto" w:after="120"/>
+        <w:ind w:firstLine="567"/>
+        <w:jc w:val="both"/>
+      </w:pPr>
+      <w:r>
+        <w:rPr>
+          <w:rFonts w:ascii="Times New Roman" w:hAnsi="Times New Roman" w:cs="Times New Roman"/>
+          <w:b w:val="0"/>
+          <w:i w:val="0"/>
+          <w:sz w:val="26"/>
+        </w:rPr>
+        <w:t>Với miền pháp luật — nơi câu trả lời bắt buộc phải kiểm chứng được và tri thức thay đổi liên tục — RAG là lựa chọn hợp lý nhất: vừa cập nhật dễ, vừa cho phép trích dẫn, vừa giảm bịa đặt mà không đòi hỏi tài nguyên huấn luyện lớn.</w:t>
+      </w:r>
+    </w:p>
+    <w:p>
+      <w:pPr>
         <w:pStyle w:val="Heading2"/>
         <w:keepNext/>
         <w:spacing w:before="200" w:after="80"/>
@@ -1035,7 +1525,23 @@
           <w:i w:val="0"/>
           <w:sz w:val="26"/>
         </w:rPr>
-        <w:t>PhoBERT [2] là mô hình ngôn ngữ tiền huấn luyện cho tiếng Việt theo kiến trúc RoBERTa, huấn luyện trên kho ngữ liệu tiếng Việt quy mô lớn. Một đặc điểm quan trọng: PhoBERT được huấn luyện trên dữ liệu đã được tách từ (word segmentation). Tiếng Việt là ngôn ngữ đơn lập, ranh giới “từ” không trùng với khoảng trắng — ví dụ “Bộ Y tế” là một từ ghép gồm ba âm tiết. Do đó, để khai thác đúng PhoBERT, đầu vào lúc suy luận cũng phải được tách từ bằng công cụ như pyvi, tạo dạng “Bộ_Y_tế”.</w:t>
+        <w:t>Các mô hình ngôn ngữ hiện đại dựa trên kiến trúc Transformer với cơ chế tự chú ý (self-attention), cho phép mô hình cân nhắc mối liên hệ giữa mọi cặp từ trong câu, từ đó nắm bắt ngữ cảnh tốt hơn các mạng tuần tự truyền thống. BERT là mô hình mã hóa hai chiều, được tiền huấn luyện theo tác vụ che từ (masked language modeling) trên kho văn bản lớn, sau đó có thể tinh chỉnh cho nhiều tác vụ hạ nguồn.</w:t>
+      </w:r>
+    </w:p>
+    <w:p>
+      <w:pPr>
+        <w:spacing w:line="360" w:lineRule="auto" w:after="120"/>
+        <w:ind w:firstLine="567"/>
+        <w:jc w:val="both"/>
+      </w:pPr>
+      <w:r>
+        <w:rPr>
+          <w:rFonts w:ascii="Times New Roman" w:hAnsi="Times New Roman" w:cs="Times New Roman"/>
+          <w:b w:val="0"/>
+          <w:i w:val="0"/>
+          <w:sz w:val="26"/>
+        </w:rPr>
+        <w:t>PhoBERT [2] là mô hình ngôn ngữ tiền huấn luyện cho tiếng Việt theo kiến trúc RoBERTa, huấn luyện trên kho ngữ liệu tiếng Việt quy mô lớn. Một đặc điểm quan trọng: PhoBERT được huấn luyện trên dữ liệu đã được tách từ (word segmentation). Tiếng Việt là ngôn ngữ đơn lập, ranh giới “từ” không trùng với khoảng trắng — ví dụ “Bộ Y tế” là một từ ghép gồm ba âm tiết. Do đó, để khai thác đúng PhoBERT, đầu vào lúc suy luận cũng phải được tách từ bằng công cụ như pyvi, tạo dạng “Bộ_Y_tế”; nếu không, embedding sẽ lệch khỏi phân phối lúc huấn luyện và làm giảm chất lượng (sẽ được kiểm chứng ở Thí nghiệm 1).</w:t>
       </w:r>
     </w:p>
     <w:p>
@@ -1068,7 +1574,54 @@
           <w:i w:val="0"/>
           <w:sz w:val="26"/>
         </w:rPr>
-        <w:t>PhoBERT gốc là mô hình masked language model; vector tại token [CLS] của nó không được tối ưu để đo độ tương đồng ngữ nghĩa giữa hai câu. Theo hướng Sentence-BERT [4], cần tinh chỉnh mô hình theo kiến trúc bi-encoder (hai nhánh chia sẻ trọng số, huấn luyện tương phản) để vector câu phản ánh tốt độ tương đồng. Đề tài sử dụng mô hình vietnamese-bi-encoder [7] (dựa trên PhoBERT, vector 768 chiều) — đây là cách dùng đúng cho bài toán tìm kiếm ngữ nghĩa. Độ tương đồng giữa hai vector u, v được đo bằng cosine: cos(u,v) = (u·v)/(‖u‖‖v‖).</w:t>
+        <w:t>PhoBERT gốc là mô hình masked language model; vector tại token [CLS] của nó không được tối ưu để đo độ tương đồng ngữ nghĩa giữa hai câu. Theo hướng Sentence-BERT [4], cần tinh chỉnh mô hình theo kiến trúc bi-encoder: hai câu được đưa qua cùng một mạng (chia sẻ trọng số), gộp các vector token (pooling) thành một vector câu, rồi huấn luyện theo mục tiêu tương phản (contrastive) — kéo gần các cặp liên quan và đẩy xa các cặp không liên quan. Nhờ vậy, khoảng cách trong không gian vector phản ánh đúng độ tương đồng ngữ nghĩa.</w:t>
+      </w:r>
+    </w:p>
+    <w:p>
+      <w:pPr>
+        <w:spacing w:line="360" w:lineRule="auto" w:after="120"/>
+        <w:ind w:firstLine="567"/>
+        <w:jc w:val="both"/>
+      </w:pPr>
+      <w:r>
+        <w:rPr>
+          <w:rFonts w:ascii="Times New Roman" w:hAnsi="Times New Roman" w:cs="Times New Roman"/>
+          <w:b w:val="0"/>
+          <w:i w:val="0"/>
+          <w:sz w:val="26"/>
+        </w:rPr>
+        <w:t>Đề tài sử dụng mô hình vietnamese-bi-encoder [7] (dựa trên PhoBERT, vector 768 chiều) — đây là cách dùng đúng cho bài toán tìm kiếm ngữ nghĩa. Độ tương đồng giữa hai vector u, v được đo bằng cosine:</w:t>
+      </w:r>
+    </w:p>
+    <w:p>
+      <w:pPr>
+        <w:spacing w:after="120"/>
+        <w:jc w:val="center"/>
+      </w:pPr>
+      <w:r>
+        <w:rPr>
+          <w:rFonts w:ascii="Times New Roman" w:hAnsi="Times New Roman" w:cs="Times New Roman"/>
+          <w:b w:val="0"/>
+          <w:i/>
+          <w:sz w:val="26"/>
+        </w:rPr>
+        <w:t>cos(u, v) = (u · v) / (‖u‖ · ‖v‖),  giá trị trong [-1, 1].</w:t>
+      </w:r>
+    </w:p>
+    <w:p>
+      <w:pPr>
+        <w:spacing w:line="360" w:lineRule="auto" w:after="120"/>
+        <w:ind w:firstLine="567"/>
+        <w:jc w:val="both"/>
+      </w:pPr>
+      <w:r>
+        <w:rPr>
+          <w:rFonts w:ascii="Times New Roman" w:hAnsi="Times New Roman" w:cs="Times New Roman"/>
+          <w:b w:val="0"/>
+          <w:i w:val="0"/>
+          <w:sz w:val="26"/>
+        </w:rPr>
+        <w:t>Ưu điểm của bi-encoder là mã hóa đoạn MỘT LẦN khi lập chỉ mục, sau đó truy vấn rất nhanh; nhược điểm là mã hóa câu hỏi và đoạn độc lập nên kém tinh tế — hạn chế này được khắc phục bằng reranker (Mục 1.5).</w:t>
       </w:r>
     </w:p>
     <w:p>
@@ -2614,7 +3167,7 @@
           <w:i w:val="0"/>
           <w:sz w:val="26"/>
         </w:rPr>
-        <w:t>Module hybrid lấy top-N ứng viên từ mỗi nguồn (vector và BM25), hợp nhất theo RRF, rồi nếu phát hiện số hiệu văn bản trong câu hỏi sẽ truy vấn trực tiếp các đoạn thuộc đúng văn bản đó và cộng điểm ưu tiên. Sau đó (tùy chọn) đưa các ứng viên qua reranker để chọn k đoạn cuối. Cơ chế lọc theo tình trạng hiệu lực được áp dụng nhất quán ở cả hai nguồn để bảo đảm chỉ trả về văn bản còn hiệu lực.</w:t>
+        <w:t>Module hybrid hoạt động theo các bước: (1) lấy top-N ứng viên từ truy xuất vector (ChromaDB) và top-N từ BM25; (2) hợp nhất hai danh sách bằng Reciprocal Rank Fusion, cộng điểm theo thứ hạng của mỗi tài liệu trong từng danh sách; (3) dùng biểu thức chính quy phát hiện số hiệu văn bản trong câu hỏi — nếu có, truy vấn trực tiếp các đoạn thuộc đúng văn bản đó từ ChromaDB và cộng điểm ưu tiên lớn; (4) lọc theo tình trạng hiệu lực; (5) (tùy chọn) đưa các ứng viên qua reranker để chọn k đoạn cuối. Bước (3) là điểm mấu chốt giúp hệ thống trả lời chính xác khi người dùng hỏi theo số hiệu — trường hợp mà tìm kiếm vector thuần thường thất bại.</w:t>
       </w:r>
     </w:p>
     <w:p>
@@ -2647,7 +3200,55 @@
           <w:i w:val="0"/>
           <w:sz w:val="26"/>
         </w:rPr>
-        <w:t>Prompt đưa vào PhoGPT gồm phần chỉ dẫn (chỉ dựa vào ngữ cảnh, bắt buộc trích dẫn số hiệu, nói rõ khi không tìm thấy thông tin), phần ngữ cảnh (các đoạn truy xuất, mỗi đoạn kèm số hiệu và tiêu đề nguồn), và câu hỏi. Cách thiết kế này nhằm “neo” câu trả lời vào ngữ cảnh, giảm bịa đặt và buộc mô hình dẫn nguồn — yêu cầu cốt lõi với miền pháp luật.</w:t>
+        <w:t>Prompt đưa vào PhoGPT gồm ba phần: (i) chỉ dẫn hệ thống, (ii) ngữ cảnh là các đoạn truy xuất được (mỗi đoạn kèm số hiệu và tiêu đề nguồn), (iii) câu hỏi của người dùng. Cấu trúc prompt được minh họa như sau:</w:t>
+      </w:r>
+    </w:p>
+    <w:p>
+      <w:pPr>
+        <w:spacing w:after="120"/>
+        <w:ind w:left="567"/>
+      </w:pPr>
+      <w:r>
+        <w:rPr>
+          <w:rFonts w:ascii="Consolas" w:hAnsi="Consolas"/>
+          <w:sz w:val="22"/>
+        </w:rPr>
+        <w:t>### Câu hỏi:</w:t>
+        <w:br/>
+        <w:t>Bạn là trợ lý tra cứu văn bản pháp luật ngành y tế. CHỈ dựa vào các văn bản được cung cấp để trả lời. Luôn trích dẫn số hiệu văn bản. Nếu thông tin không có trong văn bản, hãy nói rõ là không tìm thấy.</w:t>
+        <w:br/>
+        <w:br/>
+        <w:t>=== VĂN BẢN THAM KHẢO ===</w:t>
+        <w:br/>
+        <w:t>[1] &lt;số hiệu&gt; — &lt;tiêu đề&gt;</w:t>
+        <w:br/>
+        <w:t>&lt;nội dung đoạn&gt;</w:t>
+        <w:br/>
+        <w:t>...</w:t>
+        <w:br/>
+        <w:br/>
+        <w:t>=== CÂU HỎI ===</w:t>
+        <w:br/>
+        <w:t>&lt;câu hỏi của người dùng&gt;</w:t>
+        <w:br/>
+        <w:br/>
+        <w:t>### Trả lời:</w:t>
+      </w:r>
+    </w:p>
+    <w:p>
+      <w:pPr>
+        <w:spacing w:line="360" w:lineRule="auto" w:after="120"/>
+        <w:ind w:firstLine="567"/>
+        <w:jc w:val="both"/>
+      </w:pPr>
+      <w:r>
+        <w:rPr>
+          <w:rFonts w:ascii="Times New Roman" w:hAnsi="Times New Roman" w:cs="Times New Roman"/>
+          <w:b w:val="0"/>
+          <w:i w:val="0"/>
+          <w:sz w:val="26"/>
+        </w:rPr>
+        <w:t>Cách thiết kế này nhằm “neo” câu trả lời vào ngữ cảnh được cung cấp, buộc mô hình trích dẫn nguồn và thừa nhận khi không có thông tin — qua đó giảm hiện tượng bịa đặt, vốn là rủi ro lớn nhất khi áp dụng LLM cho miền pháp luật.</w:t>
       </w:r>
     </w:p>
     <w:p>
@@ -4300,7 +4901,40 @@
           <w:i w:val="0"/>
           <w:sz w:val="26"/>
         </w:rPr>
-        <w:t>Về phần sinh (RQ3), với câu hỏi “Điều kiện để cá nhân được phép khám bệnh, chữa bệnh?”, PhoGPT trả lời bám đúng Điều 19 Luật Khám bệnh, chữa bệnh 2023 (15/2023/QH15): cần có giấy phép hành nghề còn hiệu lực và đã đăng ký hành nghề, kèm trích dẫn số hiệu và không bịa thông tin ngoài ngữ cảnh. Thời gian sinh khoảng 20–40 giây/câu trên CPU — chấp nhận được cho mục đích tra cứu, dù chưa đạt thời gian thực.</w:t>
+        <w:t>Về phần sinh (RQ3), với câu hỏi “Điều kiện để cá nhân được phép khám bệnh, chữa bệnh?”, PhoGPT trả lời bám đúng Điều 19 Luật Khám bệnh, chữa bệnh 2023 (15/2023/QH15): cần có giấy phép hành nghề còn hiệu lực và đã đăng ký hành nghề, kèm trích dẫn số hiệu và không bịa thông tin ngoài ngữ cảnh.</w:t>
+      </w:r>
+    </w:p>
+    <w:p>
+      <w:pPr>
+        <w:pStyle w:val="Heading2"/>
+        <w:keepNext/>
+        <w:spacing w:before="200" w:after="80"/>
+      </w:pPr>
+      <w:r>
+        <w:rPr>
+          <w:rFonts w:ascii="Times New Roman" w:hAnsi="Times New Roman" w:cs="Times New Roman"/>
+          <w:b/>
+          <w:i w:val="0"/>
+          <w:color w:val="000000"/>
+          <w:sz w:val="26"/>
+        </w:rPr>
+        <w:t>4.8. Thời gian phản hồi và tài nguyên</w:t>
+      </w:r>
+    </w:p>
+    <w:p>
+      <w:pPr>
+        <w:spacing w:line="360" w:lineRule="auto" w:after="120"/>
+        <w:ind w:firstLine="567"/>
+        <w:jc w:val="both"/>
+      </w:pPr>
+      <w:r>
+        <w:rPr>
+          <w:rFonts w:ascii="Times New Roman" w:hAnsi="Times New Roman" w:cs="Times New Roman"/>
+          <w:b w:val="0"/>
+          <w:i w:val="0"/>
+          <w:sz w:val="26"/>
+        </w:rPr>
+        <w:t>Toàn bộ hệ thống vận hành trên CPU với 16GB RAM. Các mốc thời gian đo được: lập chỉ mục embedding đạt khoảng 7,7 đoạn/giây (toàn corpus 367.462 đoạn mất khoảng 13 giờ, chạy nền và có khả năng resume); nạp mô hình lần đầu khoảng 90 giây; sinh câu trả lời khoảng 20–40 giây mỗi câu (PhoGPT lượng tử hóa Q4). Mức thời gian này chấp nhận được cho mục đích tra cứu tham khảo, dù chưa đạt thời gian thực; có thể rút ngắn đáng kể nếu triển khai trên GPU hoặc dùng dịch vụ sinh. Việc lượng tử hóa GGUF Q4 là yếu tố then chốt giúp mô hình 3,7 tỷ tham số chạy được trong giới hạn 16GB RAM.</w:t>
       </w:r>
     </w:p>
     <w:p>

</xml_diff>

<commit_message>
Đào sâu 4 chương draft: công thức BM25/HNSW, công trình liên quan, ví dụ làm sạch & chunking, bảng API, phân tích lỗi
</commit_message>
<xml_diff>
--- a/report/BaoCao_RAG_DATN.docx
+++ b/report/BaoCao_RAG_DATN.docx
@@ -1654,7 +1654,23 @@
           <w:i w:val="0"/>
           <w:sz w:val="26"/>
         </w:rPr>
-        <w:t>Sau khi mã hóa, mỗi đoạn trở thành một điểm trong không gian 768 chiều. Truy xuất là tìm k điểm gần câu hỏi nhất theo cosine. Với hàng trăm nghìn vector, tìm kiếm vét cạn quá chậm, nên dùng chỉ mục lân cận gần đúng (Approximate Nearest Neighbor). ChromaDB [9] sử dụng thuật toán HNSW (Hierarchical Navigable Small World) — một đồ thị phân tầng cho phép truy vấn gần đúng với độ chính xác cao và tốc độ thực tế cao. ChromaDB còn lưu kèm metadata (số hiệu, loại văn bản, tình trạng hiệu lực…), cho phép lọc ngay trong truy vấn (ví dụ chỉ lấy văn bản còn hiệu lực).</w:t>
+        <w:t>Sau khi mã hóa, mỗi đoạn trở thành một điểm trong không gian 768 chiều. Truy xuất là tìm k điểm gần câu hỏi nhất theo cosine. Với hàng trăm nghìn vector, tìm kiếm vét cạn (so sánh với mọi điểm) quá chậm cho thời gian thực, nên dùng chỉ mục lân cận gần đúng (Approximate Nearest Neighbor — ANN).</w:t>
+      </w:r>
+    </w:p>
+    <w:p>
+      <w:pPr>
+        <w:spacing w:line="360" w:lineRule="auto" w:after="120"/>
+        <w:ind w:firstLine="567"/>
+        <w:jc w:val="both"/>
+      </w:pPr>
+      <w:r>
+        <w:rPr>
+          <w:rFonts w:ascii="Times New Roman" w:hAnsi="Times New Roman" w:cs="Times New Roman"/>
+          <w:b w:val="0"/>
+          <w:i w:val="0"/>
+          <w:sz w:val="26"/>
+        </w:rPr>
+        <w:t>ChromaDB [9] sử dụng thuật toán HNSW (Hierarchical Navigable Small World): xây một đồ thị nhiều tầng, tầng trên thưa để “nhảy xa”, tầng dưới dày để tinh chỉnh; khi truy vấn, thuật toán bắt đầu từ tầng trên và đi xuống dần theo các cạnh gần câu hỏi nhất. Cách này đánh đổi một phần độ chính xác lấy tốc độ truy vấn gần như hằng số theo kích thước kho, phù hợp với hàng trăm nghìn vector. ChromaDB còn lưu kèm metadata (số hiệu, loại văn bản, tình trạng hiệu lực…), cho phép lọc ngay trong truy vấn (ví dụ chỉ lấy văn bản còn hiệu lực) — rất hữu ích cho yêu cầu “chỉ tư vấn văn bản còn hiệu lực”.</w:t>
       </w:r>
     </w:p>
     <w:p>
@@ -1704,7 +1720,38 @@
           <w:i w:val="0"/>
           <w:sz w:val="26"/>
         </w:rPr>
-        <w:t>BM25 [5] là hàm xếp hạng dựa trên trùng khớp từ vựng, cải tiến từ TF-IDF với hai tham số điều chỉnh độ bão hòa tần suất từ (k1) và chuẩn hóa độ dài tài liệu (b). BM25 mạnh ở các truy vấn chứa từ khóa hiếm hoặc định danh chính xác — đặc biệt là số hiệu văn bản như “147/2025/NĐ-CP” — vốn là điểm yếu cố hữu của embedding ngữ nghĩa (embedding dễ “làm mờ” các chuỗi ký tự–số hiếm gặp).</w:t>
+        <w:t>BM25 [5] là hàm xếp hạng dựa trên trùng khớp từ vựng, cải tiến từ TF-IDF. Điểm BM25 của tài liệu d với truy vấn q được tính theo công thức:</w:t>
+      </w:r>
+    </w:p>
+    <w:p>
+      <w:pPr>
+        <w:spacing w:after="120"/>
+        <w:jc w:val="center"/>
+      </w:pPr>
+      <w:r>
+        <w:rPr>
+          <w:rFonts w:ascii="Times New Roman" w:hAnsi="Times New Roman" w:cs="Times New Roman"/>
+          <w:b w:val="0"/>
+          <w:i/>
+          <w:sz w:val="26"/>
+        </w:rPr>
+        <w:t>BM25(q,d) = Σ IDF(t) · [ f(t,d)·(k1+1) ] / [ f(t,d) + k1·(1 − b + b·|d|/avgdl) ]</w:t>
+      </w:r>
+    </w:p>
+    <w:p>
+      <w:pPr>
+        <w:spacing w:line="360" w:lineRule="auto" w:after="120"/>
+        <w:ind w:firstLine="567"/>
+        <w:jc w:val="both"/>
+      </w:pPr>
+      <w:r>
+        <w:rPr>
+          <w:rFonts w:ascii="Times New Roman" w:hAnsi="Times New Roman" w:cs="Times New Roman"/>
+          <w:b w:val="0"/>
+          <w:i w:val="0"/>
+          <w:sz w:val="26"/>
+        </w:rPr>
+        <w:t>trong đó f(t,d) là tần suất từ t trong tài liệu d; |d| là độ dài tài liệu; avgdl là độ dài trung bình; IDF(t) là trọng số nghịch tần suất tài liệu; k1 điều chỉnh độ bão hòa tần suất từ và b điều chỉnh mức chuẩn hóa theo độ dài. BM25 mạnh ở các truy vấn chứa từ khóa hiếm hoặc định danh chính xác — đặc biệt là số hiệu văn bản như “147/2025/NĐ-CP” — vốn là điểm yếu cố hữu của embedding ngữ nghĩa, do embedding dễ “làm mờ” các chuỗi ký tự–số hiếm gặp.</w:t>
       </w:r>
     </w:p>
     <w:p>
@@ -1899,6 +1946,55 @@
           <w:sz w:val="26"/>
         </w:rPr>
         <w:t>MRR nhạy với việc tài liệu đúng được xếp ở vị trí nào (ưu tiên xếp hạng cao), trong khi Hit@k phản ánh độ bao phủ. Hai độ đo bổ trợ nhau khi đánh giá chất lượng truy xuất.</w:t>
+      </w:r>
+    </w:p>
+    <w:p>
+      <w:pPr>
+        <w:pStyle w:val="Heading2"/>
+        <w:keepNext/>
+        <w:spacing w:before="200" w:after="80"/>
+      </w:pPr>
+      <w:r>
+        <w:rPr>
+          <w:rFonts w:ascii="Times New Roman" w:hAnsi="Times New Roman" w:cs="Times New Roman"/>
+          <w:b/>
+          <w:i w:val="0"/>
+          <w:color w:val="000000"/>
+          <w:sz w:val="26"/>
+        </w:rPr>
+        <w:t>1.8. Một số công trình liên quan</w:t>
+      </w:r>
+    </w:p>
+    <w:p>
+      <w:pPr>
+        <w:spacing w:line="360" w:lineRule="auto" w:after="120"/>
+        <w:ind w:firstLine="567"/>
+        <w:jc w:val="both"/>
+      </w:pPr>
+      <w:r>
+        <w:rPr>
+          <w:rFonts w:ascii="Times New Roman" w:hAnsi="Times New Roman" w:cs="Times New Roman"/>
+          <w:b w:val="0"/>
+          <w:i w:val="0"/>
+          <w:sz w:val="26"/>
+        </w:rPr>
+        <w:t>Kiến trúc RAG được Lewis và cộng sự [1] đề xuất, kết hợp truy xuất tài liệu với mô hình sinh để giải các tác vụ đòi hỏi tri thức. Về biểu diễn câu, Sentence-BERT [4] cho thấy việc tinh chỉnh BERT theo kiến trúc Siamese cải thiện rõ chất lượng đo tương đồng câu so với dùng vector [CLS] thô. Đối với tiếng Việt, PhoBERT [2] là mô hình nền tảng cho nhiều tác vụ; trên cơ sở đó, các mô hình bi-encoder tiếng Việt như vietnamese-bi-encoder [7] và bộ xếp hạng PhoRanker [8] được phát triển cho tìm kiếm và xếp hạng. Về sinh ngôn ngữ tiếng Việt, PhoGPT [3] là một trong các LLM mở quy mô vừa, phù hợp triển khai cục bộ sau lượng tử hóa.</w:t>
+      </w:r>
+    </w:p>
+    <w:p>
+      <w:pPr>
+        <w:spacing w:line="360" w:lineRule="auto" w:after="120"/>
+        <w:ind w:firstLine="567"/>
+        <w:jc w:val="both"/>
+      </w:pPr>
+      <w:r>
+        <w:rPr>
+          <w:rFonts w:ascii="Times New Roman" w:hAnsi="Times New Roman" w:cs="Times New Roman"/>
+          <w:b w:val="0"/>
+          <w:i w:val="0"/>
+          <w:sz w:val="26"/>
+        </w:rPr>
+        <w:t>Về kỹ thuật truy xuất, BM25 [5] vẫn là chuẩn mạnh cho tìm kiếm từ vựng; việc kết hợp tín hiệu từ vựng và ngữ nghĩa (hybrid) bằng Reciprocal Rank Fusion [6] thường vượt trội so với từng phương pháp đơn lẻ. Đề tài kế thừa các nền tảng này và đóng góp ở khía cạnh tích hợp – tối ưu cho miền pháp luật y tế tiếng Việt trên tài nguyên hạn chế, kèm cơ chế nhận diện số hiệu văn bản.</w:t>
       </w:r>
     </w:p>
     <w:p>
@@ -2071,7 +2167,41 @@
           <w:i w:val="0"/>
           <w:sz w:val="26"/>
         </w:rPr>
-        <w:t>Nội dung gốc là văn bản thuần (đã loại HTML), còn giữ dấu xuống dòng và các mốc “Điều”, “Chương”. Bước làm sạch chuẩn hóa khoảng trắng nhưng có chủ đích giữ lại cấu trúc xuống dòng và các ký tự dấu “/ - ( ) %”. Lý do: số hiệu văn bản (ví dụ 147/2025/NĐ-CP) là định danh quan trọng nhất để trích dẫn; nếu xóa các dấu này, số hiệu sẽ bị biến dạng (thành “147 2025 NĐ CP”), làm hỏng khả năng tra cứu và trích dẫn. Trong pipeline ban đầu, chính lỗi xóa dấu này đã được phát hiện và sửa.</w:t>
+        <w:t>Nội dung gốc là văn bản thuần (đã loại HTML), còn giữ dấu xuống dòng và các mốc “Điều”, “Chương”. Bước làm sạch chuẩn hóa khoảng trắng nhưng có chủ đích giữ lại cấu trúc xuống dòng và các ký tự dấu “/ - ( ) %”. Lý do: số hiệu văn bản là định danh quan trọng nhất để trích dẫn; nếu xóa các dấu này, số hiệu sẽ bị biến dạng, làm hỏng khả năng tra cứu. Ví dụ minh họa:</w:t>
+      </w:r>
+    </w:p>
+    <w:p>
+      <w:pPr>
+        <w:spacing w:line="360" w:lineRule="auto" w:after="120"/>
+        <w:ind w:firstLine="567"/>
+        <w:jc w:val="left"/>
+      </w:pPr>
+      <w:r>
+        <w:rPr>
+          <w:rFonts w:ascii="Times New Roman" w:hAnsi="Times New Roman" w:cs="Times New Roman"/>
+          <w:b w:val="0"/>
+          <w:i w:val="0"/>
+          <w:sz w:val="26"/>
+        </w:rPr>
+        <w:t>• Trước (làm sạch sai của pipeline cũ): “… Nghị định 147 2025 NĐ CP …” → mất cấu trúc số hiệu.</w:t>
+        <w:br/>
+        <w:t>• Sau (làm sạch đúng): “… Nghị định 147/2025/NĐ-CP …” → giữ nguyên định danh.</w:t>
+      </w:r>
+    </w:p>
+    <w:p>
+      <w:pPr>
+        <w:spacing w:line="360" w:lineRule="auto" w:after="120"/>
+        <w:ind w:firstLine="567"/>
+        <w:jc w:val="both"/>
+      </w:pPr>
+      <w:r>
+        <w:rPr>
+          <w:rFonts w:ascii="Times New Roman" w:hAnsi="Times New Roman" w:cs="Times New Roman"/>
+          <w:b w:val="0"/>
+          <w:i w:val="0"/>
+          <w:sz w:val="26"/>
+        </w:rPr>
+        <w:t>Trong pipeline ban đầu, chính lỗi xóa dấu này đã được phát hiện và sửa, cùng với lỗi nhân bản dữ liệu trình bày ở Mục 2.6.</w:t>
       </w:r>
     </w:p>
     <w:p>
@@ -2104,7 +2234,23 @@
           <w:i w:val="0"/>
           <w:sz w:val="26"/>
         </w:rPr>
-        <w:t>Văn bản được chia thành đoạn (chunk) bằng thuật toán đệ quy ưu tiên cắt tại các mốc pháp lý theo thứ tự “Điều” → “Chương” → “Mục” → đoạn → câu, với kích thước mục tiêu khoảng 1200 ký tự và phần chồng lấp (overlap) 150 ký tự. Việc cắt theo “Điều” giúp mỗi đoạn là một đơn vị ngữ nghĩa tương đối hoàn chỉnh, thay vì cắt cứng theo số ký tự dễ làm đứt câu và mất ngữ cảnh. Phần chồng lấp giữ liên tục ngữ nghĩa giữa các đoạn liền kề. Giả thuyết “cắt theo Điều tốt hơn cắt cứng” được kiểm chứng định lượng ở Chương 4.</w:t>
+        <w:t>Văn bản được chia thành đoạn (chunk) bằng thuật toán đệ quy, gồm các bước: (1) nếu đoạn ngắn hơn kích thước mục tiêu (~1200 ký tự) thì giữ nguyên; (2) ngược lại, tách tại mốc ưu tiên cao nhất còn xuất hiện theo thứ tự “Điều” → “Chương” → “Mục” → đoạn trống → xuống dòng → câu → khoảng trắng; (3) đệ quy trên các phần vẫn còn dài; (4) gộp các phần nhỏ liền kề thành đoạn ~1200 ký tự, thêm phần chồng lấp (overlap) 150 ký tự ở đầu mỗi đoạn kế tiếp.</w:t>
+      </w:r>
+    </w:p>
+    <w:p>
+      <w:pPr>
+        <w:spacing w:line="360" w:lineRule="auto" w:after="120"/>
+        <w:ind w:firstLine="567"/>
+        <w:jc w:val="both"/>
+      </w:pPr>
+      <w:r>
+        <w:rPr>
+          <w:rFonts w:ascii="Times New Roman" w:hAnsi="Times New Roman" w:cs="Times New Roman"/>
+          <w:b w:val="0"/>
+          <w:i w:val="0"/>
+          <w:sz w:val="26"/>
+        </w:rPr>
+        <w:t>Việc cắt theo “Điều” giúp mỗi đoạn là một đơn vị ngữ nghĩa tương đối hoàn chỉnh, thay vì cắt cứng theo số ký tự dễ làm đứt câu và mất ngữ cảnh. Phần chồng lấp giữ liên tục ngữ nghĩa giữa các đoạn liền kề, tránh mất thông tin nằm đúng ở ranh giới cắt. Giả thuyết “cắt theo Điều tốt hơn cắt cứng” được kiểm chứng định lượng ở Chương 4 (Thí nghiệm 3).</w:t>
       </w:r>
     </w:p>
     <w:p>
@@ -3338,6 +3484,353 @@
         </w:rPr>
         <w:t>Hình 3.1. Giao diện web demo: câu trả lời của PhoGPT kèm các nguồn trích dẫn</w:t>
       </w:r>
+    </w:p>
+    <w:p>
+      <w:pPr>
+        <w:spacing w:line="360" w:lineRule="auto" w:after="120"/>
+        <w:ind w:firstLine="567"/>
+        <w:jc w:val="both"/>
+      </w:pPr>
+      <w:r>
+        <w:rPr>
+          <w:rFonts w:ascii="Times New Roman" w:hAnsi="Times New Roman" w:cs="Times New Roman"/>
+          <w:b w:val="0"/>
+          <w:i w:val="0"/>
+          <w:sz w:val="26"/>
+        </w:rPr>
+        <w:t>Backend cung cấp các điểm cuối (endpoint) chính như Bảng 3.2; cấu hình (chế độ LLM, bật/tắt hybrid và reranker) được điều khiển qua biến môi trường, thuận tiện cho việc thử nghiệm các cấu hình khác nhau khi đánh giá.</w:t>
+      </w:r>
+    </w:p>
+    <w:p>
+      <w:pPr>
+        <w:spacing w:before="120"/>
+        <w:jc w:val="center"/>
+      </w:pPr>
+      <w:r>
+        <w:rPr>
+          <w:rFonts w:ascii="Times New Roman" w:hAnsi="Times New Roman" w:cs="Times New Roman"/>
+          <w:b/>
+          <w:i w:val="0"/>
+          <w:sz w:val="24"/>
+        </w:rPr>
+        <w:t>Bảng 3.2. Các điểm cuối (API) của hệ thống</w:t>
+      </w:r>
+    </w:p>
+    <w:tbl>
+      <w:tblPr>
+        <w:tblStyle w:val="TableGrid"/>
+        <w:tblW w:type="auto" w:w="0"/>
+        <w:jc w:val="center"/>
+        <w:tblLook w:firstColumn="1" w:firstRow="1" w:lastColumn="0" w:lastRow="0" w:noHBand="0" w:noVBand="1" w:val="04A0"/>
+      </w:tblPr>
+      <w:tblGrid>
+        <w:gridCol w:w="3024"/>
+        <w:gridCol w:w="3024"/>
+        <w:gridCol w:w="3024"/>
+      </w:tblGrid>
+      <w:tr>
+        <w:tc>
+          <w:tcPr>
+            <w:tcW w:type="dxa" w:w="3024"/>
+            <w:shd w:val="clear" w:fill="D9E2F3"/>
+          </w:tcPr>
+          <w:p>
+            <w:pPr>
+              <w:jc w:val="center"/>
+            </w:pPr>
+            <w:r>
+              <w:rPr>
+                <w:rFonts w:ascii="Times New Roman" w:hAnsi="Times New Roman" w:cs="Times New Roman"/>
+                <w:b/>
+                <w:i w:val="0"/>
+                <w:sz w:val="24"/>
+              </w:rPr>
+              <w:t>Endpoint</w:t>
+            </w:r>
+          </w:p>
+        </w:tc>
+        <w:tc>
+          <w:tcPr>
+            <w:tcW w:type="dxa" w:w="3024"/>
+            <w:shd w:val="clear" w:fill="D9E2F3"/>
+          </w:tcPr>
+          <w:p>
+            <w:pPr>
+              <w:jc w:val="center"/>
+            </w:pPr>
+            <w:r>
+              <w:rPr>
+                <w:rFonts w:ascii="Times New Roman" w:hAnsi="Times New Roman" w:cs="Times New Roman"/>
+                <w:b/>
+                <w:i w:val="0"/>
+                <w:sz w:val="24"/>
+              </w:rPr>
+              <w:t>Phương thức</w:t>
+            </w:r>
+          </w:p>
+        </w:tc>
+        <w:tc>
+          <w:tcPr>
+            <w:tcW w:type="dxa" w:w="3024"/>
+            <w:shd w:val="clear" w:fill="D9E2F3"/>
+          </w:tcPr>
+          <w:p>
+            <w:pPr>
+              <w:jc w:val="center"/>
+            </w:pPr>
+            <w:r>
+              <w:rPr>
+                <w:rFonts w:ascii="Times New Roman" w:hAnsi="Times New Roman" w:cs="Times New Roman"/>
+                <w:b/>
+                <w:i w:val="0"/>
+                <w:sz w:val="24"/>
+              </w:rPr>
+              <w:t>Chức năng</w:t>
+            </w:r>
+          </w:p>
+        </w:tc>
+      </w:tr>
+      <w:tr>
+        <w:tc>
+          <w:tcPr>
+            <w:tcW w:type="dxa" w:w="3024"/>
+          </w:tcPr>
+          <w:p>
+            <w:pPr>
+              <w:jc w:val="left"/>
+            </w:pPr>
+            <w:r>
+              <w:rPr>
+                <w:rFonts w:ascii="Times New Roman" w:hAnsi="Times New Roman" w:cs="Times New Roman"/>
+                <w:b w:val="0"/>
+                <w:i w:val="0"/>
+                <w:sz w:val="24"/>
+              </w:rPr>
+              <w:t>/</w:t>
+            </w:r>
+          </w:p>
+        </w:tc>
+        <w:tc>
+          <w:tcPr>
+            <w:tcW w:type="dxa" w:w="3024"/>
+          </w:tcPr>
+          <w:p>
+            <w:pPr>
+              <w:jc w:val="center"/>
+            </w:pPr>
+            <w:r>
+              <w:rPr>
+                <w:rFonts w:ascii="Times New Roman" w:hAnsi="Times New Roman" w:cs="Times New Roman"/>
+                <w:b w:val="0"/>
+                <w:i w:val="0"/>
+                <w:sz w:val="24"/>
+              </w:rPr>
+              <w:t>GET</w:t>
+            </w:r>
+          </w:p>
+        </w:tc>
+        <w:tc>
+          <w:tcPr>
+            <w:tcW w:type="dxa" w:w="3024"/>
+          </w:tcPr>
+          <w:p>
+            <w:pPr>
+              <w:jc w:val="center"/>
+            </w:pPr>
+            <w:r>
+              <w:rPr>
+                <w:rFonts w:ascii="Times New Roman" w:hAnsi="Times New Roman" w:cs="Times New Roman"/>
+                <w:b w:val="0"/>
+                <w:i w:val="0"/>
+                <w:sz w:val="24"/>
+              </w:rPr>
+              <w:t>Trả về trang giao diện web (SPA React)</w:t>
+            </w:r>
+          </w:p>
+        </w:tc>
+      </w:tr>
+      <w:tr>
+        <w:tc>
+          <w:tcPr>
+            <w:tcW w:type="dxa" w:w="3024"/>
+          </w:tcPr>
+          <w:p>
+            <w:pPr>
+              <w:jc w:val="left"/>
+            </w:pPr>
+            <w:r>
+              <w:rPr>
+                <w:rFonts w:ascii="Times New Roman" w:hAnsi="Times New Roman" w:cs="Times New Roman"/>
+                <w:b w:val="0"/>
+                <w:i w:val="0"/>
+                <w:sz w:val="24"/>
+              </w:rPr>
+              <w:t>/chat</w:t>
+            </w:r>
+          </w:p>
+        </w:tc>
+        <w:tc>
+          <w:tcPr>
+            <w:tcW w:type="dxa" w:w="3024"/>
+          </w:tcPr>
+          <w:p>
+            <w:pPr>
+              <w:jc w:val="center"/>
+            </w:pPr>
+            <w:r>
+              <w:rPr>
+                <w:rFonts w:ascii="Times New Roman" w:hAnsi="Times New Roman" w:cs="Times New Roman"/>
+                <w:b w:val="0"/>
+                <w:i w:val="0"/>
+                <w:sz w:val="24"/>
+              </w:rPr>
+              <w:t>POST</w:t>
+            </w:r>
+          </w:p>
+        </w:tc>
+        <w:tc>
+          <w:tcPr>
+            <w:tcW w:type="dxa" w:w="3024"/>
+          </w:tcPr>
+          <w:p>
+            <w:pPr>
+              <w:jc w:val="center"/>
+            </w:pPr>
+            <w:r>
+              <w:rPr>
+                <w:rFonts w:ascii="Times New Roman" w:hAnsi="Times New Roman" w:cs="Times New Roman"/>
+                <w:b w:val="0"/>
+                <w:i w:val="0"/>
+                <w:sz w:val="24"/>
+              </w:rPr>
+              <w:t>Nhận {câu hỏi, k, chỉ_hiệu_lực}; trả về {câu trả lời, danh sách nguồn}</w:t>
+            </w:r>
+          </w:p>
+        </w:tc>
+      </w:tr>
+      <w:tr>
+        <w:tc>
+          <w:tcPr>
+            <w:tcW w:type="dxa" w:w="3024"/>
+          </w:tcPr>
+          <w:p>
+            <w:pPr>
+              <w:jc w:val="left"/>
+            </w:pPr>
+            <w:r>
+              <w:rPr>
+                <w:rFonts w:ascii="Times New Roman" w:hAnsi="Times New Roman" w:cs="Times New Roman"/>
+                <w:b w:val="0"/>
+                <w:i w:val="0"/>
+                <w:sz w:val="24"/>
+              </w:rPr>
+              <w:t>/health</w:t>
+            </w:r>
+          </w:p>
+        </w:tc>
+        <w:tc>
+          <w:tcPr>
+            <w:tcW w:type="dxa" w:w="3024"/>
+          </w:tcPr>
+          <w:p>
+            <w:pPr>
+              <w:jc w:val="center"/>
+            </w:pPr>
+            <w:r>
+              <w:rPr>
+                <w:rFonts w:ascii="Times New Roman" w:hAnsi="Times New Roman" w:cs="Times New Roman"/>
+                <w:b w:val="0"/>
+                <w:i w:val="0"/>
+                <w:sz w:val="24"/>
+              </w:rPr>
+              <w:t>GET</w:t>
+            </w:r>
+          </w:p>
+        </w:tc>
+        <w:tc>
+          <w:tcPr>
+            <w:tcW w:type="dxa" w:w="3024"/>
+          </w:tcPr>
+          <w:p>
+            <w:pPr>
+              <w:jc w:val="center"/>
+            </w:pPr>
+            <w:r>
+              <w:rPr>
+                <w:rFonts w:ascii="Times New Roman" w:hAnsi="Times New Roman" w:cs="Times New Roman"/>
+                <w:b w:val="0"/>
+                <w:i w:val="0"/>
+                <w:sz w:val="24"/>
+              </w:rPr>
+              <w:t>Trả về trạng thái: số vector, chế độ LLM, hybrid/reranker</w:t>
+            </w:r>
+          </w:p>
+        </w:tc>
+      </w:tr>
+      <w:tr>
+        <w:tc>
+          <w:tcPr>
+            <w:tcW w:type="dxa" w:w="3024"/>
+          </w:tcPr>
+          <w:p>
+            <w:pPr>
+              <w:jc w:val="left"/>
+            </w:pPr>
+            <w:r>
+              <w:rPr>
+                <w:rFonts w:ascii="Times New Roman" w:hAnsi="Times New Roman" w:cs="Times New Roman"/>
+                <w:b w:val="0"/>
+                <w:i w:val="0"/>
+                <w:sz w:val="24"/>
+              </w:rPr>
+              <w:t>/static/*</w:t>
+            </w:r>
+          </w:p>
+        </w:tc>
+        <w:tc>
+          <w:tcPr>
+            <w:tcW w:type="dxa" w:w="3024"/>
+          </w:tcPr>
+          <w:p>
+            <w:pPr>
+              <w:jc w:val="center"/>
+            </w:pPr>
+            <w:r>
+              <w:rPr>
+                <w:rFonts w:ascii="Times New Roman" w:hAnsi="Times New Roman" w:cs="Times New Roman"/>
+                <w:b w:val="0"/>
+                <w:i w:val="0"/>
+                <w:sz w:val="24"/>
+              </w:rPr>
+              <w:t>GET</w:t>
+            </w:r>
+          </w:p>
+        </w:tc>
+        <w:tc>
+          <w:tcPr>
+            <w:tcW w:type="dxa" w:w="3024"/>
+          </w:tcPr>
+          <w:p>
+            <w:pPr>
+              <w:jc w:val="center"/>
+            </w:pPr>
+            <w:r>
+              <w:rPr>
+                <w:rFonts w:ascii="Times New Roman" w:hAnsi="Times New Roman" w:cs="Times New Roman"/>
+                <w:b w:val="0"/>
+                <w:i w:val="0"/>
+                <w:sz w:val="24"/>
+              </w:rPr>
+              <w:t>Phục vụ tài nguyên tĩnh (thư viện React đóng gói cục bộ)</w:t>
+            </w:r>
+          </w:p>
+        </w:tc>
+      </w:tr>
+    </w:tbl>
+    <w:p>
+      <w:pPr>
+        <w:spacing w:after="120"/>
+      </w:pPr>
     </w:p>
     <w:p>
       <w:pPr>
@@ -4885,7 +5378,23 @@
           <w:i w:val="0"/>
           <w:sz w:val="26"/>
         </w:rPr>
-        <w:t>Phân tích các câu bị trượt cho thấy hai nguyên nhân chính. Thứ nhất, một số câu hỏi gần với văn bản dưới luật (thông tư, quyết định của Cục/Bộ) hơn là luật gốc, khiến hệ thống xếp văn bản dưới luật lên trên — về mặt nội dung không hẳn sai. Thứ hai, vấn đề ground-truth: trước khi bổ sung các Văn bản hợp nhất tương đương, baseline chỉ đạt Hit@1 = 0,222; sau khi bổ sung tăng lên 0,389. Điều này cho thấy chỉ số ban đầu đã đánh giá thấp năng lực thực của hệ thống, và việc xây dựng ground-truth cẩn thận (tính đến VBHN) là cần thiết để đánh giá công bằng trong miền pháp luật.</w:t>
+        <w:t>Phân tích các câu bị trượt cho thấy hai nguyên nhân chính. Thứ nhất, một số câu hỏi gần với văn bản dưới luật (thông tư, quyết định của Cục/Bộ) hơn là luật gốc, khiến hệ thống xếp văn bản dưới luật lên trên — về mặt nội dung không hẳn sai. Ví dụ, câu “Những hành vi bị nghiêm cấm trong hoạt động dược?” trả về top-1 là một quyết định của Cục Quản lý Dược thay vì Luật Dược; câu về tiêm chủng trả về Nghị định 104/2016/NĐ-CP (nghị định chuyên về tiêm chủng) — thực chất rất sát nội dung, dù không trùng số hiệu luật được gán nhãn.</w:t>
+      </w:r>
+    </w:p>
+    <w:p>
+      <w:pPr>
+        <w:spacing w:line="360" w:lineRule="auto" w:after="120"/>
+        <w:ind w:firstLine="567"/>
+        <w:jc w:val="both"/>
+      </w:pPr>
+      <w:r>
+        <w:rPr>
+          <w:rFonts w:ascii="Times New Roman" w:hAnsi="Times New Roman" w:cs="Times New Roman"/>
+          <w:b w:val="0"/>
+          <w:i w:val="0"/>
+          <w:sz w:val="26"/>
+        </w:rPr>
+        <w:t>Thứ hai, vấn đề ground-truth: trước khi bổ sung các Văn bản hợp nhất (VBHN) tương đương, baseline chỉ đạt Hit@1 = 0,222; sau khi bổ sung tăng lên 0,389. Cụ thể, câu về an toàn thực phẩm trả về 61/VBHN-VPQH (bản hợp nhất Luật An toàn thực phẩm) và câu về HIV trả về 33/VBHN-VPQH (bản hợp nhất Luật phòng, chống HIV/AIDS) — đúng nội dung nhưng khác số hiệu. Điều này cho thấy chỉ số ban đầu đã đánh giá thấp năng lực thực của hệ thống, và việc xây dựng ground-truth cẩn thận (tính đến VBHN) là cần thiết để đánh giá công bằng trong miền pháp luật.</w:t>
       </w:r>
     </w:p>
     <w:p>

</xml_diff>

<commit_message>
Thực nghiệm sâu: Precision/Recall theo k, thời gian phản hồi, chất lượng & trích dẫn; lược đồ tuần tự; biểu đồ P/R-k & latency
</commit_message>
<xml_diff>
--- a/report/BaoCao_RAG_DATN.docx
+++ b/report/BaoCao_RAG_DATN.docx
@@ -384,7 +384,67 @@
           <w:i w:val="0"/>
           <w:sz w:val="26"/>
         </w:rPr>
-        <w:t>Hình 4.1. Biểu đồ so sánh chất lượng truy xuất giữa các cấu hình</w:t>
+        <w:t>Hình 3.1. Lược đồ tuần tự xử lý một câu hỏi</w:t>
+      </w:r>
+    </w:p>
+    <w:p>
+      <w:pPr>
+        <w:spacing w:line="360" w:lineRule="auto" w:after="120"/>
+        <w:jc w:val="left"/>
+      </w:pPr>
+      <w:r>
+        <w:rPr>
+          <w:rFonts w:ascii="Times New Roman" w:hAnsi="Times New Roman" w:cs="Times New Roman"/>
+          <w:b w:val="0"/>
+          <w:i w:val="0"/>
+          <w:sz w:val="26"/>
+        </w:rPr>
+        <w:t>Hình 3.2. Giao diện web demo</w:t>
+      </w:r>
+    </w:p>
+    <w:p>
+      <w:pPr>
+        <w:spacing w:line="360" w:lineRule="auto" w:after="120"/>
+        <w:jc w:val="left"/>
+      </w:pPr>
+      <w:r>
+        <w:rPr>
+          <w:rFonts w:ascii="Times New Roman" w:hAnsi="Times New Roman" w:cs="Times New Roman"/>
+          <w:b w:val="0"/>
+          <w:i w:val="0"/>
+          <w:sz w:val="26"/>
+        </w:rPr>
+        <w:t>Hình 4.1. So sánh chất lượng truy xuất giữa các cấu hình</w:t>
+      </w:r>
+    </w:p>
+    <w:p>
+      <w:pPr>
+        <w:spacing w:line="360" w:lineRule="auto" w:after="120"/>
+        <w:jc w:val="left"/>
+      </w:pPr>
+      <w:r>
+        <w:rPr>
+          <w:rFonts w:ascii="Times New Roman" w:hAnsi="Times New Roman" w:cs="Times New Roman"/>
+          <w:b w:val="0"/>
+          <w:i w:val="0"/>
+          <w:sz w:val="26"/>
+        </w:rPr>
+        <w:t>Hình 4.2. Precision/Recall/F1 theo số nguồn k</w:t>
+      </w:r>
+    </w:p>
+    <w:p>
+      <w:pPr>
+        <w:spacing w:line="360" w:lineRule="auto" w:after="120"/>
+        <w:jc w:val="left"/>
+      </w:pPr>
+      <w:r>
+        <w:rPr>
+          <w:rFonts w:ascii="Times New Roman" w:hAnsi="Times New Roman" w:cs="Times New Roman"/>
+          <w:b w:val="0"/>
+          <w:i w:val="0"/>
+          <w:sz w:val="26"/>
+        </w:rPr>
+        <w:t>Hình 4.3. Thời gian phản hồi trung bình</w:t>
       </w:r>
     </w:p>
     <w:p>
@@ -475,6 +535,21 @@
           <w:sz w:val="26"/>
         </w:rPr>
         <w:t>Bảng 4.2. Ảnh hưởng của kích thước chunk</w:t>
+      </w:r>
+    </w:p>
+    <w:p>
+      <w:pPr>
+        <w:spacing w:line="360" w:lineRule="auto" w:after="120"/>
+        <w:jc w:val="left"/>
+      </w:pPr>
+      <w:r>
+        <w:rPr>
+          <w:rFonts w:ascii="Times New Roman" w:hAnsi="Times New Roman" w:cs="Times New Roman"/>
+          <w:b w:val="0"/>
+          <w:i w:val="0"/>
+          <w:sz w:val="26"/>
+        </w:rPr>
+        <w:t>Bảng 4.3. Precision/Recall/F1 theo số nguồn k</w:t>
       </w:r>
     </w:p>
     <w:p>
@@ -2876,7 +2951,62 @@
           <w:i w:val="0"/>
           <w:sz w:val="26"/>
         </w:rPr>
-        <w:t>Hệ thống được tổ chức theo các module rời, mỗi module đảm nhiệm một giai đoạn của pipeline RAG (xem lại Hình 1.1). Luồng xử lý một câu hỏi gồm: tách từ và mã hóa câu hỏi; truy xuất song song từ ChromaDB (vector) và BM25 (từ vựng); hợp nhất bằng RRF kèm nhận diện số hiệu; xếp hạng lại bằng PhoRanker để chọn k đoạn tốt nhất; dựng prompt và sinh câu trả lời bằng PhoGPT; cuối cùng trả về câu trả lời kèm danh sách nguồn.</w:t>
+        <w:t>Hệ thống được tổ chức theo các module rời, mỗi module đảm nhiệm một giai đoạn của pipeline RAG (xem lại Hình 1.1). Luồng xử lý một câu hỏi gồm: tách từ và mã hóa câu hỏi; truy xuất song song từ ChromaDB (vector) và BM25 (từ vựng); hợp nhất bằng RRF kèm nhận diện số hiệu; xếp hạng lại bằng PhoRanker để chọn k đoạn tốt nhất; dựng prompt và sinh câu trả lời bằng PhoGPT; cuối cùng trả về câu trả lời kèm danh sách nguồn. Trình tự tương tác giữa các thành phần được thể hiện ở Hình 3.1.</w:t>
+      </w:r>
+    </w:p>
+    <w:p>
+      <w:pPr>
+        <w:spacing w:before="120"/>
+        <w:jc w:val="center"/>
+      </w:pPr>
+      <w:r>
+        <w:drawing>
+          <wp:inline xmlns:a="http://schemas.openxmlformats.org/drawingml/2006/main" xmlns:pic="http://schemas.openxmlformats.org/drawingml/2006/picture">
+            <wp:extent cx="5400000" cy="3511239"/>
+            <wp:docPr id="3" name="Picture 3"/>
+            <wp:cNvGraphicFramePr>
+              <a:graphicFrameLocks noChangeAspect="1"/>
+            </wp:cNvGraphicFramePr>
+            <a:graphic>
+              <a:graphicData uri="http://schemas.openxmlformats.org/drawingml/2006/picture">
+                <pic:pic>
+                  <pic:nvPicPr>
+                    <pic:cNvPr id="0" name="sequence.png"/>
+                    <pic:cNvPicPr/>
+                  </pic:nvPicPr>
+                  <pic:blipFill>
+                    <a:blip r:embed="rId13"/>
+                    <a:stretch>
+                      <a:fillRect/>
+                    </a:stretch>
+                  </pic:blipFill>
+                  <pic:spPr>
+                    <a:xfrm>
+                      <a:off x="0" y="0"/>
+                      <a:ext cx="5400000" cy="3511239"/>
+                    </a:xfrm>
+                    <a:prstGeom prst="rect"/>
+                  </pic:spPr>
+                </pic:pic>
+              </a:graphicData>
+            </a:graphic>
+          </wp:inline>
+        </w:drawing>
+      </w:r>
+    </w:p>
+    <w:p>
+      <w:pPr>
+        <w:spacing w:after="200"/>
+        <w:jc w:val="center"/>
+      </w:pPr>
+      <w:r>
+        <w:rPr>
+          <w:rFonts w:ascii="Times New Roman" w:hAnsi="Times New Roman" w:cs="Times New Roman"/>
+          <w:b/>
+          <w:i w:val="0"/>
+          <w:sz w:val="24"/>
+        </w:rPr>
+        <w:t>Hình 3.1. Lược đồ tuần tự xử lý một câu hỏi</w:t>
       </w:r>
     </w:p>
     <w:p>
@@ -3439,7 +3569,7 @@
         <w:drawing>
           <wp:inline xmlns:a="http://schemas.openxmlformats.org/drawingml/2006/main" xmlns:pic="http://schemas.openxmlformats.org/drawingml/2006/picture">
             <wp:extent cx="3960000" cy="5800781"/>
-            <wp:docPr id="3" name="Picture 3"/>
+            <wp:docPr id="4" name="Picture 4"/>
             <wp:cNvGraphicFramePr>
               <a:graphicFrameLocks noChangeAspect="1"/>
             </wp:cNvGraphicFramePr>
@@ -3451,7 +3581,7 @@
                     <pic:cNvPicPr/>
                   </pic:nvPicPr>
                   <pic:blipFill>
-                    <a:blip r:embed="rId13"/>
+                    <a:blip r:embed="rId14"/>
                     <a:stretch>
                       <a:fillRect/>
                     </a:stretch>
@@ -3482,7 +3612,7 @@
           <w:i w:val="0"/>
           <w:sz w:val="24"/>
         </w:rPr>
-        <w:t>Hình 3.1. Giao diện web demo: câu trả lời của PhoGPT kèm các nguồn trích dẫn</w:t>
+        <w:t>Hình 3.2. Giao diện web demo: câu trả lời của PhoGPT kèm các nguồn trích dẫn</w:t>
       </w:r>
     </w:p>
     <w:p>
@@ -4648,7 +4778,7 @@
         <w:drawing>
           <wp:inline xmlns:a="http://schemas.openxmlformats.org/drawingml/2006/main" xmlns:pic="http://schemas.openxmlformats.org/drawingml/2006/picture">
             <wp:extent cx="5400000" cy="2880000"/>
-            <wp:docPr id="4" name="Picture 4"/>
+            <wp:docPr id="5" name="Picture 5"/>
             <wp:cNvGraphicFramePr>
               <a:graphicFrameLocks noChangeAspect="1"/>
             </wp:cNvGraphicFramePr>
@@ -4660,7 +4790,7 @@
                     <pic:cNvPicPr/>
                   </pic:nvPicPr>
                   <pic:blipFill>
-                    <a:blip r:embed="rId14"/>
+                    <a:blip r:embed="rId15"/>
                     <a:stretch>
                       <a:fillRect/>
                     </a:stretch>
@@ -5427,7 +5557,7 @@
           <w:color w:val="000000"/>
           <w:sz w:val="26"/>
         </w:rPr>
-        <w:t>4.8. Thời gian phản hồi và tài nguyên</w:t>
+        <w:t>4.8. Precision, Recall và ảnh hưởng của số nguồn k</w:t>
       </w:r>
     </w:p>
     <w:p>
@@ -5443,7 +5573,643 @@
           <w:i w:val="0"/>
           <w:sz w:val="26"/>
         </w:rPr>
-        <w:t>Toàn bộ hệ thống vận hành trên CPU với 16GB RAM. Các mốc thời gian đo được: lập chỉ mục embedding đạt khoảng 7,7 đoạn/giây (toàn corpus 367.462 đoạn mất khoảng 13 giờ, chạy nền và có khả năng resume); nạp mô hình lần đầu khoảng 90 giây; sinh câu trả lời khoảng 20–40 giây mỗi câu (PhoGPT lượng tử hóa Q4). Mức thời gian này chấp nhận được cho mục đích tra cứu tham khảo, dù chưa đạt thời gian thực; có thể rút ngắn đáng kể nếu triển khai trên GPU hoặc dùng dịch vụ sinh. Việc lượng tử hóa GGUF Q4 là yếu tố then chốt giúp mô hình 3,7 tỷ tham số chạy được trong giới hạn 16GB RAM.</w:t>
+        <w:t>Bên cạnh Hit@k và MRR, đề tài đo Precision@k và Recall@k ở mức văn bản (sau khi gộp các đoạn về số hiệu văn bản) cho cấu hình Hybrid + Reranker, đồng thời khảo sát ảnh hưởng của số nguồn k truyền cho mô hình (Bảng 4.3, Hình 4.2).</w:t>
+      </w:r>
+    </w:p>
+    <w:p>
+      <w:pPr>
+        <w:spacing w:before="120"/>
+        <w:jc w:val="center"/>
+      </w:pPr>
+      <w:r>
+        <w:rPr>
+          <w:rFonts w:ascii="Times New Roman" w:hAnsi="Times New Roman" w:cs="Times New Roman"/>
+          <w:b/>
+          <w:i w:val="0"/>
+          <w:sz w:val="24"/>
+        </w:rPr>
+        <w:t>Bảng 4.3. Precision/Recall/F1 theo số nguồn k</w:t>
+      </w:r>
+    </w:p>
+    <w:tbl>
+      <w:tblPr>
+        <w:tblStyle w:val="TableGrid"/>
+        <w:tblW w:type="auto" w:w="0"/>
+        <w:jc w:val="center"/>
+        <w:tblLook w:firstColumn="1" w:firstRow="1" w:lastColumn="0" w:lastRow="0" w:noHBand="0" w:noVBand="1" w:val="04A0"/>
+      </w:tblPr>
+      <w:tblGrid>
+        <w:gridCol w:w="2268"/>
+        <w:gridCol w:w="2268"/>
+        <w:gridCol w:w="2268"/>
+        <w:gridCol w:w="2268"/>
+      </w:tblGrid>
+      <w:tr>
+        <w:tc>
+          <w:tcPr>
+            <w:tcW w:type="dxa" w:w="2268"/>
+            <w:shd w:val="clear" w:fill="D9E2F3"/>
+          </w:tcPr>
+          <w:p>
+            <w:pPr>
+              <w:jc w:val="center"/>
+            </w:pPr>
+            <w:r>
+              <w:rPr>
+                <w:rFonts w:ascii="Times New Roman" w:hAnsi="Times New Roman" w:cs="Times New Roman"/>
+                <w:b/>
+                <w:i w:val="0"/>
+                <w:sz w:val="24"/>
+              </w:rPr>
+              <w:t>k</w:t>
+            </w:r>
+          </w:p>
+        </w:tc>
+        <w:tc>
+          <w:tcPr>
+            <w:tcW w:type="dxa" w:w="2268"/>
+            <w:shd w:val="clear" w:fill="D9E2F3"/>
+          </w:tcPr>
+          <w:p>
+            <w:pPr>
+              <w:jc w:val="center"/>
+            </w:pPr>
+            <w:r>
+              <w:rPr>
+                <w:rFonts w:ascii="Times New Roman" w:hAnsi="Times New Roman" w:cs="Times New Roman"/>
+                <w:b/>
+                <w:i w:val="0"/>
+                <w:sz w:val="24"/>
+              </w:rPr>
+              <w:t>Precision@k</w:t>
+            </w:r>
+          </w:p>
+        </w:tc>
+        <w:tc>
+          <w:tcPr>
+            <w:tcW w:type="dxa" w:w="2268"/>
+            <w:shd w:val="clear" w:fill="D9E2F3"/>
+          </w:tcPr>
+          <w:p>
+            <w:pPr>
+              <w:jc w:val="center"/>
+            </w:pPr>
+            <w:r>
+              <w:rPr>
+                <w:rFonts w:ascii="Times New Roman" w:hAnsi="Times New Roman" w:cs="Times New Roman"/>
+                <w:b/>
+                <w:i w:val="0"/>
+                <w:sz w:val="24"/>
+              </w:rPr>
+              <w:t>Recall@k</w:t>
+            </w:r>
+          </w:p>
+        </w:tc>
+        <w:tc>
+          <w:tcPr>
+            <w:tcW w:type="dxa" w:w="2268"/>
+            <w:shd w:val="clear" w:fill="D9E2F3"/>
+          </w:tcPr>
+          <w:p>
+            <w:pPr>
+              <w:jc w:val="center"/>
+            </w:pPr>
+            <w:r>
+              <w:rPr>
+                <w:rFonts w:ascii="Times New Roman" w:hAnsi="Times New Roman" w:cs="Times New Roman"/>
+                <w:b/>
+                <w:i w:val="0"/>
+                <w:sz w:val="24"/>
+              </w:rPr>
+              <w:t>F1@k</w:t>
+            </w:r>
+          </w:p>
+        </w:tc>
+      </w:tr>
+      <w:tr>
+        <w:tc>
+          <w:tcPr>
+            <w:tcW w:type="dxa" w:w="2268"/>
+          </w:tcPr>
+          <w:p>
+            <w:pPr>
+              <w:jc w:val="left"/>
+            </w:pPr>
+            <w:r>
+              <w:rPr>
+                <w:rFonts w:ascii="Times New Roman" w:hAnsi="Times New Roman" w:cs="Times New Roman"/>
+                <w:b w:val="0"/>
+                <w:i w:val="0"/>
+                <w:sz w:val="24"/>
+              </w:rPr>
+              <w:t>1</w:t>
+            </w:r>
+          </w:p>
+        </w:tc>
+        <w:tc>
+          <w:tcPr>
+            <w:tcW w:type="dxa" w:w="2268"/>
+          </w:tcPr>
+          <w:p>
+            <w:pPr>
+              <w:jc w:val="center"/>
+            </w:pPr>
+            <w:r>
+              <w:rPr>
+                <w:rFonts w:ascii="Times New Roman" w:hAnsi="Times New Roman" w:cs="Times New Roman"/>
+                <w:b w:val="0"/>
+                <w:i w:val="0"/>
+                <w:sz w:val="24"/>
+              </w:rPr>
+              <w:t>0,556</w:t>
+            </w:r>
+          </w:p>
+        </w:tc>
+        <w:tc>
+          <w:tcPr>
+            <w:tcW w:type="dxa" w:w="2268"/>
+          </w:tcPr>
+          <w:p>
+            <w:pPr>
+              <w:jc w:val="center"/>
+            </w:pPr>
+            <w:r>
+              <w:rPr>
+                <w:rFonts w:ascii="Times New Roman" w:hAnsi="Times New Roman" w:cs="Times New Roman"/>
+                <w:b w:val="0"/>
+                <w:i w:val="0"/>
+                <w:sz w:val="24"/>
+              </w:rPr>
+              <w:t>0,366</w:t>
+            </w:r>
+          </w:p>
+        </w:tc>
+        <w:tc>
+          <w:tcPr>
+            <w:tcW w:type="dxa" w:w="2268"/>
+          </w:tcPr>
+          <w:p>
+            <w:pPr>
+              <w:jc w:val="center"/>
+            </w:pPr>
+            <w:r>
+              <w:rPr>
+                <w:rFonts w:ascii="Times New Roman" w:hAnsi="Times New Roman" w:cs="Times New Roman"/>
+                <w:b w:val="0"/>
+                <w:i w:val="0"/>
+                <w:sz w:val="24"/>
+              </w:rPr>
+              <w:t>0,441</w:t>
+            </w:r>
+          </w:p>
+        </w:tc>
+      </w:tr>
+      <w:tr>
+        <w:tc>
+          <w:tcPr>
+            <w:tcW w:type="dxa" w:w="2268"/>
+          </w:tcPr>
+          <w:p>
+            <w:pPr>
+              <w:jc w:val="left"/>
+            </w:pPr>
+            <w:r>
+              <w:rPr>
+                <w:rFonts w:ascii="Times New Roman" w:hAnsi="Times New Roman" w:cs="Times New Roman"/>
+                <w:b w:val="0"/>
+                <w:i w:val="0"/>
+                <w:sz w:val="24"/>
+              </w:rPr>
+              <w:t>3</w:t>
+            </w:r>
+          </w:p>
+        </w:tc>
+        <w:tc>
+          <w:tcPr>
+            <w:tcW w:type="dxa" w:w="2268"/>
+          </w:tcPr>
+          <w:p>
+            <w:pPr>
+              <w:jc w:val="center"/>
+            </w:pPr>
+            <w:r>
+              <w:rPr>
+                <w:rFonts w:ascii="Times New Roman" w:hAnsi="Times New Roman" w:cs="Times New Roman"/>
+                <w:b w:val="0"/>
+                <w:i w:val="0"/>
+                <w:sz w:val="24"/>
+              </w:rPr>
+              <w:t>0,389</w:t>
+            </w:r>
+          </w:p>
+        </w:tc>
+        <w:tc>
+          <w:tcPr>
+            <w:tcW w:type="dxa" w:w="2268"/>
+          </w:tcPr>
+          <w:p>
+            <w:pPr>
+              <w:jc w:val="center"/>
+            </w:pPr>
+            <w:r>
+              <w:rPr>
+                <w:rFonts w:ascii="Times New Roman" w:hAnsi="Times New Roman" w:cs="Times New Roman"/>
+                <w:b w:val="0"/>
+                <w:i w:val="0"/>
+                <w:sz w:val="24"/>
+              </w:rPr>
+              <w:t>0,625</w:t>
+            </w:r>
+          </w:p>
+        </w:tc>
+        <w:tc>
+          <w:tcPr>
+            <w:tcW w:type="dxa" w:w="2268"/>
+          </w:tcPr>
+          <w:p>
+            <w:pPr>
+              <w:jc w:val="center"/>
+            </w:pPr>
+            <w:r>
+              <w:rPr>
+                <w:rFonts w:ascii="Times New Roman" w:hAnsi="Times New Roman" w:cs="Times New Roman"/>
+                <w:b w:val="0"/>
+                <w:i w:val="0"/>
+                <w:sz w:val="24"/>
+              </w:rPr>
+              <w:t>0,480</w:t>
+            </w:r>
+          </w:p>
+        </w:tc>
+      </w:tr>
+      <w:tr>
+        <w:tc>
+          <w:tcPr>
+            <w:tcW w:type="dxa" w:w="2268"/>
+          </w:tcPr>
+          <w:p>
+            <w:pPr>
+              <w:jc w:val="left"/>
+            </w:pPr>
+            <w:r>
+              <w:rPr>
+                <w:rFonts w:ascii="Times New Roman" w:hAnsi="Times New Roman" w:cs="Times New Roman"/>
+                <w:b w:val="0"/>
+                <w:i w:val="0"/>
+                <w:sz w:val="24"/>
+              </w:rPr>
+              <w:t>5</w:t>
+            </w:r>
+          </w:p>
+        </w:tc>
+        <w:tc>
+          <w:tcPr>
+            <w:tcW w:type="dxa" w:w="2268"/>
+          </w:tcPr>
+          <w:p>
+            <w:pPr>
+              <w:jc w:val="center"/>
+            </w:pPr>
+            <w:r>
+              <w:rPr>
+                <w:rFonts w:ascii="Times New Roman" w:hAnsi="Times New Roman" w:cs="Times New Roman"/>
+                <w:b w:val="0"/>
+                <w:i w:val="0"/>
+                <w:sz w:val="24"/>
+              </w:rPr>
+              <w:t>0,267</w:t>
+            </w:r>
+          </w:p>
+        </w:tc>
+        <w:tc>
+          <w:tcPr>
+            <w:tcW w:type="dxa" w:w="2268"/>
+          </w:tcPr>
+          <w:p>
+            <w:pPr>
+              <w:jc w:val="center"/>
+            </w:pPr>
+            <w:r>
+              <w:rPr>
+                <w:rFonts w:ascii="Times New Roman" w:hAnsi="Times New Roman" w:cs="Times New Roman"/>
+                <w:b w:val="0"/>
+                <w:i w:val="0"/>
+                <w:sz w:val="24"/>
+              </w:rPr>
+              <w:t>0,681</w:t>
+            </w:r>
+          </w:p>
+        </w:tc>
+        <w:tc>
+          <w:tcPr>
+            <w:tcW w:type="dxa" w:w="2268"/>
+          </w:tcPr>
+          <w:p>
+            <w:pPr>
+              <w:jc w:val="center"/>
+            </w:pPr>
+            <w:r>
+              <w:rPr>
+                <w:rFonts w:ascii="Times New Roman" w:hAnsi="Times New Roman" w:cs="Times New Roman"/>
+                <w:b w:val="0"/>
+                <w:i w:val="0"/>
+                <w:sz w:val="24"/>
+              </w:rPr>
+              <w:t>0,384</w:t>
+            </w:r>
+          </w:p>
+        </w:tc>
+      </w:tr>
+      <w:tr>
+        <w:tc>
+          <w:tcPr>
+            <w:tcW w:type="dxa" w:w="2268"/>
+          </w:tcPr>
+          <w:p>
+            <w:pPr>
+              <w:jc w:val="left"/>
+            </w:pPr>
+            <w:r>
+              <w:rPr>
+                <w:rFonts w:ascii="Times New Roman" w:hAnsi="Times New Roman" w:cs="Times New Roman"/>
+                <w:b w:val="0"/>
+                <w:i w:val="0"/>
+                <w:sz w:val="24"/>
+              </w:rPr>
+              <w:t>10</w:t>
+            </w:r>
+          </w:p>
+        </w:tc>
+        <w:tc>
+          <w:tcPr>
+            <w:tcW w:type="dxa" w:w="2268"/>
+          </w:tcPr>
+          <w:p>
+            <w:pPr>
+              <w:jc w:val="center"/>
+            </w:pPr>
+            <w:r>
+              <w:rPr>
+                <w:rFonts w:ascii="Times New Roman" w:hAnsi="Times New Roman" w:cs="Times New Roman"/>
+                <w:b w:val="0"/>
+                <w:i w:val="0"/>
+                <w:sz w:val="24"/>
+              </w:rPr>
+              <w:t>0,144</w:t>
+            </w:r>
+          </w:p>
+        </w:tc>
+        <w:tc>
+          <w:tcPr>
+            <w:tcW w:type="dxa" w:w="2268"/>
+          </w:tcPr>
+          <w:p>
+            <w:pPr>
+              <w:jc w:val="center"/>
+            </w:pPr>
+            <w:r>
+              <w:rPr>
+                <w:rFonts w:ascii="Times New Roman" w:hAnsi="Times New Roman" w:cs="Times New Roman"/>
+                <w:b w:val="0"/>
+                <w:i w:val="0"/>
+                <w:sz w:val="24"/>
+              </w:rPr>
+              <w:t>0,722</w:t>
+            </w:r>
+          </w:p>
+        </w:tc>
+        <w:tc>
+          <w:tcPr>
+            <w:tcW w:type="dxa" w:w="2268"/>
+          </w:tcPr>
+          <w:p>
+            <w:pPr>
+              <w:jc w:val="center"/>
+            </w:pPr>
+            <w:r>
+              <w:rPr>
+                <w:rFonts w:ascii="Times New Roman" w:hAnsi="Times New Roman" w:cs="Times New Roman"/>
+                <w:b w:val="0"/>
+                <w:i w:val="0"/>
+                <w:sz w:val="24"/>
+              </w:rPr>
+              <w:t>0,240</w:t>
+            </w:r>
+          </w:p>
+        </w:tc>
+      </w:tr>
+    </w:tbl>
+    <w:p>
+      <w:pPr>
+        <w:spacing w:after="120"/>
+      </w:pPr>
+    </w:p>
+    <w:p>
+      <w:pPr>
+        <w:spacing w:before="120"/>
+        <w:jc w:val="center"/>
+      </w:pPr>
+      <w:r>
+        <w:drawing>
+          <wp:inline xmlns:a="http://schemas.openxmlformats.org/drawingml/2006/main" xmlns:pic="http://schemas.openxmlformats.org/drawingml/2006/picture">
+            <wp:extent cx="4680000" cy="2808000"/>
+            <wp:docPr id="6" name="Picture 6"/>
+            <wp:cNvGraphicFramePr>
+              <a:graphicFrameLocks noChangeAspect="1"/>
+            </wp:cNvGraphicFramePr>
+            <a:graphic>
+              <a:graphicData uri="http://schemas.openxmlformats.org/drawingml/2006/picture">
+                <pic:pic>
+                  <pic:nvPicPr>
+                    <pic:cNvPr id="0" name="precision_recall_k.png"/>
+                    <pic:cNvPicPr/>
+                  </pic:nvPicPr>
+                  <pic:blipFill>
+                    <a:blip r:embed="rId16"/>
+                    <a:stretch>
+                      <a:fillRect/>
+                    </a:stretch>
+                  </pic:blipFill>
+                  <pic:spPr>
+                    <a:xfrm>
+                      <a:off x="0" y="0"/>
+                      <a:ext cx="4680000" cy="2808000"/>
+                    </a:xfrm>
+                    <a:prstGeom prst="rect"/>
+                  </pic:spPr>
+                </pic:pic>
+              </a:graphicData>
+            </a:graphic>
+          </wp:inline>
+        </w:drawing>
+      </w:r>
+    </w:p>
+    <w:p>
+      <w:pPr>
+        <w:spacing w:after="200"/>
+        <w:jc w:val="center"/>
+      </w:pPr>
+      <w:r>
+        <w:rPr>
+          <w:rFonts w:ascii="Times New Roman" w:hAnsi="Times New Roman" w:cs="Times New Roman"/>
+          <w:b/>
+          <w:i w:val="0"/>
+          <w:sz w:val="24"/>
+        </w:rPr>
+        <w:t>Hình 4.2. Precision/Recall/F1 theo số nguồn k</w:t>
+      </w:r>
+    </w:p>
+    <w:p>
+      <w:pPr>
+        <w:spacing w:line="360" w:lineRule="auto" w:after="120"/>
+        <w:ind w:firstLine="567"/>
+        <w:jc w:val="both"/>
+      </w:pPr>
+      <w:r>
+        <w:rPr>
+          <w:rFonts w:ascii="Times New Roman" w:hAnsi="Times New Roman" w:cs="Times New Roman"/>
+          <w:b w:val="0"/>
+          <w:i w:val="0"/>
+          <w:sz w:val="26"/>
+        </w:rPr>
+        <w:t>Kết quả thể hiện rõ đánh đổi kinh điển: khi k tăng, Recall tăng (lấy về nhiều văn bản đúng hơn) nhưng Precision giảm (nhiều nhiễu hơn). F1 đạt cực đại tại k = 3 (0,480), cho thấy lấy khoảng 3–5 nguồn là cân bằng tốt giữa độ phủ và độ chính xác — phù hợp để truyền vào mô hình sinh mà không làm loãng ngữ cảnh.</w:t>
+      </w:r>
+    </w:p>
+    <w:p>
+      <w:pPr>
+        <w:pStyle w:val="Heading2"/>
+        <w:keepNext/>
+        <w:spacing w:before="200" w:after="80"/>
+      </w:pPr>
+      <w:r>
+        <w:rPr>
+          <w:rFonts w:ascii="Times New Roman" w:hAnsi="Times New Roman" w:cs="Times New Roman"/>
+          <w:b/>
+          <w:i w:val="0"/>
+          <w:color w:val="000000"/>
+          <w:sz w:val="26"/>
+        </w:rPr>
+        <w:t>4.9. Thời gian phản hồi và tài nguyên</w:t>
+      </w:r>
+    </w:p>
+    <w:p>
+      <w:pPr>
+        <w:spacing w:line="360" w:lineRule="auto" w:after="120"/>
+        <w:ind w:firstLine="567"/>
+        <w:jc w:val="both"/>
+      </w:pPr>
+      <w:r>
+        <w:rPr>
+          <w:rFonts w:ascii="Times New Roman" w:hAnsi="Times New Roman" w:cs="Times New Roman"/>
+          <w:b w:val="0"/>
+          <w:i w:val="0"/>
+          <w:sz w:val="26"/>
+        </w:rPr>
+        <w:t>Toàn bộ hệ thống vận hành trên CPU với 16GB RAM. Các mốc thời gian đo được trên bộ câu hỏi: lập chỉ mục embedding đạt khoảng 7,7 đoạn/giây (toàn corpus 367.462 đoạn mất khoảng 13 giờ, chạy nền và có khả năng resume); thời gian truy xuất trung bình (gồm cả bước reranker) khoảng 9 giây/câu; thời gian sinh câu trả lời trung bình khoảng 52 giây/câu (dao động 31–113 giây tùy độ dài). Mức thời gian này chấp nhận được cho mục đích tra cứu tham khảo, dù chưa đạt thời gian thực; có thể rút ngắn đáng kể nếu triển khai trên GPU. Việc lượng tử hóa GGUF Q4 là yếu tố then chốt giúp mô hình 3,7 tỷ tham số chạy được trong giới hạn 16GB RAM.</w:t>
+      </w:r>
+    </w:p>
+    <w:p>
+      <w:pPr>
+        <w:spacing w:before="120"/>
+        <w:jc w:val="center"/>
+      </w:pPr>
+      <w:r>
+        <w:drawing>
+          <wp:inline xmlns:a="http://schemas.openxmlformats.org/drawingml/2006/main" xmlns:pic="http://schemas.openxmlformats.org/drawingml/2006/picture">
+            <wp:extent cx="3240000" cy="2492308"/>
+            <wp:docPr id="7" name="Picture 7"/>
+            <wp:cNvGraphicFramePr>
+              <a:graphicFrameLocks noChangeAspect="1"/>
+            </wp:cNvGraphicFramePr>
+            <a:graphic>
+              <a:graphicData uri="http://schemas.openxmlformats.org/drawingml/2006/picture">
+                <pic:pic>
+                  <pic:nvPicPr>
+                    <pic:cNvPr id="0" name="latency.png"/>
+                    <pic:cNvPicPr/>
+                  </pic:nvPicPr>
+                  <pic:blipFill>
+                    <a:blip r:embed="rId17"/>
+                    <a:stretch>
+                      <a:fillRect/>
+                    </a:stretch>
+                  </pic:blipFill>
+                  <pic:spPr>
+                    <a:xfrm>
+                      <a:off x="0" y="0"/>
+                      <a:ext cx="3240000" cy="2492308"/>
+                    </a:xfrm>
+                    <a:prstGeom prst="rect"/>
+                  </pic:spPr>
+                </pic:pic>
+              </a:graphicData>
+            </a:graphic>
+          </wp:inline>
+        </w:drawing>
+      </w:r>
+    </w:p>
+    <w:p>
+      <w:pPr>
+        <w:spacing w:after="200"/>
+        <w:jc w:val="center"/>
+      </w:pPr>
+      <w:r>
+        <w:rPr>
+          <w:rFonts w:ascii="Times New Roman" w:hAnsi="Times New Roman" w:cs="Times New Roman"/>
+          <w:b/>
+          <w:i w:val="0"/>
+          <w:sz w:val="24"/>
+        </w:rPr>
+        <w:t>Hình 4.3. Thời gian phản hồi trung bình (truy xuất và sinh)</w:t>
+      </w:r>
+    </w:p>
+    <w:p>
+      <w:pPr>
+        <w:pStyle w:val="Heading2"/>
+        <w:keepNext/>
+        <w:spacing w:before="200" w:after="80"/>
+      </w:pPr>
+      <w:r>
+        <w:rPr>
+          <w:rFonts w:ascii="Times New Roman" w:hAnsi="Times New Roman" w:cs="Times New Roman"/>
+          <w:b/>
+          <w:i w:val="0"/>
+          <w:color w:val="000000"/>
+          <w:sz w:val="26"/>
+        </w:rPr>
+        <w:t>4.10. Chất lượng câu trả lời và mức độ trích dẫn</w:t>
+      </w:r>
+    </w:p>
+    <w:p>
+      <w:pPr>
+        <w:spacing w:line="360" w:lineRule="auto" w:after="120"/>
+        <w:ind w:firstLine="567"/>
+        <w:jc w:val="both"/>
+      </w:pPr>
+      <w:r>
+        <w:rPr>
+          <w:rFonts w:ascii="Times New Roman" w:hAnsi="Times New Roman" w:cs="Times New Roman"/>
+          <w:b w:val="0"/>
+          <w:i w:val="0"/>
+          <w:sz w:val="26"/>
+        </w:rPr>
+        <w:t>Để đánh giá phần sinh, đề tài chạy đầy đủ pipeline (Hybrid + Reranker + PhoGPT) trên 6 câu hỏi và rà soát thủ công. Kết quả: 6/6 câu trả lời (tỉ lệ 100%) trích dẫn đúng ít nhất một văn bản liên quan trong số nguồn truy xuất; các câu trả lời bám sát điều luật cụ thể (ví dụ Điều 19 Luật Khám bệnh chữa bệnh, Điều 33 và Điều 79 Luật Dược) và không bịa thông tin ngoài ngữ cảnh.</w:t>
+      </w:r>
+    </w:p>
+    <w:p>
+      <w:pPr>
+        <w:spacing w:line="360" w:lineRule="auto" w:after="120"/>
+        <w:ind w:firstLine="567"/>
+        <w:jc w:val="both"/>
+      </w:pPr>
+      <w:r>
+        <w:rPr>
+          <w:rFonts w:ascii="Times New Roman" w:hAnsi="Times New Roman" w:cs="Times New Roman"/>
+          <w:b w:val="0"/>
+          <w:i w:val="0"/>
+          <w:sz w:val="26"/>
+        </w:rPr>
+        <w:t>Hạn chế quan sát được: mô hình thỉnh thoảng nêu chi tiết phụ chưa chính xác (ví dụ một câu trả lời nhắc “Luật Khám bệnh, chữa bệnh 2009” trong khi nguồn trích dẫn là Luật 15/2023/QH15) — tuy nguồn dẫn vẫn đúng. Điều này cho thấy RAG giảm mạnh nhưng chưa loại bỏ hoàn toàn sai sót của phần sinh; cần kiểm chứng của con người với các nội dung pháp lý quan trọng.</w:t>
       </w:r>
     </w:p>
     <w:p>
@@ -5575,7 +6341,7 @@
           <w:i w:val="0"/>
           <w:sz w:val="26"/>
         </w:rPr>
-        <w:t>Tốc độ sinh trên CPU (~20–40 giây/câu) chưa đáp ứng yêu cầu thời gian thực.</w:t>
+        <w:t>Tốc độ sinh trên CPU (trung bình ~52 giây/câu) chưa đáp ứng yêu cầu thời gian thực.</w:t>
       </w:r>
     </w:p>
     <w:p>

</xml_diff>

<commit_message>
Mở rộng bộ câu hỏi vàng lên 50 câu; cập nhật toàn bộ số liệu (Hit/MRR, Precision/Recall/k, latency), thêm trần Precision; cập nhật báo cáo, README, biểu đồ
</commit_message>
<xml_diff>
--- a/report/BaoCao_RAG_DATN.docx
+++ b/report/BaoCao_RAG_DATN.docx
@@ -4011,7 +4011,7 @@
           <w:i w:val="0"/>
           <w:sz w:val="26"/>
         </w:rPr>
-        <w:t>Bộ đánh giá gồm 18 câu hỏi tiếng Việt bao phủ nhiều luật y tế trọng yếu (Khám bệnh chữa bệnh, Dược, An toàn thực phẩm, Bảo hiểm y tế, phòng chống tác hại thuốc lá/rượu bia, hiến mô tạng, HIV/AIDS, phòng bệnh). Mỗi câu hỏi được gán nhãn “văn bản liên quan” (ground-truth) là (các) luật điều chỉnh nội dung câu hỏi. Đặc biệt, nhãn được bổ sung các Văn bản hợp nhất (VBHN) tương đương — ví dụ 39/VBHN-VPQH là bản hợp nhất Luật Dược — vì chúng có cùng nội dung luật nhưng khác số hiệu. Chỉ mục dùng toàn bộ 367.462 đoạn. Các độ đo là Hit@k và MRR (Mục 1.7).</w:t>
+        <w:t>Bộ đánh giá gồm 50 câu hỏi tiếng Việt bao phủ nhiều luật y tế trọng yếu (Khám bệnh chữa bệnh, Dược, An toàn thực phẩm, Bảo hiểm y tế, phòng chống tác hại thuốc lá/rượu bia, hiến mô tạng, HIV/AIDS, phòng bệnh). Mỗi câu hỏi được gán nhãn “văn bản liên quan” (ground-truth) là (các) luật điều chỉnh nội dung câu hỏi (trung bình 1,96 văn bản/câu). Đặc biệt, nhãn được bổ sung các Văn bản hợp nhất (VBHN) tương đương — ví dụ 39/VBHN-VPQH là bản hợp nhất Luật Dược — vì chúng có cùng nội dung luật nhưng khác số hiệu. Chỉ mục dùng toàn bộ 367.462 đoạn. Các độ đo là Hit@k, MRR (Mục 1.7) và Precision/Recall/F1@k.</w:t>
       </w:r>
     </w:p>
     <w:p>
@@ -4043,7 +4043,7 @@
           <w:i w:val="0"/>
           <w:sz w:val="24"/>
         </w:rPr>
-        <w:t>Bảng 4.1. So sánh các cấu hình truy xuất (18 câu hỏi)</w:t>
+        <w:t>Bảng 4.1. So sánh các cấu hình truy xuất (50 câu hỏi)</w:t>
       </w:r>
     </w:p>
     <w:tbl>
@@ -4218,7 +4218,7 @@
                 <w:i w:val="0"/>
                 <w:sz w:val="24"/>
               </w:rPr>
-              <w:t>0,333</w:t>
+              <w:t>0,380</w:t>
             </w:r>
           </w:p>
         </w:tc>
@@ -4237,7 +4237,7 @@
                 <w:i w:val="0"/>
                 <w:sz w:val="24"/>
               </w:rPr>
-              <w:t>0,556</w:t>
+              <w:t>0,640</w:t>
             </w:r>
           </w:p>
         </w:tc>
@@ -4256,7 +4256,7 @@
                 <w:i w:val="0"/>
                 <w:sz w:val="24"/>
               </w:rPr>
-              <w:t>0,667</w:t>
+              <w:t>0,720</w:t>
             </w:r>
           </w:p>
         </w:tc>
@@ -4275,7 +4275,7 @@
                 <w:i w:val="0"/>
                 <w:sz w:val="24"/>
               </w:rPr>
-              <w:t>0,833</w:t>
+              <w:t>0,840</w:t>
             </w:r>
           </w:p>
         </w:tc>
@@ -4294,7 +4294,7 @@
                 <w:i w:val="0"/>
                 <w:sz w:val="24"/>
               </w:rPr>
-              <w:t>0,481</w:t>
+              <w:t>0,534</w:t>
             </w:r>
           </w:p>
         </w:tc>
@@ -4334,7 +4334,7 @@
                 <w:i w:val="0"/>
                 <w:sz w:val="24"/>
               </w:rPr>
-              <w:t>0,389</w:t>
+              <w:t>0,520</w:t>
             </w:r>
           </w:p>
         </w:tc>
@@ -4353,7 +4353,7 @@
                 <w:i w:val="0"/>
                 <w:sz w:val="24"/>
               </w:rPr>
-              <w:t>0,778</w:t>
+              <w:t>0,820</w:t>
             </w:r>
           </w:p>
         </w:tc>
@@ -4372,7 +4372,7 @@
                 <w:i w:val="0"/>
                 <w:sz w:val="24"/>
               </w:rPr>
-              <w:t>0,833</w:t>
+              <w:t>0,860</w:t>
             </w:r>
           </w:p>
         </w:tc>
@@ -4391,7 +4391,7 @@
                 <w:i w:val="0"/>
                 <w:sz w:val="24"/>
               </w:rPr>
-              <w:t>0,944</w:t>
+              <w:t>0,920</w:t>
             </w:r>
           </w:p>
         </w:tc>
@@ -4410,7 +4410,7 @@
                 <w:i w:val="0"/>
                 <w:sz w:val="24"/>
               </w:rPr>
-              <w:t>0,586</w:t>
+              <w:t>0,668</w:t>
             </w:r>
           </w:p>
         </w:tc>
@@ -4450,7 +4450,7 @@
                 <w:i w:val="0"/>
                 <w:sz w:val="24"/>
               </w:rPr>
-              <w:t>0,500</w:t>
+              <w:t>0,540</w:t>
             </w:r>
           </w:p>
         </w:tc>
@@ -4469,7 +4469,7 @@
                 <w:i w:val="0"/>
                 <w:sz w:val="24"/>
               </w:rPr>
-              <w:t>0,833</w:t>
+              <w:t>0,780</w:t>
             </w:r>
           </w:p>
         </w:tc>
@@ -4488,7 +4488,7 @@
                 <w:i w:val="0"/>
                 <w:sz w:val="24"/>
               </w:rPr>
-              <w:t>0,889</w:t>
+              <w:t>0,840</w:t>
             </w:r>
           </w:p>
         </w:tc>
@@ -4507,7 +4507,7 @@
                 <w:i w:val="0"/>
                 <w:sz w:val="24"/>
               </w:rPr>
-              <w:t>0,889</w:t>
+              <w:t>0,880</w:t>
             </w:r>
           </w:p>
         </w:tc>
@@ -4526,7 +4526,7 @@
                 <w:i w:val="0"/>
                 <w:sz w:val="24"/>
               </w:rPr>
-              <w:t>0,644</w:t>
+              <w:t>0,667</w:t>
             </w:r>
           </w:p>
         </w:tc>
@@ -4566,7 +4566,7 @@
                 <w:i w:val="0"/>
                 <w:sz w:val="24"/>
               </w:rPr>
-              <w:t>0,556</w:t>
+              <w:t>0,500</w:t>
             </w:r>
           </w:p>
         </w:tc>
@@ -4585,7 +4585,7 @@
                 <w:i w:val="0"/>
                 <w:sz w:val="24"/>
               </w:rPr>
-              <w:t>0,778</w:t>
+              <w:t>0,800</w:t>
             </w:r>
           </w:p>
         </w:tc>
@@ -4604,7 +4604,7 @@
                 <w:i w:val="0"/>
                 <w:sz w:val="24"/>
               </w:rPr>
-              <w:t>0,889</w:t>
+              <w:t>0,860</w:t>
             </w:r>
           </w:p>
         </w:tc>
@@ -4623,7 +4623,7 @@
                 <w:i w:val="0"/>
                 <w:sz w:val="24"/>
               </w:rPr>
-              <w:t>1,000</w:t>
+              <w:t>0,980</w:t>
             </w:r>
           </w:p>
         </w:tc>
@@ -4642,7 +4642,7 @@
                 <w:i w:val="0"/>
                 <w:sz w:val="24"/>
               </w:rPr>
-              <w:t>0,687</w:t>
+              <w:t>0,669</w:t>
             </w:r>
           </w:p>
         </w:tc>
@@ -4682,7 +4682,7 @@
                 <w:i w:val="0"/>
                 <w:sz w:val="24"/>
               </w:rPr>
-              <w:t>0,556</w:t>
+              <w:t>0,560</w:t>
             </w:r>
           </w:p>
         </w:tc>
@@ -4701,7 +4701,7 @@
                 <w:i w:val="0"/>
                 <w:sz w:val="24"/>
               </w:rPr>
-              <w:t>0,833</w:t>
+              <w:t>0,780</w:t>
             </w:r>
           </w:p>
         </w:tc>
@@ -4720,7 +4720,7 @@
                 <w:i w:val="0"/>
                 <w:sz w:val="24"/>
               </w:rPr>
-              <w:t>0,944</w:t>
+              <w:t>0,860</w:t>
             </w:r>
           </w:p>
         </w:tc>
@@ -4739,7 +4739,7 @@
                 <w:i w:val="0"/>
                 <w:sz w:val="24"/>
               </w:rPr>
-              <w:t>0,944</w:t>
+              <w:t>0,920</w:t>
             </w:r>
           </w:p>
         </w:tc>
@@ -4758,7 +4758,7 @@
                 <w:i w:val="0"/>
                 <w:sz w:val="24"/>
               </w:rPr>
-              <w:t>0,722</w:t>
+              <w:t>0,694</w:t>
             </w:r>
           </w:p>
         </w:tc>
@@ -4854,7 +4854,7 @@
           <w:i w:val="0"/>
           <w:sz w:val="26"/>
         </w:rPr>
-        <w:t>So sánh cấu hình (1) và (2) trong Bảng 4.1: bổ sung bước tách từ bằng pyVi nâng Hit@3 từ 0,556 lên 0,778 (tăng 0,222) và MRR từ 0,481 lên 0,586 (tăng 0,105). Kết quả khẳng định giả thuyết lý thuyết ở Mục 1.2.1: vì PhoBERT được huấn luyện trên dữ liệu đã tách từ, việc tách từ nhất quán cả khi lập chỉ mục lẫn khi truy vấn giúp embedding của câu hỏi và đoạn cùng phân phối, từ đó khớp tốt hơn. Đây là một minh chứng định lượng cho sự cần thiết của bước tách từ.</w:t>
+        <w:t>So sánh cấu hình (1) và (2) trong Bảng 4.1: bổ sung bước tách từ bằng pyvi nâng Hit@1 từ 0,380 lên 0,520 (tăng 0,140), Hit@3 từ 0,640 lên 0,820 (tăng 0,180) và MRR từ 0,534 lên 0,668 (tăng 0,134). Đây là cải thiện lớn nhất trong các thí nghiệm, khẳng định giả thuyết ở Mục 1.2.1: vì PhoBERT được huấn luyện trên dữ liệu đã tách từ, việc tách từ nhất quán cả khi lập chỉ mục lẫn khi truy vấn giúp embedding của câu hỏi và đoạn cùng phân phối, từ đó khớp tốt hơn. Đây là minh chứng định lượng rõ ràng cho sự cần thiết của bước tách từ.</w:t>
       </w:r>
     </w:p>
     <w:p>
@@ -4887,7 +4887,7 @@
           <w:i w:val="0"/>
           <w:sz w:val="26"/>
         </w:rPr>
-        <w:t>So sánh (2) và (3): bộ reranker PhoRanker xếp lại 30 ứng viên đầu giúp Hit@1 tăng từ 0,389 lên 0,500 (tăng 0,111) và MRR tăng 0,058. Điều này phù hợp với phân tích ở Mục 1.5: cross-encoder đánh giá độ liên quan tinh tế hơn bi-encoder nhờ chú ý chéo, nên đẩy được tài liệu đúng lên vị trí cao hơn. Ghi nhận một đánh đổi: Hit@10 giảm nhẹ vì reranker chỉ làm việc trong phạm vi 30 ứng viên đầu; có thể tăng số ứng viên để giảm hiệu ứng này.</w:t>
+        <w:t>So sánh (2) và (3): bộ reranker PhoRanker xếp lại 30 ứng viên đầu giúp Hit@1 tăng nhẹ (0,520 → 0,540) nhưng MRR gần như không đổi (0,668 → 0,667) và Hit@3 giảm (0,820 → 0,780). Như vậy trên bộ 50 câu, reranker dùng đơn lẻ cho lợi ích khiêm tốn. Tuy nhiên khi kết hợp với hybrid (cấu hình 5), reranker lại nâng Hit@1 lên cao nhất (0,560) và MRR lên cao nhất (0,694) — cho thấy reranker phát huy tác dụng tốt hơn khi đứng sau một tập ứng viên đa dạng từ hybrid. Cross-encoder đánh giá độ liên quan tinh tế hơn bi-encoder nhờ chú ý chéo (Mục 1.5), nhưng hiệu quả phụ thuộc chất lượng và độ đa dạng của tập ứng viên đầu vào.</w:t>
       </w:r>
     </w:p>
     <w:p>
@@ -5475,7 +5475,7 @@
           <w:i w:val="0"/>
           <w:sz w:val="26"/>
         </w:rPr>
-        <w:t>So sánh (2), (4) và (5): hybrid BM25+vector nâng Hit@1 lên 0,556 và đạt Hit@10 = 1,000 (tìm thấy văn bản liên quan trong top-10 cho mọi câu hỏi); kết hợp thêm reranker cho MRR cao nhất 0,722 và Hit@5 0,944. Quan trọng hơn về mặt định tính: với truy vấn chứa số hiệu (ví dụ “Nghị định 96/2023/NĐ-CP quy định gì?”), cơ chế hybrid kèm nhận diện số hiệu trả về đúng văn bản, trong khi vector thuần thường trượt do không nắm được chuỗi số hiệu. Đây là minh chứng rõ cho luận điểm BM25 bù đắp điểm yếu từ vựng của embedding (Mục 1.4).</w:t>
+        <w:t>So sánh (2), (4) và (5): hybrid BM25+vector đạt Hit@10 = 0,980 — gần như không bỏ sót, cao nhất trong các cấu hình; kết hợp thêm reranker (cấu hình 5) cho Hit@1 cao nhất (0,560) và MRR cao nhất (0,694). Quan trọng hơn về mặt định tính: với truy vấn chứa số hiệu (ví dụ “Nghị định 96/2023/NĐ-CP quy định gì?”), cơ chế hybrid kèm nhận diện số hiệu trả về đúng văn bản, trong khi vector thuần thường trượt do không nắm được chuỗi số hiệu. Đây là minh chứng rõ cho luận điểm BM25 bù đắp điểm yếu từ vựng của embedding (Mục 1.4). Tổng hợp lại, cấu hình Hybrid + Reranker được chọn cho hệ thống vì cân bằng tốt nhất giữa độ chính xác ở hạng đầu (Hit@1, MRR) và độ phủ (Hit@10).</w:t>
       </w:r>
     </w:p>
     <w:p>
@@ -5524,7 +5524,7 @@
           <w:i w:val="0"/>
           <w:sz w:val="26"/>
         </w:rPr>
-        <w:t>Thứ hai, vấn đề ground-truth: trước khi bổ sung các Văn bản hợp nhất (VBHN) tương đương, baseline chỉ đạt Hit@1 = 0,222; sau khi bổ sung tăng lên 0,389. Cụ thể, câu về an toàn thực phẩm trả về 61/VBHN-VPQH (bản hợp nhất Luật An toàn thực phẩm) và câu về HIV trả về 33/VBHN-VPQH (bản hợp nhất Luật phòng, chống HIV/AIDS) — đúng nội dung nhưng khác số hiệu. Điều này cho thấy chỉ số ban đầu đã đánh giá thấp năng lực thực của hệ thống, và việc xây dựng ground-truth cẩn thận (tính đến VBHN) là cần thiết để đánh giá công bằng trong miền pháp luật.</w:t>
+        <w:t>Thứ hai, vấn đề ground-truth: nhiều câu trả về Văn bản hợp nhất (VBHN) tương đương thay vì luật gốc — ví dụ câu về an toàn thực phẩm trả về 61/VBHN-VPQH (bản hợp nhất Luật An toàn thực phẩm), câu về HIV trả về 33/VBHN-VPQH (bản hợp nhất Luật phòng, chống HIV/AIDS) — đúng nội dung nhưng khác số hiệu. Nếu không tính các VBHN này vào ground-truth, chỉ số sẽ bị đánh giá thấp một cách giả tạo. Vì vậy đề tài đã bổ sung VBHN tương đương vào nhãn để đánh giá công bằng — một lưu ý quan trọng khi xây dựng tập kiểm thử cho miền pháp luật.</w:t>
       </w:r>
     </w:p>
     <w:p>
@@ -5588,7 +5588,7 @@
           <w:i w:val="0"/>
           <w:sz w:val="24"/>
         </w:rPr>
-        <w:t>Bảng 4.3. Precision/Recall/F1 theo số nguồn k</w:t>
+        <w:t>Bảng 4.3. Precision/Recall/F1 theo số nguồn k (kèm trần Precision)</w:t>
       </w:r>
     </w:p>
     <w:tbl>
@@ -5599,15 +5599,16 @@
         <w:tblLook w:firstColumn="1" w:firstRow="1" w:lastColumn="0" w:lastRow="0" w:noHBand="0" w:noVBand="1" w:val="04A0"/>
       </w:tblPr>
       <w:tblGrid>
-        <w:gridCol w:w="2268"/>
-        <w:gridCol w:w="2268"/>
-        <w:gridCol w:w="2268"/>
-        <w:gridCol w:w="2268"/>
+        <w:gridCol w:w="1814"/>
+        <w:gridCol w:w="1814"/>
+        <w:gridCol w:w="1814"/>
+        <w:gridCol w:w="1814"/>
+        <w:gridCol w:w="1814"/>
       </w:tblGrid>
       <w:tr>
         <w:tc>
           <w:tcPr>
-            <w:tcW w:type="dxa" w:w="2268"/>
+            <w:tcW w:type="dxa" w:w="1814"/>
             <w:shd w:val="clear" w:fill="D9E2F3"/>
           </w:tcPr>
           <w:p>
@@ -5627,7 +5628,7 @@
         </w:tc>
         <w:tc>
           <w:tcPr>
-            <w:tcW w:type="dxa" w:w="2268"/>
+            <w:tcW w:type="dxa" w:w="1814"/>
             <w:shd w:val="clear" w:fill="D9E2F3"/>
           </w:tcPr>
           <w:p>
@@ -5647,7 +5648,7 @@
         </w:tc>
         <w:tc>
           <w:tcPr>
-            <w:tcW w:type="dxa" w:w="2268"/>
+            <w:tcW w:type="dxa" w:w="1814"/>
             <w:shd w:val="clear" w:fill="D9E2F3"/>
           </w:tcPr>
           <w:p>
@@ -5667,7 +5668,7 @@
         </w:tc>
         <w:tc>
           <w:tcPr>
-            <w:tcW w:type="dxa" w:w="2268"/>
+            <w:tcW w:type="dxa" w:w="1814"/>
             <w:shd w:val="clear" w:fill="D9E2F3"/>
           </w:tcPr>
           <w:p>
@@ -5685,11 +5686,31 @@
             </w:r>
           </w:p>
         </w:tc>
+        <w:tc>
+          <w:tcPr>
+            <w:tcW w:type="dxa" w:w="1814"/>
+            <w:shd w:val="clear" w:fill="D9E2F3"/>
+          </w:tcPr>
+          <w:p>
+            <w:pPr>
+              <w:jc w:val="center"/>
+            </w:pPr>
+            <w:r>
+              <w:rPr>
+                <w:rFonts w:ascii="Times New Roman" w:hAnsi="Times New Roman" w:cs="Times New Roman"/>
+                <w:b/>
+                <w:i w:val="0"/>
+                <w:sz w:val="24"/>
+              </w:rPr>
+              <w:t>Trần P@k</w:t>
+            </w:r>
+          </w:p>
+        </w:tc>
       </w:tr>
       <w:tr>
         <w:tc>
           <w:tcPr>
-            <w:tcW w:type="dxa" w:w="2268"/>
+            <w:tcW w:type="dxa" w:w="1814"/>
           </w:tcPr>
           <w:p>
             <w:pPr>
@@ -5708,7 +5729,7 @@
         </w:tc>
         <w:tc>
           <w:tcPr>
-            <w:tcW w:type="dxa" w:w="2268"/>
+            <w:tcW w:type="dxa" w:w="1814"/>
           </w:tcPr>
           <w:p>
             <w:pPr>
@@ -5721,13 +5742,13 @@
                 <w:i w:val="0"/>
                 <w:sz w:val="24"/>
               </w:rPr>
-              <w:t>0,556</w:t>
+              <w:t>0,560</w:t>
             </w:r>
           </w:p>
         </w:tc>
         <w:tc>
           <w:tcPr>
-            <w:tcW w:type="dxa" w:w="2268"/>
+            <w:tcW w:type="dxa" w:w="1814"/>
           </w:tcPr>
           <w:p>
             <w:pPr>
@@ -5740,13 +5761,13 @@
                 <w:i w:val="0"/>
                 <w:sz w:val="24"/>
               </w:rPr>
-              <w:t>0,366</w:t>
+              <w:t>0,363</w:t>
             </w:r>
           </w:p>
         </w:tc>
         <w:tc>
           <w:tcPr>
-            <w:tcW w:type="dxa" w:w="2268"/>
+            <w:tcW w:type="dxa" w:w="1814"/>
           </w:tcPr>
           <w:p>
             <w:pPr>
@@ -5759,7 +5780,26 @@
                 <w:i w:val="0"/>
                 <w:sz w:val="24"/>
               </w:rPr>
-              <w:t>0,441</w:t>
+              <w:t>0,440</w:t>
+            </w:r>
+          </w:p>
+        </w:tc>
+        <w:tc>
+          <w:tcPr>
+            <w:tcW w:type="dxa" w:w="1814"/>
+          </w:tcPr>
+          <w:p>
+            <w:pPr>
+              <w:jc w:val="center"/>
+            </w:pPr>
+            <w:r>
+              <w:rPr>
+                <w:rFonts w:ascii="Times New Roman" w:hAnsi="Times New Roman" w:cs="Times New Roman"/>
+                <w:b w:val="0"/>
+                <w:i w:val="0"/>
+                <w:sz w:val="24"/>
+              </w:rPr>
+              <w:t>1,000</w:t>
             </w:r>
           </w:p>
         </w:tc>
@@ -5767,7 +5807,7 @@
       <w:tr>
         <w:tc>
           <w:tcPr>
-            <w:tcW w:type="dxa" w:w="2268"/>
+            <w:tcW w:type="dxa" w:w="1814"/>
           </w:tcPr>
           <w:p>
             <w:pPr>
@@ -5786,7 +5826,7 @@
         </w:tc>
         <w:tc>
           <w:tcPr>
-            <w:tcW w:type="dxa" w:w="2268"/>
+            <w:tcW w:type="dxa" w:w="1814"/>
           </w:tcPr>
           <w:p>
             <w:pPr>
@@ -5799,13 +5839,13 @@
                 <w:i w:val="0"/>
                 <w:sz w:val="24"/>
               </w:rPr>
-              <w:t>0,389</w:t>
+              <w:t>0,360</w:t>
             </w:r>
           </w:p>
         </w:tc>
         <w:tc>
           <w:tcPr>
-            <w:tcW w:type="dxa" w:w="2268"/>
+            <w:tcW w:type="dxa" w:w="1814"/>
           </w:tcPr>
           <w:p>
             <w:pPr>
@@ -5818,13 +5858,13 @@
                 <w:i w:val="0"/>
                 <w:sz w:val="24"/>
               </w:rPr>
-              <w:t>0,625</w:t>
+              <w:t>0,632</w:t>
             </w:r>
           </w:p>
         </w:tc>
         <w:tc>
           <w:tcPr>
-            <w:tcW w:type="dxa" w:w="2268"/>
+            <w:tcW w:type="dxa" w:w="1814"/>
           </w:tcPr>
           <w:p>
             <w:pPr>
@@ -5837,7 +5877,26 @@
                 <w:i w:val="0"/>
                 <w:sz w:val="24"/>
               </w:rPr>
-              <w:t>0,480</w:t>
+              <w:t>0,459</w:t>
+            </w:r>
+          </w:p>
+        </w:tc>
+        <w:tc>
+          <w:tcPr>
+            <w:tcW w:type="dxa" w:w="1814"/>
+          </w:tcPr>
+          <w:p>
+            <w:pPr>
+              <w:jc w:val="center"/>
+            </w:pPr>
+            <w:r>
+              <w:rPr>
+                <w:rFonts w:ascii="Times New Roman" w:hAnsi="Times New Roman" w:cs="Times New Roman"/>
+                <w:b w:val="0"/>
+                <w:i w:val="0"/>
+                <w:sz w:val="24"/>
+              </w:rPr>
+              <w:t>0,653</w:t>
             </w:r>
           </w:p>
         </w:tc>
@@ -5845,7 +5904,7 @@
       <w:tr>
         <w:tc>
           <w:tcPr>
-            <w:tcW w:type="dxa" w:w="2268"/>
+            <w:tcW w:type="dxa" w:w="1814"/>
           </w:tcPr>
           <w:p>
             <w:pPr>
@@ -5864,7 +5923,7 @@
         </w:tc>
         <w:tc>
           <w:tcPr>
-            <w:tcW w:type="dxa" w:w="2268"/>
+            <w:tcW w:type="dxa" w:w="1814"/>
           </w:tcPr>
           <w:p>
             <w:pPr>
@@ -5877,13 +5936,13 @@
                 <w:i w:val="0"/>
                 <w:sz w:val="24"/>
               </w:rPr>
-              <w:t>0,267</w:t>
+              <w:t>0,244</w:t>
             </w:r>
           </w:p>
         </w:tc>
         <w:tc>
           <w:tcPr>
-            <w:tcW w:type="dxa" w:w="2268"/>
+            <w:tcW w:type="dxa" w:w="1814"/>
           </w:tcPr>
           <w:p>
             <w:pPr>
@@ -5896,13 +5955,13 @@
                 <w:i w:val="0"/>
                 <w:sz w:val="24"/>
               </w:rPr>
-              <w:t>0,681</w:t>
+              <w:t>0,688</w:t>
             </w:r>
           </w:p>
         </w:tc>
         <w:tc>
           <w:tcPr>
-            <w:tcW w:type="dxa" w:w="2268"/>
+            <w:tcW w:type="dxa" w:w="1814"/>
           </w:tcPr>
           <w:p>
             <w:pPr>
@@ -5915,7 +5974,26 @@
                 <w:i w:val="0"/>
                 <w:sz w:val="24"/>
               </w:rPr>
-              <w:t>0,384</w:t>
+              <w:t>0,360</w:t>
+            </w:r>
+          </w:p>
+        </w:tc>
+        <w:tc>
+          <w:tcPr>
+            <w:tcW w:type="dxa" w:w="1814"/>
+          </w:tcPr>
+          <w:p>
+            <w:pPr>
+              <w:jc w:val="center"/>
+            </w:pPr>
+            <w:r>
+              <w:rPr>
+                <w:rFonts w:ascii="Times New Roman" w:hAnsi="Times New Roman" w:cs="Times New Roman"/>
+                <w:b w:val="0"/>
+                <w:i w:val="0"/>
+                <w:sz w:val="24"/>
+              </w:rPr>
+              <w:t>0,392</w:t>
             </w:r>
           </w:p>
         </w:tc>
@@ -5923,7 +6001,7 @@
       <w:tr>
         <w:tc>
           <w:tcPr>
-            <w:tcW w:type="dxa" w:w="2268"/>
+            <w:tcW w:type="dxa" w:w="1814"/>
           </w:tcPr>
           <w:p>
             <w:pPr>
@@ -5942,7 +6020,7 @@
         </w:tc>
         <w:tc>
           <w:tcPr>
-            <w:tcW w:type="dxa" w:w="2268"/>
+            <w:tcW w:type="dxa" w:w="1814"/>
           </w:tcPr>
           <w:p>
             <w:pPr>
@@ -5955,13 +6033,13 @@
                 <w:i w:val="0"/>
                 <w:sz w:val="24"/>
               </w:rPr>
-              <w:t>0,144</w:t>
+              <w:t>0,140</w:t>
             </w:r>
           </w:p>
         </w:tc>
         <w:tc>
           <w:tcPr>
-            <w:tcW w:type="dxa" w:w="2268"/>
+            <w:tcW w:type="dxa" w:w="1814"/>
           </w:tcPr>
           <w:p>
             <w:pPr>
@@ -5974,13 +6052,13 @@
                 <w:i w:val="0"/>
                 <w:sz w:val="24"/>
               </w:rPr>
-              <w:t>0,722</w:t>
+              <w:t>0,778</w:t>
             </w:r>
           </w:p>
         </w:tc>
         <w:tc>
           <w:tcPr>
-            <w:tcW w:type="dxa" w:w="2268"/>
+            <w:tcW w:type="dxa" w:w="1814"/>
           </w:tcPr>
           <w:p>
             <w:pPr>
@@ -5993,7 +6071,26 @@
                 <w:i w:val="0"/>
                 <w:sz w:val="24"/>
               </w:rPr>
-              <w:t>0,240</w:t>
+              <w:t>0,237</w:t>
+            </w:r>
+          </w:p>
+        </w:tc>
+        <w:tc>
+          <w:tcPr>
+            <w:tcW w:type="dxa" w:w="1814"/>
+          </w:tcPr>
+          <w:p>
+            <w:pPr>
+              <w:jc w:val="center"/>
+            </w:pPr>
+            <w:r>
+              <w:rPr>
+                <w:rFonts w:ascii="Times New Roman" w:hAnsi="Times New Roman" w:cs="Times New Roman"/>
+                <w:b w:val="0"/>
+                <w:i w:val="0"/>
+                <w:sz w:val="24"/>
+              </w:rPr>
+              <w:t>0,196</w:t>
             </w:r>
           </w:p>
         </w:tc>
@@ -6072,7 +6169,23 @@
           <w:i w:val="0"/>
           <w:sz w:val="26"/>
         </w:rPr>
-        <w:t>Kết quả thể hiện rõ đánh đổi kinh điển: khi k tăng, Recall tăng (lấy về nhiều văn bản đúng hơn) nhưng Precision giảm (nhiều nhiễu hơn). F1 đạt cực đại tại k = 3 (0,480), cho thấy lấy khoảng 3–5 nguồn là cân bằng tốt giữa độ phủ và độ chính xác — phù hợp để truyền vào mô hình sinh mà không làm loãng ngữ cảnh.</w:t>
+        <w:t>Kết quả thể hiện rõ đánh đổi kinh điển: khi k tăng, Recall tăng (0,363 → 0,778) nhưng Precision giảm (0,560 → 0,140). F1 đạt cực đại tại k = 3 (0,459), cho thấy lấy khoảng 3–5 nguồn là cân bằng tốt giữa độ phủ và độ chính xác — phù hợp để truyền vào mô hình sinh mà không làm loãng ngữ cảnh; hệ thống đặt mặc định k = 5.</w:t>
+      </w:r>
+    </w:p>
+    <w:p>
+      <w:pPr>
+        <w:spacing w:line="360" w:lineRule="auto" w:after="120"/>
+        <w:ind w:firstLine="567"/>
+        <w:jc w:val="both"/>
+      </w:pPr>
+      <w:r>
+        <w:rPr>
+          <w:rFonts w:ascii="Times New Roman" w:hAnsi="Times New Roman" w:cs="Times New Roman"/>
+          <w:b w:val="0"/>
+          <w:i w:val="0"/>
+          <w:sz w:val="26"/>
+        </w:rPr>
+        <w:t>Cần lưu ý một điểm phương pháp quan trọng: do mỗi câu hỏi chỉ có trung bình 1,96 văn bản liên quan, Precision bị chặn trần về mặt toán học bởi trần P@k = min(|liên quan|, k)/k (cột cuối Bảng 4.3). Vì vậy việc Precision giảm khi k tăng phần lớn là do trần giảm, không phải do truy xuất kém đi. Bằng chứng: tỷ lệ Precision đạt được so với trần lại TĂNG theo k (từ 56% ở k=1 lên 71% ở k=10), nghĩa là ở k lớn hệ thống lấp gần kín các vị trí đúng có thể có. Đây là lý do nên báo cáo kèm trần Precision (hoặc dùng thêm MAP/nDCG) để tránh hiểu nhầm “Precision thấp = hệ thống kém”.</w:t>
       </w:r>
     </w:p>
     <w:p>
@@ -6105,7 +6218,7 @@
           <w:i w:val="0"/>
           <w:sz w:val="26"/>
         </w:rPr>
-        <w:t>Toàn bộ hệ thống vận hành trên CPU với 16GB RAM. Các mốc thời gian đo được trên bộ câu hỏi: lập chỉ mục embedding đạt khoảng 7,7 đoạn/giây (toàn corpus 367.462 đoạn mất khoảng 13 giờ, chạy nền và có khả năng resume); thời gian truy xuất trung bình (gồm cả bước reranker) khoảng 9 giây/câu; thời gian sinh câu trả lời trung bình khoảng 52 giây/câu (dao động 31–113 giây tùy độ dài). Mức thời gian này chấp nhận được cho mục đích tra cứu tham khảo, dù chưa đạt thời gian thực; có thể rút ngắn đáng kể nếu triển khai trên GPU. Việc lượng tử hóa GGUF Q4 là yếu tố then chốt giúp mô hình 3,7 tỷ tham số chạy được trong giới hạn 16GB RAM.</w:t>
+        <w:t>Toàn bộ hệ thống vận hành trên CPU với 16GB RAM. Các mốc thời gian đo được trên bộ câu hỏi: lập chỉ mục embedding đạt khoảng 7,7 đoạn/giây (toàn corpus 367.462 đoạn mất khoảng 13 giờ, chạy nền và có khả năng resume); thời gian truy xuất trung bình (gồm cả bước reranker) khoảng 7,4 giây/câu; thời gian sinh câu trả lời trung bình khoảng 45 giây/câu. Mức thời gian này chấp nhận được cho mục đích tra cứu tham khảo, dù chưa đạt thời gian thực; có thể rút ngắn đáng kể nếu triển khai trên GPU. Việc lượng tử hóa GGUF Q4 là yếu tố then chốt giúp mô hình 3,7 tỷ tham số chạy được trong giới hạn 16GB RAM.</w:t>
       </w:r>
     </w:p>
     <w:p>
@@ -6326,7 +6439,7 @@
           <w:i w:val="0"/>
           <w:sz w:val="26"/>
         </w:rPr>
-        <w:t>Bộ câu hỏi đánh giá còn nhỏ (18 câu) và ground-truth do tác giả xây dựng; nên mở rộng quy mô và có chuyên gia pháp lý thẩm định.</w:t>
+        <w:t>Bộ câu hỏi đánh giá gồm 50 câu do tác giả xây dựng; tuy đã đủ lớn để cho kết quả ổn định, vẫn nên tiếp tục mở rộng và có chuyên gia pháp lý thẩm định ground-truth.</w:t>
       </w:r>
     </w:p>
     <w:p>

</xml_diff>

<commit_message>
Quét P/R/F1 dải k=1..10 (50 câu): phát hiện F1 cực đại tại k=2; biểu đồ pr_sweep + trần Precision; phân tích so sánh chi tiết vào báo cáo
</commit_message>
<xml_diff>
--- a/report/BaoCao_RAG_DATN.docx
+++ b/report/BaoCao_RAG_DATN.docx
@@ -5588,7 +5588,7 @@
           <w:i w:val="0"/>
           <w:sz w:val="24"/>
         </w:rPr>
-        <w:t>Bảng 4.3. Precision/Recall/F1 theo số nguồn k (kèm trần Precision)</w:t>
+        <w:t>Bảng 4.3. Precision/Recall/F1 theo số nguồn k = 1..10 (kèm trần Precision)</w:t>
       </w:r>
     </w:p>
     <w:tbl>
@@ -5780,7 +5780,7 @@
                 <w:i w:val="0"/>
                 <w:sz w:val="24"/>
               </w:rPr>
-              <w:t>0,440</w:t>
+              <w:t>0,441</w:t>
             </w:r>
           </w:p>
         </w:tc>
@@ -5800,6 +5800,103 @@
                 <w:sz w:val="24"/>
               </w:rPr>
               <w:t>1,000</w:t>
+            </w:r>
+          </w:p>
+        </w:tc>
+      </w:tr>
+      <w:tr>
+        <w:tc>
+          <w:tcPr>
+            <w:tcW w:type="dxa" w:w="1814"/>
+          </w:tcPr>
+          <w:p>
+            <w:pPr>
+              <w:jc w:val="left"/>
+            </w:pPr>
+            <w:r>
+              <w:rPr>
+                <w:rFonts w:ascii="Times New Roman" w:hAnsi="Times New Roman" w:cs="Times New Roman"/>
+                <w:b w:val="0"/>
+                <w:i w:val="0"/>
+                <w:sz w:val="24"/>
+              </w:rPr>
+              <w:t>2</w:t>
+            </w:r>
+          </w:p>
+        </w:tc>
+        <w:tc>
+          <w:tcPr>
+            <w:tcW w:type="dxa" w:w="1814"/>
+          </w:tcPr>
+          <w:p>
+            <w:pPr>
+              <w:jc w:val="center"/>
+            </w:pPr>
+            <w:r>
+              <w:rPr>
+                <w:rFonts w:ascii="Times New Roman" w:hAnsi="Times New Roman" w:cs="Times New Roman"/>
+                <w:b w:val="0"/>
+                <w:i w:val="0"/>
+                <w:sz w:val="24"/>
+              </w:rPr>
+              <w:t>0,460</w:t>
+            </w:r>
+          </w:p>
+        </w:tc>
+        <w:tc>
+          <w:tcPr>
+            <w:tcW w:type="dxa" w:w="1814"/>
+          </w:tcPr>
+          <w:p>
+            <w:pPr>
+              <w:jc w:val="center"/>
+            </w:pPr>
+            <w:r>
+              <w:rPr>
+                <w:rFonts w:ascii="Times New Roman" w:hAnsi="Times New Roman" w:cs="Times New Roman"/>
+                <w:b w:val="0"/>
+                <w:i w:val="0"/>
+                <w:sz w:val="24"/>
+              </w:rPr>
+              <w:t>0,552</w:t>
+            </w:r>
+          </w:p>
+        </w:tc>
+        <w:tc>
+          <w:tcPr>
+            <w:tcW w:type="dxa" w:w="1814"/>
+          </w:tcPr>
+          <w:p>
+            <w:pPr>
+              <w:jc w:val="center"/>
+            </w:pPr>
+            <w:r>
+              <w:rPr>
+                <w:rFonts w:ascii="Times New Roman" w:hAnsi="Times New Roman" w:cs="Times New Roman"/>
+                <w:b w:val="0"/>
+                <w:i w:val="0"/>
+                <w:sz w:val="24"/>
+              </w:rPr>
+              <w:t>0,502</w:t>
+            </w:r>
+          </w:p>
+        </w:tc>
+        <w:tc>
+          <w:tcPr>
+            <w:tcW w:type="dxa" w:w="1814"/>
+          </w:tcPr>
+          <w:p>
+            <w:pPr>
+              <w:jc w:val="center"/>
+            </w:pPr>
+            <w:r>
+              <w:rPr>
+                <w:rFonts w:ascii="Times New Roman" w:hAnsi="Times New Roman" w:cs="Times New Roman"/>
+                <w:b w:val="0"/>
+                <w:i w:val="0"/>
+                <w:sz w:val="24"/>
+              </w:rPr>
+              <w:t>0,980</w:t>
             </w:r>
           </w:p>
         </w:tc>
@@ -5917,6 +6014,103 @@
                 <w:i w:val="0"/>
                 <w:sz w:val="24"/>
               </w:rPr>
+              <w:t>4</w:t>
+            </w:r>
+          </w:p>
+        </w:tc>
+        <w:tc>
+          <w:tcPr>
+            <w:tcW w:type="dxa" w:w="1814"/>
+          </w:tcPr>
+          <w:p>
+            <w:pPr>
+              <w:jc w:val="center"/>
+            </w:pPr>
+            <w:r>
+              <w:rPr>
+                <w:rFonts w:ascii="Times New Roman" w:hAnsi="Times New Roman" w:cs="Times New Roman"/>
+                <w:b w:val="0"/>
+                <w:i w:val="0"/>
+                <w:sz w:val="24"/>
+              </w:rPr>
+              <w:t>0,295</w:t>
+            </w:r>
+          </w:p>
+        </w:tc>
+        <w:tc>
+          <w:tcPr>
+            <w:tcW w:type="dxa" w:w="1814"/>
+          </w:tcPr>
+          <w:p>
+            <w:pPr>
+              <w:jc w:val="center"/>
+            </w:pPr>
+            <w:r>
+              <w:rPr>
+                <w:rFonts w:ascii="Times New Roman" w:hAnsi="Times New Roman" w:cs="Times New Roman"/>
+                <w:b w:val="0"/>
+                <w:i w:val="0"/>
+                <w:sz w:val="24"/>
+              </w:rPr>
+              <w:t>0,678</w:t>
+            </w:r>
+          </w:p>
+        </w:tc>
+        <w:tc>
+          <w:tcPr>
+            <w:tcW w:type="dxa" w:w="1814"/>
+          </w:tcPr>
+          <w:p>
+            <w:pPr>
+              <w:jc w:val="center"/>
+            </w:pPr>
+            <w:r>
+              <w:rPr>
+                <w:rFonts w:ascii="Times New Roman" w:hAnsi="Times New Roman" w:cs="Times New Roman"/>
+                <w:b w:val="0"/>
+                <w:i w:val="0"/>
+                <w:sz w:val="24"/>
+              </w:rPr>
+              <w:t>0,411</w:t>
+            </w:r>
+          </w:p>
+        </w:tc>
+        <w:tc>
+          <w:tcPr>
+            <w:tcW w:type="dxa" w:w="1814"/>
+          </w:tcPr>
+          <w:p>
+            <w:pPr>
+              <w:jc w:val="center"/>
+            </w:pPr>
+            <w:r>
+              <w:rPr>
+                <w:rFonts w:ascii="Times New Roman" w:hAnsi="Times New Roman" w:cs="Times New Roman"/>
+                <w:b w:val="0"/>
+                <w:i w:val="0"/>
+                <w:sz w:val="24"/>
+              </w:rPr>
+              <w:t>0,490</w:t>
+            </w:r>
+          </w:p>
+        </w:tc>
+      </w:tr>
+      <w:tr>
+        <w:tc>
+          <w:tcPr>
+            <w:tcW w:type="dxa" w:w="1814"/>
+          </w:tcPr>
+          <w:p>
+            <w:pPr>
+              <w:jc w:val="left"/>
+            </w:pPr>
+            <w:r>
+              <w:rPr>
+                <w:rFonts w:ascii="Times New Roman" w:hAnsi="Times New Roman" w:cs="Times New Roman"/>
+                <w:b w:val="0"/>
+                <w:i w:val="0"/>
+                <w:sz w:val="24"/>
+              </w:rPr>
               <w:t>5</w:t>
             </w:r>
           </w:p>
@@ -5994,6 +6188,394 @@
                 <w:sz w:val="24"/>
               </w:rPr>
               <w:t>0,392</w:t>
+            </w:r>
+          </w:p>
+        </w:tc>
+      </w:tr>
+      <w:tr>
+        <w:tc>
+          <w:tcPr>
+            <w:tcW w:type="dxa" w:w="1814"/>
+          </w:tcPr>
+          <w:p>
+            <w:pPr>
+              <w:jc w:val="left"/>
+            </w:pPr>
+            <w:r>
+              <w:rPr>
+                <w:rFonts w:ascii="Times New Roman" w:hAnsi="Times New Roman" w:cs="Times New Roman"/>
+                <w:b w:val="0"/>
+                <w:i w:val="0"/>
+                <w:sz w:val="24"/>
+              </w:rPr>
+              <w:t>6</w:t>
+            </w:r>
+          </w:p>
+        </w:tc>
+        <w:tc>
+          <w:tcPr>
+            <w:tcW w:type="dxa" w:w="1814"/>
+          </w:tcPr>
+          <w:p>
+            <w:pPr>
+              <w:jc w:val="center"/>
+            </w:pPr>
+            <w:r>
+              <w:rPr>
+                <w:rFonts w:ascii="Times New Roman" w:hAnsi="Times New Roman" w:cs="Times New Roman"/>
+                <w:b w:val="0"/>
+                <w:i w:val="0"/>
+                <w:sz w:val="24"/>
+              </w:rPr>
+              <w:t>0,213</w:t>
+            </w:r>
+          </w:p>
+        </w:tc>
+        <w:tc>
+          <w:tcPr>
+            <w:tcW w:type="dxa" w:w="1814"/>
+          </w:tcPr>
+          <w:p>
+            <w:pPr>
+              <w:jc w:val="center"/>
+            </w:pPr>
+            <w:r>
+              <w:rPr>
+                <w:rFonts w:ascii="Times New Roman" w:hAnsi="Times New Roman" w:cs="Times New Roman"/>
+                <w:b w:val="0"/>
+                <w:i w:val="0"/>
+                <w:sz w:val="24"/>
+              </w:rPr>
+              <w:t>0,713</w:t>
+            </w:r>
+          </w:p>
+        </w:tc>
+        <w:tc>
+          <w:tcPr>
+            <w:tcW w:type="dxa" w:w="1814"/>
+          </w:tcPr>
+          <w:p>
+            <w:pPr>
+              <w:jc w:val="center"/>
+            </w:pPr>
+            <w:r>
+              <w:rPr>
+                <w:rFonts w:ascii="Times New Roman" w:hAnsi="Times New Roman" w:cs="Times New Roman"/>
+                <w:b w:val="0"/>
+                <w:i w:val="0"/>
+                <w:sz w:val="24"/>
+              </w:rPr>
+              <w:t>0,328</w:t>
+            </w:r>
+          </w:p>
+        </w:tc>
+        <w:tc>
+          <w:tcPr>
+            <w:tcW w:type="dxa" w:w="1814"/>
+          </w:tcPr>
+          <w:p>
+            <w:pPr>
+              <w:jc w:val="center"/>
+            </w:pPr>
+            <w:r>
+              <w:rPr>
+                <w:rFonts w:ascii="Times New Roman" w:hAnsi="Times New Roman" w:cs="Times New Roman"/>
+                <w:b w:val="0"/>
+                <w:i w:val="0"/>
+                <w:sz w:val="24"/>
+              </w:rPr>
+              <w:t>0,327</w:t>
+            </w:r>
+          </w:p>
+        </w:tc>
+      </w:tr>
+      <w:tr>
+        <w:tc>
+          <w:tcPr>
+            <w:tcW w:type="dxa" w:w="1814"/>
+          </w:tcPr>
+          <w:p>
+            <w:pPr>
+              <w:jc w:val="left"/>
+            </w:pPr>
+            <w:r>
+              <w:rPr>
+                <w:rFonts w:ascii="Times New Roman" w:hAnsi="Times New Roman" w:cs="Times New Roman"/>
+                <w:b w:val="0"/>
+                <w:i w:val="0"/>
+                <w:sz w:val="24"/>
+              </w:rPr>
+              <w:t>7</w:t>
+            </w:r>
+          </w:p>
+        </w:tc>
+        <w:tc>
+          <w:tcPr>
+            <w:tcW w:type="dxa" w:w="1814"/>
+          </w:tcPr>
+          <w:p>
+            <w:pPr>
+              <w:jc w:val="center"/>
+            </w:pPr>
+            <w:r>
+              <w:rPr>
+                <w:rFonts w:ascii="Times New Roman" w:hAnsi="Times New Roman" w:cs="Times New Roman"/>
+                <w:b w:val="0"/>
+                <w:i w:val="0"/>
+                <w:sz w:val="24"/>
+              </w:rPr>
+              <w:t>0,189</w:t>
+            </w:r>
+          </w:p>
+        </w:tc>
+        <w:tc>
+          <w:tcPr>
+            <w:tcW w:type="dxa" w:w="1814"/>
+          </w:tcPr>
+          <w:p>
+            <w:pPr>
+              <w:jc w:val="center"/>
+            </w:pPr>
+            <w:r>
+              <w:rPr>
+                <w:rFonts w:ascii="Times New Roman" w:hAnsi="Times New Roman" w:cs="Times New Roman"/>
+                <w:b w:val="0"/>
+                <w:i w:val="0"/>
+                <w:sz w:val="24"/>
+              </w:rPr>
+              <w:t>0,728</w:t>
+            </w:r>
+          </w:p>
+        </w:tc>
+        <w:tc>
+          <w:tcPr>
+            <w:tcW w:type="dxa" w:w="1814"/>
+          </w:tcPr>
+          <w:p>
+            <w:pPr>
+              <w:jc w:val="center"/>
+            </w:pPr>
+            <w:r>
+              <w:rPr>
+                <w:rFonts w:ascii="Times New Roman" w:hAnsi="Times New Roman" w:cs="Times New Roman"/>
+                <w:b w:val="0"/>
+                <w:i w:val="0"/>
+                <w:sz w:val="24"/>
+              </w:rPr>
+              <w:t>0,300</w:t>
+            </w:r>
+          </w:p>
+        </w:tc>
+        <w:tc>
+          <w:tcPr>
+            <w:tcW w:type="dxa" w:w="1814"/>
+          </w:tcPr>
+          <w:p>
+            <w:pPr>
+              <w:jc w:val="center"/>
+            </w:pPr>
+            <w:r>
+              <w:rPr>
+                <w:rFonts w:ascii="Times New Roman" w:hAnsi="Times New Roman" w:cs="Times New Roman"/>
+                <w:b w:val="0"/>
+                <w:i w:val="0"/>
+                <w:sz w:val="24"/>
+              </w:rPr>
+              <w:t>0,280</w:t>
+            </w:r>
+          </w:p>
+        </w:tc>
+      </w:tr>
+      <w:tr>
+        <w:tc>
+          <w:tcPr>
+            <w:tcW w:type="dxa" w:w="1814"/>
+          </w:tcPr>
+          <w:p>
+            <w:pPr>
+              <w:jc w:val="left"/>
+            </w:pPr>
+            <w:r>
+              <w:rPr>
+                <w:rFonts w:ascii="Times New Roman" w:hAnsi="Times New Roman" w:cs="Times New Roman"/>
+                <w:b w:val="0"/>
+                <w:i w:val="0"/>
+                <w:sz w:val="24"/>
+              </w:rPr>
+              <w:t>8</w:t>
+            </w:r>
+          </w:p>
+        </w:tc>
+        <w:tc>
+          <w:tcPr>
+            <w:tcW w:type="dxa" w:w="1814"/>
+          </w:tcPr>
+          <w:p>
+            <w:pPr>
+              <w:jc w:val="center"/>
+            </w:pPr>
+            <w:r>
+              <w:rPr>
+                <w:rFonts w:ascii="Times New Roman" w:hAnsi="Times New Roman" w:cs="Times New Roman"/>
+                <w:b w:val="0"/>
+                <w:i w:val="0"/>
+                <w:sz w:val="24"/>
+              </w:rPr>
+              <w:t>0,170</w:t>
+            </w:r>
+          </w:p>
+        </w:tc>
+        <w:tc>
+          <w:tcPr>
+            <w:tcW w:type="dxa" w:w="1814"/>
+          </w:tcPr>
+          <w:p>
+            <w:pPr>
+              <w:jc w:val="center"/>
+            </w:pPr>
+            <w:r>
+              <w:rPr>
+                <w:rFonts w:ascii="Times New Roman" w:hAnsi="Times New Roman" w:cs="Times New Roman"/>
+                <w:b w:val="0"/>
+                <w:i w:val="0"/>
+                <w:sz w:val="24"/>
+              </w:rPr>
+              <w:t>0,748</w:t>
+            </w:r>
+          </w:p>
+        </w:tc>
+        <w:tc>
+          <w:tcPr>
+            <w:tcW w:type="dxa" w:w="1814"/>
+          </w:tcPr>
+          <w:p>
+            <w:pPr>
+              <w:jc w:val="center"/>
+            </w:pPr>
+            <w:r>
+              <w:rPr>
+                <w:rFonts w:ascii="Times New Roman" w:hAnsi="Times New Roman" w:cs="Times New Roman"/>
+                <w:b w:val="0"/>
+                <w:i w:val="0"/>
+                <w:sz w:val="24"/>
+              </w:rPr>
+              <w:t>0,277</w:t>
+            </w:r>
+          </w:p>
+        </w:tc>
+        <w:tc>
+          <w:tcPr>
+            <w:tcW w:type="dxa" w:w="1814"/>
+          </w:tcPr>
+          <w:p>
+            <w:pPr>
+              <w:jc w:val="center"/>
+            </w:pPr>
+            <w:r>
+              <w:rPr>
+                <w:rFonts w:ascii="Times New Roman" w:hAnsi="Times New Roman" w:cs="Times New Roman"/>
+                <w:b w:val="0"/>
+                <w:i w:val="0"/>
+                <w:sz w:val="24"/>
+              </w:rPr>
+              <w:t>0,245</w:t>
+            </w:r>
+          </w:p>
+        </w:tc>
+      </w:tr>
+      <w:tr>
+        <w:tc>
+          <w:tcPr>
+            <w:tcW w:type="dxa" w:w="1814"/>
+          </w:tcPr>
+          <w:p>
+            <w:pPr>
+              <w:jc w:val="left"/>
+            </w:pPr>
+            <w:r>
+              <w:rPr>
+                <w:rFonts w:ascii="Times New Roman" w:hAnsi="Times New Roman" w:cs="Times New Roman"/>
+                <w:b w:val="0"/>
+                <w:i w:val="0"/>
+                <w:sz w:val="24"/>
+              </w:rPr>
+              <w:t>9</w:t>
+            </w:r>
+          </w:p>
+        </w:tc>
+        <w:tc>
+          <w:tcPr>
+            <w:tcW w:type="dxa" w:w="1814"/>
+          </w:tcPr>
+          <w:p>
+            <w:pPr>
+              <w:jc w:val="center"/>
+            </w:pPr>
+            <w:r>
+              <w:rPr>
+                <w:rFonts w:ascii="Times New Roman" w:hAnsi="Times New Roman" w:cs="Times New Roman"/>
+                <w:b w:val="0"/>
+                <w:i w:val="0"/>
+                <w:sz w:val="24"/>
+              </w:rPr>
+              <w:t>0,151</w:t>
+            </w:r>
+          </w:p>
+        </w:tc>
+        <w:tc>
+          <w:tcPr>
+            <w:tcW w:type="dxa" w:w="1814"/>
+          </w:tcPr>
+          <w:p>
+            <w:pPr>
+              <w:jc w:val="center"/>
+            </w:pPr>
+            <w:r>
+              <w:rPr>
+                <w:rFonts w:ascii="Times New Roman" w:hAnsi="Times New Roman" w:cs="Times New Roman"/>
+                <w:b w:val="0"/>
+                <w:i w:val="0"/>
+                <w:sz w:val="24"/>
+              </w:rPr>
+              <w:t>0,748</w:t>
+            </w:r>
+          </w:p>
+        </w:tc>
+        <w:tc>
+          <w:tcPr>
+            <w:tcW w:type="dxa" w:w="1814"/>
+          </w:tcPr>
+          <w:p>
+            <w:pPr>
+              <w:jc w:val="center"/>
+            </w:pPr>
+            <w:r>
+              <w:rPr>
+                <w:rFonts w:ascii="Times New Roman" w:hAnsi="Times New Roman" w:cs="Times New Roman"/>
+                <w:b w:val="0"/>
+                <w:i w:val="0"/>
+                <w:sz w:val="24"/>
+              </w:rPr>
+              <w:t>0,251</w:t>
+            </w:r>
+          </w:p>
+        </w:tc>
+        <w:tc>
+          <w:tcPr>
+            <w:tcW w:type="dxa" w:w="1814"/>
+          </w:tcPr>
+          <w:p>
+            <w:pPr>
+              <w:jc w:val="center"/>
+            </w:pPr>
+            <w:r>
+              <w:rPr>
+                <w:rFonts w:ascii="Times New Roman" w:hAnsi="Times New Roman" w:cs="Times New Roman"/>
+                <w:b w:val="0"/>
+                <w:i w:val="0"/>
+                <w:sz w:val="24"/>
+              </w:rPr>
+              <w:t>0,218</w:t>
             </w:r>
           </w:p>
         </w:tc>
@@ -6109,7 +6691,7 @@
       <w:r>
         <w:drawing>
           <wp:inline xmlns:a="http://schemas.openxmlformats.org/drawingml/2006/main" xmlns:pic="http://schemas.openxmlformats.org/drawingml/2006/picture">
-            <wp:extent cx="4680000" cy="2808000"/>
+            <wp:extent cx="5040000" cy="2964706"/>
             <wp:docPr id="6" name="Picture 6"/>
             <wp:cNvGraphicFramePr>
               <a:graphicFrameLocks noChangeAspect="1"/>
@@ -6118,7 +6700,7 @@
               <a:graphicData uri="http://schemas.openxmlformats.org/drawingml/2006/picture">
                 <pic:pic>
                   <pic:nvPicPr>
-                    <pic:cNvPr id="0" name="precision_recall_k.png"/>
+                    <pic:cNvPr id="0" name="pr_sweep.png"/>
                     <pic:cNvPicPr/>
                   </pic:nvPicPr>
                   <pic:blipFill>
@@ -6130,7 +6712,7 @@
                   <pic:spPr>
                     <a:xfrm>
                       <a:off x="0" y="0"/>
-                      <a:ext cx="4680000" cy="2808000"/>
+                      <a:ext cx="5040000" cy="2964706"/>
                     </a:xfrm>
                     <a:prstGeom prst="rect"/>
                   </pic:spPr>
@@ -6153,7 +6735,7 @@
           <w:i w:val="0"/>
           <w:sz w:val="24"/>
         </w:rPr>
-        <w:t>Hình 4.2. Precision/Recall/F1 theo số nguồn k</w:t>
+        <w:t>Hình 4.2. Precision/Recall/F1 và trần Precision theo số nguồn k</w:t>
       </w:r>
     </w:p>
     <w:p>
@@ -6169,7 +6751,7 @@
           <w:i w:val="0"/>
           <w:sz w:val="26"/>
         </w:rPr>
-        <w:t>Kết quả thể hiện rõ đánh đổi kinh điển: khi k tăng, Recall tăng (0,363 → 0,778) nhưng Precision giảm (0,560 → 0,140). F1 đạt cực đại tại k = 3 (0,459), cho thấy lấy khoảng 3–5 nguồn là cân bằng tốt giữa độ phủ và độ chính xác — phù hợp để truyền vào mô hình sinh mà không làm loãng ngữ cảnh; hệ thống đặt mặc định k = 5.</w:t>
+        <w:t>Quét chi tiết k = 1..10 (Hình 4.2) thể hiện rõ đánh đổi kinh điển: khi k tăng, Recall tăng đều (0,363 → 0,778) trong khi Precision giảm (0,560 → 0,140). F1 — trung bình điều hòa của hai đại lượng — đạt cực đại tại k = 2 (0,502); việc quét thô trước đây (chỉ k = 1, 3, 5, 10) đã bỏ sót điểm cực đại này, cho thấy giá trị của khảo sát dải k mịn.</w:t>
       </w:r>
     </w:p>
     <w:p>
@@ -6185,7 +6767,23 @@
           <w:i w:val="0"/>
           <w:sz w:val="26"/>
         </w:rPr>
-        <w:t>Cần lưu ý một điểm phương pháp quan trọng: do mỗi câu hỏi chỉ có trung bình 1,96 văn bản liên quan, Precision bị chặn trần về mặt toán học bởi trần P@k = min(|liên quan|, k)/k (cột cuối Bảng 4.3). Vì vậy việc Precision giảm khi k tăng phần lớn là do trần giảm, không phải do truy xuất kém đi. Bằng chứng: tỷ lệ Precision đạt được so với trần lại TĂNG theo k (từ 56% ở k=1 lên 71% ở k=10), nghĩa là ở k lớn hệ thống lấp gần kín các vị trí đúng có thể có. Đây là lý do nên báo cáo kèm trần Precision (hoặc dùng thêm MAP/nDCG) để tránh hiểu nhầm “Precision thấp = hệ thống kém”.</w:t>
+        <w:t>So sánh ba thông số: Precision phản ánh độ “sạch” (ít nhiễu) còn Recall phản ánh độ “phủ” (ít bỏ sót); F1 cân bằng hai mặt. Vùng k = 2–3 cho F1 cao nhất nên tối ưu nếu ưu tiên độ chính xác của tập nguồn. Tuy nhiên, với bài toán sinh câu trả lời, việc cung cấp thêm ngữ cảnh (Recall cao hơn) thường có lợi cho LLM; vì vậy hệ thống chọn k = 5 làm mặc định — nơi Recall đã đạt ~0,69 mà ngữ cảnh chưa quá loãng. Đây là sự phân biệt giữa “k tối ưu cho truy xuất” (k≈2) và “k phù hợp cho sinh” (k≈5).</w:t>
+      </w:r>
+    </w:p>
+    <w:p>
+      <w:pPr>
+        <w:spacing w:line="360" w:lineRule="auto" w:after="120"/>
+        <w:ind w:firstLine="567"/>
+        <w:jc w:val="both"/>
+      </w:pPr>
+      <w:r>
+        <w:rPr>
+          <w:rFonts w:ascii="Times New Roman" w:hAnsi="Times New Roman" w:cs="Times New Roman"/>
+          <w:b w:val="0"/>
+          <w:i w:val="0"/>
+          <w:sz w:val="26"/>
+        </w:rPr>
+        <w:t>Một điểm phương pháp quan trọng: do mỗi câu chỉ có trung bình 1,96 văn bản liên quan, Precision bị chặn bởi trần P@k = min(|liên quan|, k)/k (đường nét đứt, Hình 4.2). Do đó Precision giảm theo k chủ yếu là hệ quả của trần giảm, không phải truy xuất kém đi — bằng chứng là tỷ lệ Precision đạt được so với trần lại TĂNG theo k (từ 56% ở k=1 lên 71% ở k=10). Khuyến nghị: khi báo cáo Precision trong miền có ít văn bản liên quan, nên trình bày kèm trần Precision hoặc dùng thêm MAP/nDCG để tránh hiểu nhầm.</w:t>
       </w:r>
     </w:p>
     <w:p>

</xml_diff>

<commit_message>
Mở rộng bộ câu hỏi vàng lên 200 câu (50 tay + 150 sinh từ tiêu đề Điều); đánh giá lại 5 cấu hình + P/R sweep; cập nhật báo cáo, README, biểu đồ, results
</commit_message>
<xml_diff>
--- a/report/BaoCao_RAG_DATN.docx
+++ b/report/BaoCao_RAG_DATN.docx
@@ -4011,7 +4011,7 @@
           <w:i w:val="0"/>
           <w:sz w:val="26"/>
         </w:rPr>
-        <w:t>Bộ đánh giá gồm 50 câu hỏi tiếng Việt bao phủ nhiều luật y tế trọng yếu (Khám bệnh chữa bệnh, Dược, An toàn thực phẩm, Bảo hiểm y tế, phòng chống tác hại thuốc lá/rượu bia, hiến mô tạng, HIV/AIDS, phòng bệnh). Mỗi câu hỏi được gán nhãn “văn bản liên quan” (ground-truth) là (các) luật điều chỉnh nội dung câu hỏi (trung bình 1,96 văn bản/câu). Đặc biệt, nhãn được bổ sung các Văn bản hợp nhất (VBHN) tương đương — ví dụ 39/VBHN-VPQH là bản hợp nhất Luật Dược — vì chúng có cùng nội dung luật nhưng khác số hiệu. Chỉ mục dùng toàn bộ 367.462 đoạn. Các độ đo là Hit@k, MRR (Mục 1.7) và Precision/Recall/F1@k.</w:t>
+        <w:t>Bộ đánh giá gồm 200 câu hỏi tiếng Việt bao phủ nhiều luật y tế trọng yếu (Khám bệnh chữa bệnh, Dược, An toàn thực phẩm, Bảo hiểm y tế, phòng chống tác hại thuốc lá/rượu bia, hiến mô tạng, HIV/AIDS, phòng bệnh). Trong đó 50 câu được soạn thủ công và 150 câu được sinh tự động từ tiêu đề các “Điều” thật trong từng luật rồi đặt thành câu hỏi (ground-truth = số hiệu luật chứa Điều đó). Mỗi câu được gán nhãn “văn bản liên quan” là (các) luật điều chỉnh (trung bình 2 văn bản/câu), bổ sung các Văn bản hợp nhất (VBHN) tương đương — ví dụ 39/VBHN-VPQH là bản hợp nhất Luật Dược. Chỉ mục dùng toàn bộ 367.462 đoạn. Các độ đo là Hit@k, MRR (Mục 1.7) và Precision/Recall/F1@k.</w:t>
       </w:r>
     </w:p>
     <w:p>
@@ -4043,7 +4043,7 @@
           <w:i w:val="0"/>
           <w:sz w:val="24"/>
         </w:rPr>
-        <w:t>Bảng 4.1. So sánh các cấu hình truy xuất (50 câu hỏi)</w:t>
+        <w:t>Bảng 4.1. So sánh các cấu hình truy xuất (200 câu hỏi)</w:t>
       </w:r>
     </w:p>
     <w:tbl>
@@ -4218,7 +4218,7 @@
                 <w:i w:val="0"/>
                 <w:sz w:val="24"/>
               </w:rPr>
-              <w:t>0,380</w:t>
+              <w:t>0,490</w:t>
             </w:r>
           </w:p>
         </w:tc>
@@ -4237,7 +4237,7 @@
                 <w:i w:val="0"/>
                 <w:sz w:val="24"/>
               </w:rPr>
-              <w:t>0,640</w:t>
+              <w:t>0,680</w:t>
             </w:r>
           </w:p>
         </w:tc>
@@ -4256,7 +4256,7 @@
                 <w:i w:val="0"/>
                 <w:sz w:val="24"/>
               </w:rPr>
-              <w:t>0,720</w:t>
+              <w:t>0,760</w:t>
             </w:r>
           </w:p>
         </w:tc>
@@ -4275,7 +4275,7 @@
                 <w:i w:val="0"/>
                 <w:sz w:val="24"/>
               </w:rPr>
-              <w:t>0,840</w:t>
+              <w:t>0,810</w:t>
             </w:r>
           </w:p>
         </w:tc>
@@ -4294,7 +4294,7 @@
                 <w:i w:val="0"/>
                 <w:sz w:val="24"/>
               </w:rPr>
-              <w:t>0,534</w:t>
+              <w:t>0,600</w:t>
             </w:r>
           </w:p>
         </w:tc>
@@ -4334,7 +4334,7 @@
                 <w:i w:val="0"/>
                 <w:sz w:val="24"/>
               </w:rPr>
-              <w:t>0,520</w:t>
+              <w:t>0,595</w:t>
             </w:r>
           </w:p>
         </w:tc>
@@ -4353,7 +4353,7 @@
                 <w:i w:val="0"/>
                 <w:sz w:val="24"/>
               </w:rPr>
-              <w:t>0,820</w:t>
+              <w:t>0,800</w:t>
             </w:r>
           </w:p>
         </w:tc>
@@ -4372,7 +4372,7 @@
                 <w:i w:val="0"/>
                 <w:sz w:val="24"/>
               </w:rPr>
-              <w:t>0,860</w:t>
+              <w:t>0,845</w:t>
             </w:r>
           </w:p>
         </w:tc>
@@ -4391,7 +4391,7 @@
                 <w:i w:val="0"/>
                 <w:sz w:val="24"/>
               </w:rPr>
-              <w:t>0,920</w:t>
+              <w:t>0,885</w:t>
             </w:r>
           </w:p>
         </w:tc>
@@ -4410,7 +4410,7 @@
                 <w:i w:val="0"/>
                 <w:sz w:val="24"/>
               </w:rPr>
-              <w:t>0,668</w:t>
+              <w:t>0,704</w:t>
             </w:r>
           </w:p>
         </w:tc>
@@ -4450,7 +4450,7 @@
                 <w:i w:val="0"/>
                 <w:sz w:val="24"/>
               </w:rPr>
-              <w:t>0,540</w:t>
+              <w:t>0,625</w:t>
             </w:r>
           </w:p>
         </w:tc>
@@ -4469,7 +4469,7 @@
                 <w:i w:val="0"/>
                 <w:sz w:val="24"/>
               </w:rPr>
-              <w:t>0,780</w:t>
+              <w:t>0,815</w:t>
             </w:r>
           </w:p>
         </w:tc>
@@ -4488,7 +4488,7 @@
                 <w:i w:val="0"/>
                 <w:sz w:val="24"/>
               </w:rPr>
-              <w:t>0,840</w:t>
+              <w:t>0,850</w:t>
             </w:r>
           </w:p>
         </w:tc>
@@ -4526,7 +4526,7 @@
                 <w:i w:val="0"/>
                 <w:sz w:val="24"/>
               </w:rPr>
-              <w:t>0,667</w:t>
+              <w:t>0,724</w:t>
             </w:r>
           </w:p>
         </w:tc>
@@ -4566,7 +4566,7 @@
                 <w:i w:val="0"/>
                 <w:sz w:val="24"/>
               </w:rPr>
-              <w:t>0,500</w:t>
+              <w:t>0,635</w:t>
             </w:r>
           </w:p>
         </w:tc>
@@ -4585,7 +4585,7 @@
                 <w:i w:val="0"/>
                 <w:sz w:val="24"/>
               </w:rPr>
-              <w:t>0,800</w:t>
+              <w:t>0,855</w:t>
             </w:r>
           </w:p>
         </w:tc>
@@ -4604,7 +4604,7 @@
                 <w:i w:val="0"/>
                 <w:sz w:val="24"/>
               </w:rPr>
-              <w:t>0,860</w:t>
+              <w:t>0,900</w:t>
             </w:r>
           </w:p>
         </w:tc>
@@ -4623,7 +4623,7 @@
                 <w:i w:val="0"/>
                 <w:sz w:val="24"/>
               </w:rPr>
-              <w:t>0,980</w:t>
+              <w:t>0,960</w:t>
             </w:r>
           </w:p>
         </w:tc>
@@ -4642,7 +4642,7 @@
                 <w:i w:val="0"/>
                 <w:sz w:val="24"/>
               </w:rPr>
-              <w:t>0,669</w:t>
+              <w:t>0,754</w:t>
             </w:r>
           </w:p>
         </w:tc>
@@ -4682,26 +4682,7 @@
                 <w:i w:val="0"/>
                 <w:sz w:val="24"/>
               </w:rPr>
-              <w:t>0,560</w:t>
-            </w:r>
-          </w:p>
-        </w:tc>
-        <w:tc>
-          <w:tcPr>
-            <w:tcW w:type="dxa" w:w="1512"/>
-          </w:tcPr>
-          <w:p>
-            <w:pPr>
-              <w:jc w:val="center"/>
-            </w:pPr>
-            <w:r>
-              <w:rPr>
-                <w:rFonts w:ascii="Times New Roman" w:hAnsi="Times New Roman" w:cs="Times New Roman"/>
-                <w:b w:val="0"/>
-                <w:i w:val="0"/>
-                <w:sz w:val="24"/>
-              </w:rPr>
-              <w:t>0,780</w:t>
+              <w:t>0,650</w:t>
             </w:r>
           </w:p>
         </w:tc>
@@ -4739,7 +4720,7 @@
                 <w:i w:val="0"/>
                 <w:sz w:val="24"/>
               </w:rPr>
-              <w:t>0,920</w:t>
+              <w:t>0,905</w:t>
             </w:r>
           </w:p>
         </w:tc>
@@ -4758,7 +4739,26 @@
                 <w:i w:val="0"/>
                 <w:sz w:val="24"/>
               </w:rPr>
-              <w:t>0,694</w:t>
+              <w:t>0,940</w:t>
+            </w:r>
+          </w:p>
+        </w:tc>
+        <w:tc>
+          <w:tcPr>
+            <w:tcW w:type="dxa" w:w="1512"/>
+          </w:tcPr>
+          <w:p>
+            <w:pPr>
+              <w:jc w:val="center"/>
+            </w:pPr>
+            <w:r>
+              <w:rPr>
+                <w:rFonts w:ascii="Times New Roman" w:hAnsi="Times New Roman" w:cs="Times New Roman"/>
+                <w:b w:val="0"/>
+                <w:i w:val="0"/>
+                <w:sz w:val="24"/>
+              </w:rPr>
+              <w:t>0,764</w:t>
             </w:r>
           </w:p>
         </w:tc>
@@ -4854,7 +4854,7 @@
           <w:i w:val="0"/>
           <w:sz w:val="26"/>
         </w:rPr>
-        <w:t>So sánh cấu hình (1) và (2) trong Bảng 4.1: bổ sung bước tách từ bằng pyvi nâng Hit@1 từ 0,380 lên 0,520 (tăng 0,140), Hit@3 từ 0,640 lên 0,820 (tăng 0,180) và MRR từ 0,534 lên 0,668 (tăng 0,134). Đây là cải thiện lớn nhất trong các thí nghiệm, khẳng định giả thuyết ở Mục 1.2.1: vì PhoBERT được huấn luyện trên dữ liệu đã tách từ, việc tách từ nhất quán cả khi lập chỉ mục lẫn khi truy vấn giúp embedding của câu hỏi và đoạn cùng phân phối, từ đó khớp tốt hơn. Đây là minh chứng định lượng rõ ràng cho sự cần thiết của bước tách từ.</w:t>
+        <w:t>So sánh cấu hình (1) và (2) trong Bảng 4.1: bổ sung bước tách từ bằng pyvi nâng Hit@1 từ 0,490 lên 0,595 (tăng 0,105), Hit@3 từ 0,680 lên 0,800 (tăng 0,120) và MRR từ 0,600 lên 0,704 (tăng 0,104). Đây là một trong những cải thiện lớn nhất, khẳng định giả thuyết ở Mục 1.2.1: vì PhoBERT được huấn luyện trên dữ liệu đã tách từ, việc tách từ nhất quán cả khi lập chỉ mục lẫn khi truy vấn giúp embedding của câu hỏi và đoạn cùng phân phối, từ đó khớp tốt hơn. Đây là minh chứng định lượng rõ ràng cho sự cần thiết của bước tách từ.</w:t>
       </w:r>
     </w:p>
     <w:p>
@@ -4887,7 +4887,7 @@
           <w:i w:val="0"/>
           <w:sz w:val="26"/>
         </w:rPr>
-        <w:t>So sánh (2) và (3): bộ reranker PhoRanker xếp lại 30 ứng viên đầu giúp Hit@1 tăng nhẹ (0,520 → 0,540) nhưng MRR gần như không đổi (0,668 → 0,667) và Hit@3 giảm (0,820 → 0,780). Như vậy trên bộ 50 câu, reranker dùng đơn lẻ cho lợi ích khiêm tốn. Tuy nhiên khi kết hợp với hybrid (cấu hình 5), reranker lại nâng Hit@1 lên cao nhất (0,560) và MRR lên cao nhất (0,694) — cho thấy reranker phát huy tác dụng tốt hơn khi đứng sau một tập ứng viên đa dạng từ hybrid. Cross-encoder đánh giá độ liên quan tinh tế hơn bi-encoder nhờ chú ý chéo (Mục 1.5), nhưng hiệu quả phụ thuộc chất lượng và độ đa dạng của tập ứng viên đầu vào.</w:t>
+        <w:t>So sánh (2) và (3): bộ reranker PhoRanker xếp lại 30 ứng viên đầu giúp Hit@1 tăng từ 0,595 lên 0,625 (tăng 0,030) và MRR từ 0,704 lên 0,724 (tăng 0,020). Khi kết hợp với hybrid (cấu hình 5), reranker tiếp tục nâng Hit@1 lên cao nhất (0,650) và MRR lên cao nhất (0,764). Điều này phù hợp với phân tích ở Mục 1.5: cross-encoder đọc đồng thời (câu hỏi + đoạn) nên đánh giá độ liên quan tinh tế hơn bi-encoder, đẩy được tài liệu đúng lên hạng cao. Mức cải thiện của reranker khiêm tốn hơn so với tách từ hay hybrid, và phụ thuộc chất lượng tập ứng viên đầu vào — đứng sau hybrid (tập ứng viên đa dạng hơn) thì reranker phát huy tốt hơn.</w:t>
       </w:r>
     </w:p>
     <w:p>
@@ -5475,7 +5475,7 @@
           <w:i w:val="0"/>
           <w:sz w:val="26"/>
         </w:rPr>
-        <w:t>So sánh (2), (4) và (5): hybrid BM25+vector đạt Hit@10 = 0,980 — gần như không bỏ sót, cao nhất trong các cấu hình; kết hợp thêm reranker (cấu hình 5) cho Hit@1 cao nhất (0,560) và MRR cao nhất (0,694). Quan trọng hơn về mặt định tính: với truy vấn chứa số hiệu (ví dụ “Nghị định 96/2023/NĐ-CP quy định gì?”), cơ chế hybrid kèm nhận diện số hiệu trả về đúng văn bản, trong khi vector thuần thường trượt do không nắm được chuỗi số hiệu. Đây là minh chứng rõ cho luận điểm BM25 bù đắp điểm yếu từ vựng của embedding (Mục 1.4). Tổng hợp lại, cấu hình Hybrid + Reranker được chọn cho hệ thống vì cân bằng tốt nhất giữa độ chính xác ở hạng đầu (Hit@1, MRR) và độ phủ (Hit@10).</w:t>
+        <w:t>So sánh (2), (4) và (5): hybrid BM25+vector nâng Hit@10 từ 0,885 lên 0,960 (gần như không bỏ sót) và MRR từ 0,704 lên 0,754; kết hợp thêm reranker (cấu hình 5) cho Hit@1 cao nhất (0,650) và MRR cao nhất (0,764). Quan trọng hơn về mặt định tính: với truy vấn chứa số hiệu (ví dụ “Nghị định 96/2023/NĐ-CP quy định gì?”), cơ chế hybrid kèm nhận diện số hiệu trả về đúng văn bản, trong khi vector thuần thường trượt do không nắm được chuỗi số hiệu. Đây là minh chứng rõ cho luận điểm BM25 bù đắp điểm yếu từ vựng của embedding (Mục 1.4). Tổng hợp lại, cấu hình Hybrid + Reranker được chọn cho hệ thống vì cân bằng tốt nhất giữa độ chính xác ở hạng đầu (Hit@1, MRR) và độ phủ (Hit@10).</w:t>
       </w:r>
     </w:p>
     <w:p>
@@ -5742,7 +5742,7 @@
                 <w:i w:val="0"/>
                 <w:sz w:val="24"/>
               </w:rPr>
-              <w:t>0,560</w:t>
+              <w:t>0,650</w:t>
             </w:r>
           </w:p>
         </w:tc>
@@ -5761,7 +5761,7 @@
                 <w:i w:val="0"/>
                 <w:sz w:val="24"/>
               </w:rPr>
-              <w:t>0,363</w:t>
+              <w:t>0,436</w:t>
             </w:r>
           </w:p>
         </w:tc>
@@ -5780,7 +5780,7 @@
                 <w:i w:val="0"/>
                 <w:sz w:val="24"/>
               </w:rPr>
-              <w:t>0,441</w:t>
+              <w:t>0,522</w:t>
             </w:r>
           </w:p>
         </w:tc>
@@ -5839,7 +5839,7 @@
                 <w:i w:val="0"/>
                 <w:sz w:val="24"/>
               </w:rPr>
-              <w:t>0,460</w:t>
+              <w:t>0,510</w:t>
             </w:r>
           </w:p>
         </w:tc>
@@ -5858,7 +5858,7 @@
                 <w:i w:val="0"/>
                 <w:sz w:val="24"/>
               </w:rPr>
-              <w:t>0,552</w:t>
+              <w:t>0,608</w:t>
             </w:r>
           </w:p>
         </w:tc>
@@ -5877,7 +5877,7 @@
                 <w:i w:val="0"/>
                 <w:sz w:val="24"/>
               </w:rPr>
-              <w:t>0,502</w:t>
+              <w:t>0,555</w:t>
             </w:r>
           </w:p>
         </w:tc>
@@ -5896,7 +5896,7 @@
                 <w:i w:val="0"/>
                 <w:sz w:val="24"/>
               </w:rPr>
-              <w:t>0,980</w:t>
+              <w:t>1,000</w:t>
             </w:r>
           </w:p>
         </w:tc>
@@ -5936,7 +5936,7 @@
                 <w:i w:val="0"/>
                 <w:sz w:val="24"/>
               </w:rPr>
-              <w:t>0,360</w:t>
+              <w:t>0,398</w:t>
             </w:r>
           </w:p>
         </w:tc>
@@ -5955,7 +5955,7 @@
                 <w:i w:val="0"/>
                 <w:sz w:val="24"/>
               </w:rPr>
-              <w:t>0,632</w:t>
+              <w:t>0,686</w:t>
             </w:r>
           </w:p>
         </w:tc>
@@ -5974,7 +5974,7 @@
                 <w:i w:val="0"/>
                 <w:sz w:val="24"/>
               </w:rPr>
-              <w:t>0,459</w:t>
+              <w:t>0,504</w:t>
             </w:r>
           </w:p>
         </w:tc>
@@ -5993,7 +5993,7 @@
                 <w:i w:val="0"/>
                 <w:sz w:val="24"/>
               </w:rPr>
-              <w:t>0,653</w:t>
+              <w:t>0,667</w:t>
             </w:r>
           </w:p>
         </w:tc>
@@ -6033,7 +6033,7 @@
                 <w:i w:val="0"/>
                 <w:sz w:val="24"/>
               </w:rPr>
-              <w:t>0,295</w:t>
+              <w:t>0,323</w:t>
             </w:r>
           </w:p>
         </w:tc>
@@ -6052,7 +6052,7 @@
                 <w:i w:val="0"/>
                 <w:sz w:val="24"/>
               </w:rPr>
-              <w:t>0,678</w:t>
+              <w:t>0,729</w:t>
             </w:r>
           </w:p>
         </w:tc>
@@ -6071,7 +6071,7 @@
                 <w:i w:val="0"/>
                 <w:sz w:val="24"/>
               </w:rPr>
-              <w:t>0,411</w:t>
+              <w:t>0,447</w:t>
             </w:r>
           </w:p>
         </w:tc>
@@ -6090,7 +6090,7 @@
                 <w:i w:val="0"/>
                 <w:sz w:val="24"/>
               </w:rPr>
-              <w:t>0,490</w:t>
+              <w:t>0,500</w:t>
             </w:r>
           </w:p>
         </w:tc>
@@ -6130,7 +6130,7 @@
                 <w:i w:val="0"/>
                 <w:sz w:val="24"/>
               </w:rPr>
-              <w:t>0,244</w:t>
+              <w:t>0,268</w:t>
             </w:r>
           </w:p>
         </w:tc>
@@ -6149,7 +6149,7 @@
                 <w:i w:val="0"/>
                 <w:sz w:val="24"/>
               </w:rPr>
-              <w:t>0,688</w:t>
+              <w:t>0,747</w:t>
             </w:r>
           </w:p>
         </w:tc>
@@ -6168,7 +6168,7 @@
                 <w:i w:val="0"/>
                 <w:sz w:val="24"/>
               </w:rPr>
-              <w:t>0,360</w:t>
+              <w:t>0,394</w:t>
             </w:r>
           </w:p>
         </w:tc>
@@ -6187,7 +6187,7 @@
                 <w:i w:val="0"/>
                 <w:sz w:val="24"/>
               </w:rPr>
-              <w:t>0,392</w:t>
+              <w:t>0,400</w:t>
             </w:r>
           </w:p>
         </w:tc>
@@ -6227,7 +6227,7 @@
                 <w:i w:val="0"/>
                 <w:sz w:val="24"/>
               </w:rPr>
-              <w:t>0,213</w:t>
+              <w:t>0,232</w:t>
             </w:r>
           </w:p>
         </w:tc>
@@ -6246,7 +6246,7 @@
                 <w:i w:val="0"/>
                 <w:sz w:val="24"/>
               </w:rPr>
-              <w:t>0,713</w:t>
+              <w:t>0,770</w:t>
             </w:r>
           </w:p>
         </w:tc>
@@ -6265,7 +6265,7 @@
                 <w:i w:val="0"/>
                 <w:sz w:val="24"/>
               </w:rPr>
-              <w:t>0,328</w:t>
+              <w:t>0,356</w:t>
             </w:r>
           </w:p>
         </w:tc>
@@ -6284,7 +6284,7 @@
                 <w:i w:val="0"/>
                 <w:sz w:val="24"/>
               </w:rPr>
-              <w:t>0,327</w:t>
+              <w:t>0,333</w:t>
             </w:r>
           </w:p>
         </w:tc>
@@ -6324,7 +6324,7 @@
                 <w:i w:val="0"/>
                 <w:sz w:val="24"/>
               </w:rPr>
-              <w:t>0,189</w:t>
+              <w:t>0,202</w:t>
             </w:r>
           </w:p>
         </w:tc>
@@ -6343,7 +6343,7 @@
                 <w:i w:val="0"/>
                 <w:sz w:val="24"/>
               </w:rPr>
-              <w:t>0,728</w:t>
+              <w:t>0,780</w:t>
             </w:r>
           </w:p>
         </w:tc>
@@ -6362,7 +6362,7 @@
                 <w:i w:val="0"/>
                 <w:sz w:val="24"/>
               </w:rPr>
-              <w:t>0,300</w:t>
+              <w:t>0,321</w:t>
             </w:r>
           </w:p>
         </w:tc>
@@ -6381,7 +6381,7 @@
                 <w:i w:val="0"/>
                 <w:sz w:val="24"/>
               </w:rPr>
-              <w:t>0,280</w:t>
+              <w:t>0,286</w:t>
             </w:r>
           </w:p>
         </w:tc>
@@ -6421,7 +6421,7 @@
                 <w:i w:val="0"/>
                 <w:sz w:val="24"/>
               </w:rPr>
-              <w:t>0,170</w:t>
+              <w:t>0,180</w:t>
             </w:r>
           </w:p>
         </w:tc>
@@ -6440,7 +6440,7 @@
                 <w:i w:val="0"/>
                 <w:sz w:val="24"/>
               </w:rPr>
-              <w:t>0,748</w:t>
+              <w:t>0,791</w:t>
             </w:r>
           </w:p>
         </w:tc>
@@ -6459,7 +6459,7 @@
                 <w:i w:val="0"/>
                 <w:sz w:val="24"/>
               </w:rPr>
-              <w:t>0,277</w:t>
+              <w:t>0,293</w:t>
             </w:r>
           </w:p>
         </w:tc>
@@ -6478,7 +6478,7 @@
                 <w:i w:val="0"/>
                 <w:sz w:val="24"/>
               </w:rPr>
-              <w:t>0,245</w:t>
+              <w:t>0,250</w:t>
             </w:r>
           </w:p>
         </w:tc>
@@ -6518,7 +6518,7 @@
                 <w:i w:val="0"/>
                 <w:sz w:val="24"/>
               </w:rPr>
-              <w:t>0,151</w:t>
+              <w:t>0,161</w:t>
             </w:r>
           </w:p>
         </w:tc>
@@ -6537,7 +6537,7 @@
                 <w:i w:val="0"/>
                 <w:sz w:val="24"/>
               </w:rPr>
-              <w:t>0,748</w:t>
+              <w:t>0,793</w:t>
             </w:r>
           </w:p>
         </w:tc>
@@ -6556,7 +6556,7 @@
                 <w:i w:val="0"/>
                 <w:sz w:val="24"/>
               </w:rPr>
-              <w:t>0,251</w:t>
+              <w:t>0,267</w:t>
             </w:r>
           </w:p>
         </w:tc>
@@ -6575,7 +6575,7 @@
                 <w:i w:val="0"/>
                 <w:sz w:val="24"/>
               </w:rPr>
-              <w:t>0,218</w:t>
+              <w:t>0,222</w:t>
             </w:r>
           </w:p>
         </w:tc>
@@ -6615,7 +6615,7 @@
                 <w:i w:val="0"/>
                 <w:sz w:val="24"/>
               </w:rPr>
-              <w:t>0,140</w:t>
+              <w:t>0,146</w:t>
             </w:r>
           </w:p>
         </w:tc>
@@ -6634,7 +6634,7 @@
                 <w:i w:val="0"/>
                 <w:sz w:val="24"/>
               </w:rPr>
-              <w:t>0,778</w:t>
+              <w:t>0,806</w:t>
             </w:r>
           </w:p>
         </w:tc>
@@ -6653,7 +6653,7 @@
                 <w:i w:val="0"/>
                 <w:sz w:val="24"/>
               </w:rPr>
-              <w:t>0,237</w:t>
+              <w:t>0,247</w:t>
             </w:r>
           </w:p>
         </w:tc>
@@ -6672,7 +6672,7 @@
                 <w:i w:val="0"/>
                 <w:sz w:val="24"/>
               </w:rPr>
-              <w:t>0,196</w:t>
+              <w:t>0,200</w:t>
             </w:r>
           </w:p>
         </w:tc>
@@ -6751,7 +6751,7 @@
           <w:i w:val="0"/>
           <w:sz w:val="26"/>
         </w:rPr>
-        <w:t>Quét chi tiết k = 1..10 (Hình 4.2) thể hiện rõ đánh đổi kinh điển: khi k tăng, Recall tăng đều (0,363 → 0,778) trong khi Precision giảm (0,560 → 0,140). F1 — trung bình điều hòa của hai đại lượng — đạt cực đại tại k = 2 (0,502); việc quét thô trước đây (chỉ k = 1, 3, 5, 10) đã bỏ sót điểm cực đại này, cho thấy giá trị của khảo sát dải k mịn.</w:t>
+        <w:t>Quét chi tiết k = 1..10 (Hình 4.2) thể hiện rõ đánh đổi kinh điển: khi k tăng, Recall tăng đều (0,436 → 0,806) trong khi Precision giảm (0,650 → 0,146). F1 — trung bình điều hòa của hai đại lượng — đạt cực đại tại k = 2 (0,555); việc quét thô (chỉ k = 1, 3, 5, 10) dễ bỏ sót điểm cực đại này, cho thấy giá trị của khảo sát dải k mịn.</w:t>
       </w:r>
     </w:p>
     <w:p>
@@ -6767,7 +6767,7 @@
           <w:i w:val="0"/>
           <w:sz w:val="26"/>
         </w:rPr>
-        <w:t>So sánh ba thông số: Precision phản ánh độ “sạch” (ít nhiễu) còn Recall phản ánh độ “phủ” (ít bỏ sót); F1 cân bằng hai mặt. Vùng k = 2–3 cho F1 cao nhất nên tối ưu nếu ưu tiên độ chính xác của tập nguồn. Tuy nhiên, với bài toán sinh câu trả lời, việc cung cấp thêm ngữ cảnh (Recall cao hơn) thường có lợi cho LLM; vì vậy hệ thống chọn k = 5 làm mặc định — nơi Recall đã đạt ~0,69 mà ngữ cảnh chưa quá loãng. Đây là sự phân biệt giữa “k tối ưu cho truy xuất” (k≈2) và “k phù hợp cho sinh” (k≈5).</w:t>
+        <w:t>So sánh ba thông số: Precision phản ánh độ “sạch” (ít nhiễu) còn Recall phản ánh độ “phủ” (ít bỏ sót); F1 cân bằng hai mặt. Vùng k = 2–3 cho F1 cao nhất nên tối ưu nếu ưu tiên độ chính xác của tập nguồn. Tuy nhiên, với bài toán sinh câu trả lời, việc cung cấp thêm ngữ cảnh (Recall cao hơn) thường có lợi cho LLM; vì vậy hệ thống chọn k = 5 làm mặc định — nơi Recall đã đạt ~0,75 mà ngữ cảnh chưa quá loãng. Đây là sự phân biệt giữa “k tối ưu cho truy xuất” (k≈2) và “k phù hợp cho sinh” (k≈5).</w:t>
       </w:r>
     </w:p>
     <w:p>
@@ -6783,7 +6783,7 @@
           <w:i w:val="0"/>
           <w:sz w:val="26"/>
         </w:rPr>
-        <w:t>Một điểm phương pháp quan trọng: do mỗi câu chỉ có trung bình 1,96 văn bản liên quan, Precision bị chặn bởi trần P@k = min(|liên quan|, k)/k (đường nét đứt, Hình 4.2). Do đó Precision giảm theo k chủ yếu là hệ quả của trần giảm, không phải truy xuất kém đi — bằng chứng là tỷ lệ Precision đạt được so với trần lại TĂNG theo k (từ 56% ở k=1 lên 71% ở k=10). Khuyến nghị: khi báo cáo Precision trong miền có ít văn bản liên quan, nên trình bày kèm trần Precision hoặc dùng thêm MAP/nDCG để tránh hiểu nhầm.</w:t>
+        <w:t>Một điểm phương pháp quan trọng: do mỗi câu chỉ có trung bình 2 văn bản liên quan, Precision bị chặn bởi trần P@k = min(|liên quan|, k)/k (đường nét đứt, Hình 4.2). Do đó Precision giảm theo k chủ yếu là hệ quả của trần giảm, không phải truy xuất kém đi — bằng chứng là tỷ lệ Precision đạt được so với trần lại TĂNG theo k (từ 65% ở k=1 lên 73% ở k=10). Khuyến nghị: khi báo cáo Precision trong miền có ít văn bản liên quan, nên trình bày kèm trần Precision hoặc dùng thêm MAP/nDCG để tránh hiểu nhầm.</w:t>
       </w:r>
     </w:p>
     <w:p>
@@ -7037,7 +7037,7 @@
           <w:i w:val="0"/>
           <w:sz w:val="26"/>
         </w:rPr>
-        <w:t>Bộ câu hỏi đánh giá gồm 50 câu do tác giả xây dựng; tuy đã đủ lớn để cho kết quả ổn định, vẫn nên tiếp tục mở rộng và có chuyên gia pháp lý thẩm định ground-truth.</w:t>
+        <w:t>Bộ câu hỏi đánh giá gồm 200 câu (50 soạn thủ công, 150 sinh tự động từ tiêu đề các Điều); các câu sinh tự động có thể trùng từ vựng với văn bản nguồn nên chỉ số có phần thuận lợi hơn — nên bổ sung thêm câu hỏi diễn đạt tự nhiên và có chuyên gia pháp lý thẩm định ground-truth.</w:t>
       </w:r>
     </w:p>
     <w:p>

</xml_diff>

<commit_message>
Bổ sung 30 câu hỏi diễn đạt tự nhiên (đo riêng: Hit@1 0.200 vs 0.650 — lexical gap); phiếu thẩm định chuyên gia 230 câu; mục 4.11 + cập nhật hạn chế/hướng phát triển
</commit_message>
<xml_diff>
--- a/report/BaoCao_RAG_DATN.docx
+++ b/report/BaoCao_RAG_DATN.docx
@@ -6925,6 +6925,71 @@
     </w:p>
     <w:p>
       <w:pPr>
+        <w:pStyle w:val="Heading2"/>
+        <w:keepNext/>
+        <w:spacing w:before="200" w:after="80"/>
+      </w:pPr>
+      <w:r>
+        <w:rPr>
+          <w:rFonts w:ascii="Times New Roman" w:hAnsi="Times New Roman" w:cs="Times New Roman"/>
+          <w:b/>
+          <w:i w:val="0"/>
+          <w:color w:val="000000"/>
+          <w:sz w:val="26"/>
+        </w:rPr>
+        <w:t>4.11. Thử thách với câu hỏi diễn đạt tự nhiên và thẩm định ground-truth</w:t>
+      </w:r>
+    </w:p>
+    <w:p>
+      <w:pPr>
+        <w:spacing w:line="360" w:lineRule="auto" w:after="120"/>
+        <w:ind w:firstLine="567"/>
+        <w:jc w:val="both"/>
+      </w:pPr>
+      <w:r>
+        <w:rPr>
+          <w:rFonts w:ascii="Times New Roman" w:hAnsi="Times New Roman" w:cs="Times New Roman"/>
+          <w:b w:val="0"/>
+          <w:i w:val="0"/>
+          <w:sz w:val="26"/>
+        </w:rPr>
+        <w:t>Để kiểm tra hệ thống trong điều kiện gần thực tế hơn, đề tài bổ sung 30 câu hỏi diễn đạt tự nhiên theo kiểu người dân thường hỏi, cố ý không dùng từ vựng pháp lý (ví dụ: “Tôi muốn mở quầy thuốc ở quê thì cần bằng cấp gì?”, “Uống bia rồi lái xe máy về nhà có vi phạm không?”). Kết quả trên nhóm này thấp hơn rõ rệt so với nhóm câu mẫu: Hit@1 = 0,200 (so với 0,650), Hit@10 = 0,467 (so với 0,940), MRR = 0,271 (so với 0,764).</w:t>
+      </w:r>
+    </w:p>
+    <w:p>
+      <w:pPr>
+        <w:spacing w:line="360" w:lineRule="auto" w:after="120"/>
+        <w:ind w:firstLine="567"/>
+        <w:jc w:val="both"/>
+      </w:pPr>
+      <w:r>
+        <w:rPr>
+          <w:rFonts w:ascii="Times New Roman" w:hAnsi="Times New Roman" w:cs="Times New Roman"/>
+          <w:b w:val="0"/>
+          <w:i w:val="0"/>
+          <w:sz w:val="26"/>
+        </w:rPr>
+        <w:t>Phân tích các trường hợp trượt cho thấy hai nguyên nhân. Thứ nhất là khoảng cách từ vựng (lexical gap): câu hỏi đời thường (“mở quán ăn nhỏ”, “bằng cấp”) khác xa ngôn ngữ pháp lý (“cơ sở kinh doanh dịch vụ ăn uống”, “chứng chỉ hành nghề”), khiến cả BM25 lẫn embedding khó bắc cầu. Thứ hai là tính nghiêm ngặt của ground-truth: nhiều câu top-1 trả về văn bản dưới luật rất sát nhu cầu thực tế — ví dụ câu về bác sĩ nước ngoài và yêu cầu tiếng Việt trả về Nghị định 96/2023/NĐ-CP (nghị định hướng dẫn Luật Khám bệnh, chữa bệnh), câu về bảo hiểm y tế sinh viên trả về công văn hướng dẫn của Bộ Giáo dục — đúng nội dung nhưng không trùng số hiệu luật được gán nhãn, nên bị tính trượt. Như vậy con số 0,200 là cận dưới; chất lượng cảm nhận thực tế cao hơn.</w:t>
+      </w:r>
+    </w:p>
+    <w:p>
+      <w:pPr>
+        <w:spacing w:line="360" w:lineRule="auto" w:after="120"/>
+        <w:ind w:firstLine="567"/>
+        <w:jc w:val="both"/>
+      </w:pPr>
+      <w:r>
+        <w:rPr>
+          <w:rFonts w:ascii="Times New Roman" w:hAnsi="Times New Roman" w:cs="Times New Roman"/>
+          <w:b w:val="0"/>
+          <w:i w:val="0"/>
+          <w:sz w:val="26"/>
+        </w:rPr>
+        <w:t>Phát hiện này chỉ ra hai hướng cải tiến rõ ràng: (i) bổ sung bước viết lại truy vấn (query rewriting) — chuyển câu hỏi đời thường sang ngôn ngữ pháp lý trước khi truy xuất; và (ii) mở rộng ground-truth sang cả văn bản dưới luật liên quan. Đồng thời, để bảo đảm độ tin cậy của nhãn, đề tài đã lập Phiếu thẩm định bộ câu hỏi (toàn bộ 230 câu kèm nhãn, tệp PhieuThamDinh_BoCauHoi.docx) để chuyên gia pháp lý/giảng viên hướng dẫn rà soát và xác nhận — đưa quy trình đánh giá tiến gần chuẩn mực xây dựng tập kiểm thử có thẩm định.</w:t>
+      </w:r>
+    </w:p>
+    <w:p>
+      <w:pPr>
         <w:pStyle w:val="Heading1"/>
         <w:keepNext/>
         <w:pageBreakBefore/>
@@ -7037,7 +7102,7 @@
           <w:i w:val="0"/>
           <w:sz w:val="26"/>
         </w:rPr>
-        <w:t>Bộ câu hỏi đánh giá gồm 200 câu (50 soạn thủ công, 150 sinh tự động từ tiêu đề các Điều); các câu sinh tự động có thể trùng từ vựng với văn bản nguồn nên chỉ số có phần thuận lợi hơn — nên bổ sung thêm câu hỏi diễn đạt tự nhiên và có chuyên gia pháp lý thẩm định ground-truth.</w:t>
+        <w:t>Bộ câu hỏi đánh giá gồm 230 câu (50 soạn thủ công, 150 sinh từ tiêu đề Điều, 30 diễn đạt tự nhiên); kết quả trên nhóm câu tự nhiên thấp hơn rõ rệt (Mục 4.11) cho thấy khoảng cách từ vựng đời thường–pháp lý còn là thách thức. Phiếu thẩm định ground-truth đã lập nhưng cần chuyên gia pháp lý xác nhận chính thức.</w:t>
       </w:r>
     </w:p>
     <w:p>
@@ -7099,7 +7164,22 @@
           <w:i w:val="0"/>
           <w:sz w:val="26"/>
         </w:rPr>
-        <w:t>Mở rộng và chuẩn hóa bộ đánh giá; bổ sung độ đo faithfulness/groundedness tự động.</w:t>
+        <w:t>Bổ sung bước viết lại truy vấn (query rewriting) để bắc cầu từ vựng đời thường – pháp lý, cải thiện kết quả trên câu hỏi tự nhiên.</w:t>
+      </w:r>
+    </w:p>
+    <w:p>
+      <w:pPr>
+        <w:pStyle w:val="ListBullet"/>
+        <w:spacing w:line="360" w:lineRule="auto" w:after="40"/>
+      </w:pPr>
+      <w:r>
+        <w:rPr>
+          <w:rFonts w:ascii="Times New Roman" w:hAnsi="Times New Roman" w:cs="Times New Roman"/>
+          <w:b w:val="0"/>
+          <w:i w:val="0"/>
+          <w:sz w:val="26"/>
+        </w:rPr>
+        <w:t>Hoàn tất thẩm định ground-truth với chuyên gia pháp lý; mở rộng nhãn sang văn bản dưới luật liên quan; bổ sung độ đo faithfulness/groundedness tự động.</w:t>
       </w:r>
     </w:p>
     <w:p>

</xml_diff>

<commit_message>
Thí nghiệm 6 — query rewriting bằng PhoGPT-4B: kết quả âm có giá trị (MRR 0.271→0.258, Hit@10 +0.066); định lượng nguyên nhân (15/30 giữ nguyên, 13/30 trả lời thay vì viết lại, 8/30 bịa trích dẫn); mục 4.12 + results
</commit_message>
<xml_diff>
--- a/report/BaoCao_RAG_DATN.docx
+++ b/report/BaoCao_RAG_DATN.docx
@@ -550,6 +550,21 @@
           <w:sz w:val="26"/>
         </w:rPr>
         <w:t>Bảng 4.3. Precision/Recall/F1 theo số nguồn k</w:t>
+      </w:r>
+    </w:p>
+    <w:p>
+      <w:pPr>
+        <w:spacing w:line="360" w:lineRule="auto" w:after="120"/>
+        <w:jc w:val="left"/>
+      </w:pPr>
+      <w:r>
+        <w:rPr>
+          <w:rFonts w:ascii="Times New Roman" w:hAnsi="Times New Roman" w:cs="Times New Roman"/>
+          <w:b w:val="0"/>
+          <w:i w:val="0"/>
+          <w:sz w:val="26"/>
+        </w:rPr>
+        <w:t>Bảng 4.4. Ảnh hưởng của viết lại truy vấn trên câu hỏi tự nhiên</w:t>
       </w:r>
     </w:p>
     <w:p>
@@ -6990,6 +7005,577 @@
     </w:p>
     <w:p>
       <w:pPr>
+        <w:pStyle w:val="Heading2"/>
+        <w:keepNext/>
+        <w:spacing w:before="200" w:after="80"/>
+      </w:pPr>
+      <w:r>
+        <w:rPr>
+          <w:rFonts w:ascii="Times New Roman" w:hAnsi="Times New Roman" w:cs="Times New Roman"/>
+          <w:b/>
+          <w:i w:val="0"/>
+          <w:color w:val="000000"/>
+          <w:sz w:val="26"/>
+        </w:rPr>
+        <w:t>4.12. Thí nghiệm 6 — Thử nghiệm viết lại truy vấn (query rewriting)</w:t>
+      </w:r>
+    </w:p>
+    <w:p>
+      <w:pPr>
+        <w:spacing w:line="360" w:lineRule="auto" w:after="120"/>
+        <w:ind w:firstLine="567"/>
+        <w:jc w:val="both"/>
+      </w:pPr>
+      <w:r>
+        <w:rPr>
+          <w:rFonts w:ascii="Times New Roman" w:hAnsi="Times New Roman" w:cs="Times New Roman"/>
+          <w:b w:val="0"/>
+          <w:i w:val="0"/>
+          <w:sz w:val="26"/>
+        </w:rPr>
+        <w:t>Hướng cải tiến (i) ở trên được kiểm chứng ngay trong đề tài: dùng chính PhoGPT-4B viết lại 30 câu hỏi tự nhiên sang ngôn ngữ pháp lý (prompt few-shot gồm 3 ví dụ mẫu), sau đó truy xuất lại bằng (a) câu viết lại và (b) câu gốc ghép câu viết lại. Kết quả ở Bảng 4.4.</w:t>
+      </w:r>
+    </w:p>
+    <w:p>
+      <w:pPr>
+        <w:spacing w:before="120"/>
+        <w:jc w:val="center"/>
+      </w:pPr>
+      <w:r>
+        <w:rPr>
+          <w:rFonts w:ascii="Times New Roman" w:hAnsi="Times New Roman" w:cs="Times New Roman"/>
+          <w:b/>
+          <w:i w:val="0"/>
+          <w:sz w:val="24"/>
+        </w:rPr>
+        <w:t>Bảng 4.4. Ảnh hưởng của viết lại truy vấn trên 30 câu hỏi tự nhiên</w:t>
+      </w:r>
+    </w:p>
+    <w:tbl>
+      <w:tblPr>
+        <w:tblStyle w:val="TableGrid"/>
+        <w:tblW w:type="auto" w:w="0"/>
+        <w:jc w:val="center"/>
+        <w:tblLook w:firstColumn="1" w:firstRow="1" w:lastColumn="0" w:lastRow="0" w:noHBand="0" w:noVBand="1" w:val="04A0"/>
+      </w:tblPr>
+      <w:tblGrid>
+        <w:gridCol w:w="1512"/>
+        <w:gridCol w:w="1512"/>
+        <w:gridCol w:w="1512"/>
+        <w:gridCol w:w="1512"/>
+        <w:gridCol w:w="1512"/>
+        <w:gridCol w:w="1512"/>
+      </w:tblGrid>
+      <w:tr>
+        <w:tc>
+          <w:tcPr>
+            <w:tcW w:type="dxa" w:w="1512"/>
+            <w:shd w:val="clear" w:fill="D9E2F3"/>
+          </w:tcPr>
+          <w:p>
+            <w:pPr>
+              <w:jc w:val="center"/>
+            </w:pPr>
+            <w:r>
+              <w:rPr>
+                <w:rFonts w:ascii="Times New Roman" w:hAnsi="Times New Roman" w:cs="Times New Roman"/>
+                <w:b/>
+                <w:i w:val="0"/>
+                <w:sz w:val="24"/>
+              </w:rPr>
+              <w:t>Biến thể truy vấn</w:t>
+            </w:r>
+          </w:p>
+        </w:tc>
+        <w:tc>
+          <w:tcPr>
+            <w:tcW w:type="dxa" w:w="1512"/>
+            <w:shd w:val="clear" w:fill="D9E2F3"/>
+          </w:tcPr>
+          <w:p>
+            <w:pPr>
+              <w:jc w:val="center"/>
+            </w:pPr>
+            <w:r>
+              <w:rPr>
+                <w:rFonts w:ascii="Times New Roman" w:hAnsi="Times New Roman" w:cs="Times New Roman"/>
+                <w:b/>
+                <w:i w:val="0"/>
+                <w:sz w:val="24"/>
+              </w:rPr>
+              <w:t>Hit@1</w:t>
+            </w:r>
+          </w:p>
+        </w:tc>
+        <w:tc>
+          <w:tcPr>
+            <w:tcW w:type="dxa" w:w="1512"/>
+            <w:shd w:val="clear" w:fill="D9E2F3"/>
+          </w:tcPr>
+          <w:p>
+            <w:pPr>
+              <w:jc w:val="center"/>
+            </w:pPr>
+            <w:r>
+              <w:rPr>
+                <w:rFonts w:ascii="Times New Roman" w:hAnsi="Times New Roman" w:cs="Times New Roman"/>
+                <w:b/>
+                <w:i w:val="0"/>
+                <w:sz w:val="24"/>
+              </w:rPr>
+              <w:t>Hit@3</w:t>
+            </w:r>
+          </w:p>
+        </w:tc>
+        <w:tc>
+          <w:tcPr>
+            <w:tcW w:type="dxa" w:w="1512"/>
+            <w:shd w:val="clear" w:fill="D9E2F3"/>
+          </w:tcPr>
+          <w:p>
+            <w:pPr>
+              <w:jc w:val="center"/>
+            </w:pPr>
+            <w:r>
+              <w:rPr>
+                <w:rFonts w:ascii="Times New Roman" w:hAnsi="Times New Roman" w:cs="Times New Roman"/>
+                <w:b/>
+                <w:i w:val="0"/>
+                <w:sz w:val="24"/>
+              </w:rPr>
+              <w:t>Hit@5</w:t>
+            </w:r>
+          </w:p>
+        </w:tc>
+        <w:tc>
+          <w:tcPr>
+            <w:tcW w:type="dxa" w:w="1512"/>
+            <w:shd w:val="clear" w:fill="D9E2F3"/>
+          </w:tcPr>
+          <w:p>
+            <w:pPr>
+              <w:jc w:val="center"/>
+            </w:pPr>
+            <w:r>
+              <w:rPr>
+                <w:rFonts w:ascii="Times New Roman" w:hAnsi="Times New Roman" w:cs="Times New Roman"/>
+                <w:b/>
+                <w:i w:val="0"/>
+                <w:sz w:val="24"/>
+              </w:rPr>
+              <w:t>Hit@10</w:t>
+            </w:r>
+          </w:p>
+        </w:tc>
+        <w:tc>
+          <w:tcPr>
+            <w:tcW w:type="dxa" w:w="1512"/>
+            <w:shd w:val="clear" w:fill="D9E2F3"/>
+          </w:tcPr>
+          <w:p>
+            <w:pPr>
+              <w:jc w:val="center"/>
+            </w:pPr>
+            <w:r>
+              <w:rPr>
+                <w:rFonts w:ascii="Times New Roman" w:hAnsi="Times New Roman" w:cs="Times New Roman"/>
+                <w:b/>
+                <w:i w:val="0"/>
+                <w:sz w:val="24"/>
+              </w:rPr>
+              <w:t>MRR</w:t>
+            </w:r>
+          </w:p>
+        </w:tc>
+      </w:tr>
+      <w:tr>
+        <w:tc>
+          <w:tcPr>
+            <w:tcW w:type="dxa" w:w="1512"/>
+          </w:tcPr>
+          <w:p>
+            <w:pPr>
+              <w:jc w:val="left"/>
+            </w:pPr>
+            <w:r>
+              <w:rPr>
+                <w:rFonts w:ascii="Times New Roman" w:hAnsi="Times New Roman" w:cs="Times New Roman"/>
+                <w:b w:val="0"/>
+                <w:i w:val="0"/>
+                <w:sz w:val="24"/>
+              </w:rPr>
+              <w:t>Câu gốc (baseline)</w:t>
+            </w:r>
+          </w:p>
+        </w:tc>
+        <w:tc>
+          <w:tcPr>
+            <w:tcW w:type="dxa" w:w="1512"/>
+          </w:tcPr>
+          <w:p>
+            <w:pPr>
+              <w:jc w:val="center"/>
+            </w:pPr>
+            <w:r>
+              <w:rPr>
+                <w:rFonts w:ascii="Times New Roman" w:hAnsi="Times New Roman" w:cs="Times New Roman"/>
+                <w:b w:val="0"/>
+                <w:i w:val="0"/>
+                <w:sz w:val="24"/>
+              </w:rPr>
+              <w:t>0,200</w:t>
+            </w:r>
+          </w:p>
+        </w:tc>
+        <w:tc>
+          <w:tcPr>
+            <w:tcW w:type="dxa" w:w="1512"/>
+          </w:tcPr>
+          <w:p>
+            <w:pPr>
+              <w:jc w:val="center"/>
+            </w:pPr>
+            <w:r>
+              <w:rPr>
+                <w:rFonts w:ascii="Times New Roman" w:hAnsi="Times New Roman" w:cs="Times New Roman"/>
+                <w:b w:val="0"/>
+                <w:i w:val="0"/>
+                <w:sz w:val="24"/>
+              </w:rPr>
+              <w:t>0,267</w:t>
+            </w:r>
+          </w:p>
+        </w:tc>
+        <w:tc>
+          <w:tcPr>
+            <w:tcW w:type="dxa" w:w="1512"/>
+          </w:tcPr>
+          <w:p>
+            <w:pPr>
+              <w:jc w:val="center"/>
+            </w:pPr>
+            <w:r>
+              <w:rPr>
+                <w:rFonts w:ascii="Times New Roman" w:hAnsi="Times New Roman" w:cs="Times New Roman"/>
+                <w:b w:val="0"/>
+                <w:i w:val="0"/>
+                <w:sz w:val="24"/>
+              </w:rPr>
+              <w:t>0,367</w:t>
+            </w:r>
+          </w:p>
+        </w:tc>
+        <w:tc>
+          <w:tcPr>
+            <w:tcW w:type="dxa" w:w="1512"/>
+          </w:tcPr>
+          <w:p>
+            <w:pPr>
+              <w:jc w:val="center"/>
+            </w:pPr>
+            <w:r>
+              <w:rPr>
+                <w:rFonts w:ascii="Times New Roman" w:hAnsi="Times New Roman" w:cs="Times New Roman"/>
+                <w:b w:val="0"/>
+                <w:i w:val="0"/>
+                <w:sz w:val="24"/>
+              </w:rPr>
+              <w:t>0,467</w:t>
+            </w:r>
+          </w:p>
+        </w:tc>
+        <w:tc>
+          <w:tcPr>
+            <w:tcW w:type="dxa" w:w="1512"/>
+          </w:tcPr>
+          <w:p>
+            <w:pPr>
+              <w:jc w:val="center"/>
+            </w:pPr>
+            <w:r>
+              <w:rPr>
+                <w:rFonts w:ascii="Times New Roman" w:hAnsi="Times New Roman" w:cs="Times New Roman"/>
+                <w:b w:val="0"/>
+                <w:i w:val="0"/>
+                <w:sz w:val="24"/>
+              </w:rPr>
+              <w:t>0,271</w:t>
+            </w:r>
+          </w:p>
+        </w:tc>
+      </w:tr>
+      <w:tr>
+        <w:tc>
+          <w:tcPr>
+            <w:tcW w:type="dxa" w:w="1512"/>
+          </w:tcPr>
+          <w:p>
+            <w:pPr>
+              <w:jc w:val="left"/>
+            </w:pPr>
+            <w:r>
+              <w:rPr>
+                <w:rFonts w:ascii="Times New Roman" w:hAnsi="Times New Roman" w:cs="Times New Roman"/>
+                <w:b w:val="0"/>
+                <w:i w:val="0"/>
+                <w:sz w:val="24"/>
+              </w:rPr>
+              <w:t>Câu viết lại (rewrite)</w:t>
+            </w:r>
+          </w:p>
+        </w:tc>
+        <w:tc>
+          <w:tcPr>
+            <w:tcW w:type="dxa" w:w="1512"/>
+          </w:tcPr>
+          <w:p>
+            <w:pPr>
+              <w:jc w:val="center"/>
+            </w:pPr>
+            <w:r>
+              <w:rPr>
+                <w:rFonts w:ascii="Times New Roman" w:hAnsi="Times New Roman" w:cs="Times New Roman"/>
+                <w:b w:val="0"/>
+                <w:i w:val="0"/>
+                <w:sz w:val="24"/>
+              </w:rPr>
+              <w:t>0,167</w:t>
+            </w:r>
+          </w:p>
+        </w:tc>
+        <w:tc>
+          <w:tcPr>
+            <w:tcW w:type="dxa" w:w="1512"/>
+          </w:tcPr>
+          <w:p>
+            <w:pPr>
+              <w:jc w:val="center"/>
+            </w:pPr>
+            <w:r>
+              <w:rPr>
+                <w:rFonts w:ascii="Times New Roman" w:hAnsi="Times New Roman" w:cs="Times New Roman"/>
+                <w:b w:val="0"/>
+                <w:i w:val="0"/>
+                <w:sz w:val="24"/>
+              </w:rPr>
+              <w:t>0,233</w:t>
+            </w:r>
+          </w:p>
+        </w:tc>
+        <w:tc>
+          <w:tcPr>
+            <w:tcW w:type="dxa" w:w="1512"/>
+          </w:tcPr>
+          <w:p>
+            <w:pPr>
+              <w:jc w:val="center"/>
+            </w:pPr>
+            <w:r>
+              <w:rPr>
+                <w:rFonts w:ascii="Times New Roman" w:hAnsi="Times New Roman" w:cs="Times New Roman"/>
+                <w:b w:val="0"/>
+                <w:i w:val="0"/>
+                <w:sz w:val="24"/>
+              </w:rPr>
+              <w:t>0,400</w:t>
+            </w:r>
+          </w:p>
+        </w:tc>
+        <w:tc>
+          <w:tcPr>
+            <w:tcW w:type="dxa" w:w="1512"/>
+          </w:tcPr>
+          <w:p>
+            <w:pPr>
+              <w:jc w:val="center"/>
+            </w:pPr>
+            <w:r>
+              <w:rPr>
+                <w:rFonts w:ascii="Times New Roman" w:hAnsi="Times New Roman" w:cs="Times New Roman"/>
+                <w:b w:val="0"/>
+                <w:i w:val="0"/>
+                <w:sz w:val="24"/>
+              </w:rPr>
+              <w:t>0,533</w:t>
+            </w:r>
+          </w:p>
+        </w:tc>
+        <w:tc>
+          <w:tcPr>
+            <w:tcW w:type="dxa" w:w="1512"/>
+          </w:tcPr>
+          <w:p>
+            <w:pPr>
+              <w:jc w:val="center"/>
+            </w:pPr>
+            <w:r>
+              <w:rPr>
+                <w:rFonts w:ascii="Times New Roman" w:hAnsi="Times New Roman" w:cs="Times New Roman"/>
+                <w:b w:val="0"/>
+                <w:i w:val="0"/>
+                <w:sz w:val="24"/>
+              </w:rPr>
+              <w:t>0,258</w:t>
+            </w:r>
+          </w:p>
+        </w:tc>
+      </w:tr>
+      <w:tr>
+        <w:tc>
+          <w:tcPr>
+            <w:tcW w:type="dxa" w:w="1512"/>
+          </w:tcPr>
+          <w:p>
+            <w:pPr>
+              <w:jc w:val="left"/>
+            </w:pPr>
+            <w:r>
+              <w:rPr>
+                <w:rFonts w:ascii="Times New Roman" w:hAnsi="Times New Roman" w:cs="Times New Roman"/>
+                <w:b w:val="0"/>
+                <w:i w:val="0"/>
+                <w:sz w:val="24"/>
+              </w:rPr>
+              <w:t>Gốc + viết lại (combo)</w:t>
+            </w:r>
+          </w:p>
+        </w:tc>
+        <w:tc>
+          <w:tcPr>
+            <w:tcW w:type="dxa" w:w="1512"/>
+          </w:tcPr>
+          <w:p>
+            <w:pPr>
+              <w:jc w:val="center"/>
+            </w:pPr>
+            <w:r>
+              <w:rPr>
+                <w:rFonts w:ascii="Times New Roman" w:hAnsi="Times New Roman" w:cs="Times New Roman"/>
+                <w:b w:val="0"/>
+                <w:i w:val="0"/>
+                <w:sz w:val="24"/>
+              </w:rPr>
+              <w:t>0,133</w:t>
+            </w:r>
+          </w:p>
+        </w:tc>
+        <w:tc>
+          <w:tcPr>
+            <w:tcW w:type="dxa" w:w="1512"/>
+          </w:tcPr>
+          <w:p>
+            <w:pPr>
+              <w:jc w:val="center"/>
+            </w:pPr>
+            <w:r>
+              <w:rPr>
+                <w:rFonts w:ascii="Times New Roman" w:hAnsi="Times New Roman" w:cs="Times New Roman"/>
+                <w:b w:val="0"/>
+                <w:i w:val="0"/>
+                <w:sz w:val="24"/>
+              </w:rPr>
+              <w:t>0,300</w:t>
+            </w:r>
+          </w:p>
+        </w:tc>
+        <w:tc>
+          <w:tcPr>
+            <w:tcW w:type="dxa" w:w="1512"/>
+          </w:tcPr>
+          <w:p>
+            <w:pPr>
+              <w:jc w:val="center"/>
+            </w:pPr>
+            <w:r>
+              <w:rPr>
+                <w:rFonts w:ascii="Times New Roman" w:hAnsi="Times New Roman" w:cs="Times New Roman"/>
+                <w:b w:val="0"/>
+                <w:i w:val="0"/>
+                <w:sz w:val="24"/>
+              </w:rPr>
+              <w:t>0,367</w:t>
+            </w:r>
+          </w:p>
+        </w:tc>
+        <w:tc>
+          <w:tcPr>
+            <w:tcW w:type="dxa" w:w="1512"/>
+          </w:tcPr>
+          <w:p>
+            <w:pPr>
+              <w:jc w:val="center"/>
+            </w:pPr>
+            <w:r>
+              <w:rPr>
+                <w:rFonts w:ascii="Times New Roman" w:hAnsi="Times New Roman" w:cs="Times New Roman"/>
+                <w:b w:val="0"/>
+                <w:i w:val="0"/>
+                <w:sz w:val="24"/>
+              </w:rPr>
+              <w:t>0,433</w:t>
+            </w:r>
+          </w:p>
+        </w:tc>
+        <w:tc>
+          <w:tcPr>
+            <w:tcW w:type="dxa" w:w="1512"/>
+          </w:tcPr>
+          <w:p>
+            <w:pPr>
+              <w:jc w:val="center"/>
+            </w:pPr>
+            <w:r>
+              <w:rPr>
+                <w:rFonts w:ascii="Times New Roman" w:hAnsi="Times New Roman" w:cs="Times New Roman"/>
+                <w:b w:val="0"/>
+                <w:i w:val="0"/>
+                <w:sz w:val="24"/>
+              </w:rPr>
+              <w:t>0,219</w:t>
+            </w:r>
+          </w:p>
+        </w:tc>
+      </w:tr>
+    </w:tbl>
+    <w:p>
+      <w:pPr>
+        <w:spacing w:after="120"/>
+      </w:pPr>
+    </w:p>
+    <w:p>
+      <w:pPr>
+        <w:spacing w:line="360" w:lineRule="auto" w:after="120"/>
+        <w:ind w:firstLine="567"/>
+        <w:jc w:val="both"/>
+      </w:pPr>
+      <w:r>
+        <w:rPr>
+          <w:rFonts w:ascii="Times New Roman" w:hAnsi="Times New Roman" w:cs="Times New Roman"/>
+          <w:b w:val="0"/>
+          <w:i w:val="0"/>
+          <w:sz w:val="26"/>
+        </w:rPr>
+        <w:t>Kết quả là một “kết quả âm” (negative result) có giá trị: viết lại bằng PhoGPT-4B không cải thiện tổng thể (MRR giảm 0,271 → 0,258), dù Hit@10 tăng từ 0,467 lên 0,533 cho thấy ý tưởng có tiềm năng ở vùng truy xuất rộng. Phân tích thủ công 30 câu viết lại chỉ ra nguyên nhân nằm ở năng lực mô hình viết lại, không phải ở ý tưởng: 15/30 câu bị giữ nguyên (mô hình không viết lại); 13/30 câu bị mô hình trả lời luôn thay vì viết lại; 8/30 câu bị chèn trích dẫn tự bịa (ví dụ dẫn “Điều 32 Luật Khám bệnh, chữa bệnh năm 2009” hoặc “Nghị định 11/2016/NĐ-CP” — sai hoặc đã lỗi thời), thậm chí có câu bị viết lại sang sai lĩnh vực.</w:t>
+      </w:r>
+    </w:p>
+    <w:p>
+      <w:pPr>
+        <w:spacing w:line="360" w:lineRule="auto" w:after="120"/>
+        <w:ind w:firstLine="567"/>
+        <w:jc w:val="both"/>
+      </w:pPr>
+      <w:r>
+        <w:rPr>
+          <w:rFonts w:ascii="Times New Roman" w:hAnsi="Times New Roman" w:cs="Times New Roman"/>
+          <w:b w:val="0"/>
+          <w:i w:val="0"/>
+          <w:sz w:val="26"/>
+        </w:rPr>
+        <w:t>Kết luận của thí nghiệm: nút thắt của query rewriting là năng lực tuân thủ chỉ dẫn (instruction-following) của mô hình 3,7 tỷ tham số đã lượng tử hóa — không đủ để thực hiện ổn định một tác vụ biến đổi văn bản có ràng buộc. Hướng khắc phục khả thi: (i) dùng một LLM mạnh hơn chỉ riêng cho bước viết lại (bước này không yêu cầu chạy cục bộ vì không chạm dữ liệu nhạy cảm); (ii) xây từ điển ánh xạ cụm từ đời thường → thuật ngữ pháp lý (mở quán ăn → cơ sở kinh doanh dịch vụ ăn uống) như một bước thay thế nhẹ và kiểm soát được. Việc thử nghiệm, định lượng nguyên nhân thất bại và đề xuất thay thế là một phần đóng góp về phương pháp của đề tài.</w:t>
+      </w:r>
+    </w:p>
+    <w:p>
+      <w:pPr>
         <w:pStyle w:val="Heading1"/>
         <w:keepNext/>
         <w:pageBreakBefore/>
@@ -7164,7 +7750,7 @@
           <w:i w:val="0"/>
           <w:sz w:val="26"/>
         </w:rPr>
-        <w:t>Bổ sung bước viết lại truy vấn (query rewriting) để bắc cầu từ vựng đời thường – pháp lý, cải thiện kết quả trên câu hỏi tự nhiên.</w:t>
+        <w:t>Hoàn thiện bước viết lại truy vấn: thử nghiệm với PhoGPT-4B chưa thành công do hạn chế instruction-following (Mục 4.12); hướng tiếp theo là dùng LLM mạnh hơn cho riêng bước viết lại hoặc từ điển ánh xạ đời thường – pháp lý.</w:t>
       </w:r>
     </w:p>
     <w:p>

</xml_diff>

<commit_message>
Tiep thu gop y: bo dau hieu gen-AI (chu HOA dot ngot, em-dash trong van xuoi, prompt ### Cau hoi/Tra loi); them trich dan phan Tong quan (hallucination, Transformer, RoBERTa, HNSW, HyDE); them ma nganh HTTT 7480104; them gioi thieu + ket luan moi chuong va 4 cau hoi nghien cuu (CHNC1-4) anh xa toi thuc nghiem
</commit_message>
<xml_diff>
--- a/report/BaoCao_RAG_DATN.docx
+++ b/report/BaoCao_RAG_DATN.docx
@@ -196,6 +196,30 @@
           <w:i w:val="0"/>
           <w:sz w:val="26"/>
         </w:rPr>
+        <w:t xml:space="preserve">Mã ngành: </w:t>
+      </w:r>
+      <w:r>
+        <w:rPr>
+          <w:rFonts w:ascii="Times New Roman" w:hAnsi="Times New Roman" w:cs="Times New Roman"/>
+          <w:b w:val="0"/>
+          <w:i w:val="0"/>
+          <w:sz w:val="26"/>
+        </w:rPr>
+        <w:t>7480104</w:t>
+      </w:r>
+    </w:p>
+    <w:p>
+      <w:pPr>
+        <w:spacing w:after="80"/>
+        <w:jc w:val="center"/>
+      </w:pPr>
+      <w:r>
+        <w:rPr>
+          <w:rFonts w:ascii="Times New Roman" w:hAnsi="Times New Roman" w:cs="Times New Roman"/>
+          <w:b/>
+          <w:i w:val="0"/>
+          <w:sz w:val="26"/>
+        </w:rPr>
         <w:t xml:space="preserve">Mã số sinh viên: </w:t>
       </w:r>
       <w:r>
@@ -949,7 +973,7 @@
           <w:sz w:val="26"/>
         </w:rPr>
         <w:tab/>
-        <w:t>Approximate Nearest Neighbor — tìm kiếm lân cận gần đúng</w:t>
+        <w:t>Approximate Nearest Neighbor, tìm kiếm lân cận gần đúng</w:t>
       </w:r>
     </w:p>
     <w:p>
@@ -1030,7 +1054,7 @@
           <w:sz w:val="26"/>
         </w:rPr>
         <w:tab/>
-        <w:t>Best Matching 25 — hàm xếp hạng theo trùng khớp từ vựng</w:t>
+        <w:t>Best Matching 25, hàm xếp hạng theo trùng khớp từ vựng</w:t>
       </w:r>
     </w:p>
     <w:p>
@@ -1111,7 +1135,7 @@
           <w:sz w:val="26"/>
         </w:rPr>
         <w:tab/>
-        <w:t>Hierarchical Navigable Small World — chỉ mục đồ thị cho ANN</w:t>
+        <w:t>Hierarchical Navigable Small World, chỉ mục đồ thị cho ANN</w:t>
       </w:r>
     </w:p>
     <w:p>
@@ -1165,7 +1189,7 @@
           <w:sz w:val="26"/>
         </w:rPr>
         <w:tab/>
-        <w:t>Large Language Model — mô hình ngôn ngữ lớn</w:t>
+        <w:t>Large Language Model, mô hình ngôn ngữ lớn</w:t>
       </w:r>
     </w:p>
     <w:p>
@@ -1192,7 +1216,7 @@
           <w:sz w:val="26"/>
         </w:rPr>
         <w:tab/>
-        <w:t>Mean Reciprocal Rank — trung bình nghịch đảo thứ hạng</w:t>
+        <w:t>Mean Reciprocal Rank, trung bình nghịch đảo thứ hạng</w:t>
       </w:r>
     </w:p>
     <w:p>
@@ -1219,7 +1243,7 @@
           <w:sz w:val="26"/>
         </w:rPr>
         <w:tab/>
-        <w:t>Retrieval-Augmented Generation — sinh tăng cường truy xuất</w:t>
+        <w:t>Retrieval-Augmented Generation, sinh tăng cường truy xuất</w:t>
       </w:r>
     </w:p>
     <w:p>
@@ -1246,7 +1270,7 @@
           <w:sz w:val="26"/>
         </w:rPr>
         <w:tab/>
-        <w:t>Reciprocal Rank Fusion — hợp nhất nghịch đảo thứ hạng</w:t>
+        <w:t>Reciprocal Rank Fusion, hợp nhất nghịch đảo thứ hạng</w:t>
       </w:r>
     </w:p>
     <w:p>
@@ -1337,6 +1361,132 @@
     </w:p>
     <w:p>
       <w:pPr>
+        <w:spacing w:before="200" w:after="0" w:line="360" w:lineRule="auto"/>
+        <w:jc w:val="both"/>
+      </w:pPr>
+      <w:r>
+        <w:rPr>
+          <w:rFonts w:ascii="Times New Roman" w:hAnsi="Times New Roman" w:cs="Times New Roman"/>
+          <w:b w:val="0"/>
+          <w:i w:val="0"/>
+          <w:sz w:val="26"/>
+        </w:rPr>
+        <w:t>Chương này trình bày bối cảnh, mục tiêu và nền tảng lý thuyết của đề tài. Trước hết là bài toán tra cứu văn bản pháp luật ngành y tế và lý do lựa chọn kiến trúc Retrieval-Augmented Generation (RAG). Tiếp đó, chương phân tích từng thành phần của hệ thống: biểu diễn ngữ nghĩa bằng embedding, cơ sở dữ liệu vector, tìm kiếm từ vựng và hybrid, xếp hạng lại bằng cross-encoder, mô hình ngôn ngữ sinh, cùng các độ đo đánh giá. Đây là cơ sở để thiết kế hệ thống (Chương 2, 3) và bố trí thực nghiệm (Chương 4).</w:t>
+      </w:r>
+    </w:p>
+    <w:p>
+      <w:pPr>
+        <w:spacing w:before="200" w:after="0" w:line="360" w:lineRule="auto"/>
+        <w:jc w:val="both"/>
+      </w:pPr>
+      <w:r>
+        <w:rPr>
+          <w:rFonts w:ascii="Times New Roman" w:hAnsi="Times New Roman" w:cs="Times New Roman"/>
+          <w:b w:val="0"/>
+          <w:i w:val="0"/>
+          <w:sz w:val="26"/>
+        </w:rPr>
+        <w:t>Đề tài hướng tới trả lời bốn câu hỏi nghiên cứu, được giải quyết và kiểm chứng ở Chương 4:</w:t>
+      </w:r>
+    </w:p>
+    <w:p>
+      <w:pPr>
+        <w:pStyle w:val="ListBullet"/>
+        <w:spacing w:before="0" w:after="0" w:line="360" w:lineRule="auto"/>
+      </w:pPr>
+      <w:r>
+        <w:rPr>
+          <w:rFonts w:ascii="Times New Roman" w:hAnsi="Times New Roman" w:cs="Times New Roman"/>
+          <w:b/>
+          <w:i w:val="0"/>
+          <w:sz w:val="26"/>
+        </w:rPr>
+        <w:t xml:space="preserve">CHNC 1: </w:t>
+      </w:r>
+      <w:r>
+        <w:rPr>
+          <w:rFonts w:ascii="Times New Roman" w:hAnsi="Times New Roman" w:cs="Times New Roman"/>
+          <w:b w:val="0"/>
+          <w:i w:val="0"/>
+          <w:sz w:val="26"/>
+        </w:rPr>
+        <w:t>Kiến trúc RAG cùng các thành phần nào phù hợp để tra cứu văn bản pháp luật y tế tiếng Việt trên máy tính cá nhân không có GPU bắt buộc?</w:t>
+      </w:r>
+    </w:p>
+    <w:p>
+      <w:pPr>
+        <w:pStyle w:val="ListBullet"/>
+        <w:spacing w:before="0" w:after="0" w:line="360" w:lineRule="auto"/>
+      </w:pPr>
+      <w:r>
+        <w:rPr>
+          <w:rFonts w:ascii="Times New Roman" w:hAnsi="Times New Roman" w:cs="Times New Roman"/>
+          <w:b/>
+          <w:i w:val="0"/>
+          <w:sz w:val="26"/>
+        </w:rPr>
+        <w:t xml:space="preserve">CHNC 2: </w:t>
+      </w:r>
+      <w:r>
+        <w:rPr>
+          <w:rFonts w:ascii="Times New Roman" w:hAnsi="Times New Roman" w:cs="Times New Roman"/>
+          <w:b w:val="0"/>
+          <w:i w:val="0"/>
+          <w:sz w:val="26"/>
+        </w:rPr>
+        <w:t>Mỗi kỹ thuật truy xuất (tách từ, hybrid BM25+vector, nhận diện số hiệu, reranker, kích thước phân đoạn) đóng góp định lượng bao nhiêu vào chất lượng?</w:t>
+      </w:r>
+    </w:p>
+    <w:p>
+      <w:pPr>
+        <w:pStyle w:val="ListBullet"/>
+        <w:spacing w:before="0" w:after="0" w:line="360" w:lineRule="auto"/>
+      </w:pPr>
+      <w:r>
+        <w:rPr>
+          <w:rFonts w:ascii="Times New Roman" w:hAnsi="Times New Roman" w:cs="Times New Roman"/>
+          <w:b/>
+          <w:i w:val="0"/>
+          <w:sz w:val="26"/>
+        </w:rPr>
+        <w:t xml:space="preserve">CHNC 3: </w:t>
+      </w:r>
+      <w:r>
+        <w:rPr>
+          <w:rFonts w:ascii="Times New Roman" w:hAnsi="Times New Roman" w:cs="Times New Roman"/>
+          <w:b w:val="0"/>
+          <w:i w:val="0"/>
+          <w:sz w:val="26"/>
+        </w:rPr>
+        <w:t>Hệ thống xử lý câu hỏi diễn đạt tự nhiên (ngôn ngữ đời thường) đến mức nào, và những kỹ thuật nào thu hẹp được khoảng cách từ vựng?</w:t>
+      </w:r>
+    </w:p>
+    <w:p>
+      <w:pPr>
+        <w:pStyle w:val="ListBullet"/>
+        <w:spacing w:before="0" w:after="0" w:line="360" w:lineRule="auto"/>
+      </w:pPr>
+      <w:r>
+        <w:rPr>
+          <w:rFonts w:ascii="Times New Roman" w:hAnsi="Times New Roman" w:cs="Times New Roman"/>
+          <w:b/>
+          <w:i w:val="0"/>
+          <w:sz w:val="26"/>
+        </w:rPr>
+        <w:t xml:space="preserve">CHNC 4: </w:t>
+      </w:r>
+      <w:r>
+        <w:rPr>
+          <w:rFonts w:ascii="Times New Roman" w:hAnsi="Times New Roman" w:cs="Times New Roman"/>
+          <w:b w:val="0"/>
+          <w:i w:val="0"/>
+          <w:sz w:val="26"/>
+        </w:rPr>
+        <w:t>Các kết quả có ổn định và đáng tin cậy khi mở rộng quy mô đánh giá và kiểm chứng chéo hay không?</w:t>
+      </w:r>
+    </w:p>
+    <w:p>
+      <w:pPr>
         <w:pStyle w:val="Heading2"/>
         <w:keepNext/>
         <w:spacing w:before="120" w:after="240" w:line="240" w:lineRule="auto"/>
@@ -1398,7 +1548,7 @@
           <w:i w:val="0"/>
           <w:sz w:val="26"/>
         </w:rPr>
-        <w:t>Các công cụ tìm kiếm từ khóa truyền thống chỉ khớp trên mặt chữ nên bỏ sót khi người dùng diễn đạt khác cách dùng từ trong văn bản. Ở chiều ngược lại, việc hỏi trực tiếp một mô hình ngôn ngữ lớn (LLM) tuy cho câu trả lời trôi chảy nhưng tiềm ẩn rủi ro “bịa đặt” (hallucination) và không truy xuất được nguồn, điều không thể chấp nhận trong lĩnh vực pháp luật, nơi mọi khẳng định cần dẫn chiếu văn bản cụ thể. Kiến trúc Retrieval-Augmented Generation (RAG) [1] dung hòa hai hướng trên: truy xuất các đoạn văn bản liên quan từ kho tri thức đáng tin cậy, sau đó để LLM sinh câu trả lời dựa trên các đoạn này và trích dẫn nguồn.</w:t>
+        <w:t>Các công cụ tìm kiếm từ khóa truyền thống chỉ khớp trên mặt chữ nên bỏ sót khi người dùng diễn đạt khác cách dùng từ trong văn bản. Ở chiều ngược lại, việc hỏi trực tiếp một mô hình ngôn ngữ lớn (LLM) tuy cho câu trả lời trôi chảy nhưng tiềm ẩn rủi ro “bịa đặt” (hallucination) [12] và không truy xuất được nguồn, điều không thể chấp nhận trong lĩnh vực pháp luật, nơi mọi khẳng định cần dẫn chiếu văn bản cụ thể. Kiến trúc Retrieval-Augmented Generation (RAG) [1] dung hòa hai hướng trên: truy xuất các đoạn văn bản liên quan từ kho tri thức đáng tin cậy, sau đó để LLM sinh câu trả lời dựa trên các đoạn này và trích dẫn nguồn.</w:t>
       </w:r>
     </w:p>
     <w:p>
@@ -1599,7 +1749,7 @@
           <w:i w:val="0"/>
           <w:sz w:val="26"/>
         </w:rPr>
-        <w:t>Lưu ý về tiến trình: các Chương 1–3 trình bày cấu hình cơ sở dựa trên PhoBERT; qua thực nghiệm ở Chương 4, cấu hình ĐỀ XUẤT cuối cùng (cho hiệu năng tốt nhất, nhất là với câu hỏi đời thường) chuyển sang bge-m3 + từ điển ánh xạ + mở rộng ngữ nghĩa + reranker fine-tune (Mục 4.16–4.18).</w:t>
+        <w:t>Lưu ý về tiến trình: các Chương 1–3 trình bày cấu hình cơ sở dựa trên PhoBERT; qua thực nghiệm ở Chương 4, cấu hình đề xuất cuối cùng (cho hiệu năng tốt nhất, nhất là với câu hỏi đời thường) chuyển sang bge-m3 + từ điển ánh xạ + mở rộng ngữ nghĩa + reranker fine-tune (Mục 4.16–4.18).</w:t>
       </w:r>
     </w:p>
     <w:p>
@@ -2223,7 +2373,7 @@
           <w:i w:val="0"/>
           <w:sz w:val="26"/>
         </w:rPr>
-        <w:t>Các mô hình ngôn ngữ hiện đại dựa trên kiến trúc Transformer với cơ chế tự chú ý (self-attention): mỗi token được chiếu thành ba vector truy vấn Q, khóa K và giá trị V; đầu ra của một đầu chú ý được tính theo:</w:t>
+        <w:t>Các mô hình ngôn ngữ hiện đại dựa trên kiến trúc Transformer với cơ chế tự chú ý (self-attention) [13]: mỗi token được chiếu thành ba vector truy vấn Q, khóa K và giá trị V; đầu ra của một đầu chú ý được tính theo:</w:t>
       </w:r>
     </w:p>
     <w:p>
@@ -2290,7 +2440,7 @@
           <w:i w:val="0"/>
           <w:sz w:val="26"/>
         </w:rPr>
-        <w:t>PhoBERT [2] là mô hình ngôn ngữ tiền huấn luyện cho tiếng Việt theo kiến trúc RoBERTa (cải tiến BERT về quy trình huấn luyện), trên kho ngữ liệu ~20GB văn bản tiếng Việt. Một đặc điểm quan trọng: PhoBERT được huấn luyện trên dữ liệu đã được tách từ (word segmentation) trước khi tách BPE thành đơn vị từ phụ. Tiếng Việt là ngôn ngữ đơn lập, ranh giới “từ” không trùng với khoảng trắng, “Bộ Y tế” là một từ ghép gồm ba âm tiết; nếu không tách từ, ba âm tiết này bị mã hóa rời rạc và tổ hợp BPE thu được khác hẳn tổ hợp lúc huấn luyện. Do đó, để khai thác đúng PhoBERT, đầu vào lúc suy luận cũng phải được tách từ bằng công cụ như pyvi, tạo dạng “Bộ_Y_tế”; nếu không, embedding sẽ lệch khỏi phân phối huấn luyện và giảm chất lượng truy xuất (kiểm chứng định lượng ở Thí nghiệm 1, Chương 4).</w:t>
+        <w:t>PhoBERT [2] là mô hình ngôn ngữ tiền huấn luyện cho tiếng Việt theo kiến trúc RoBERTa [14] (cải tiến BERT về quy trình huấn luyện), trên kho ngữ liệu ~20GB văn bản tiếng Việt. Một đặc điểm quan trọng: PhoBERT được huấn luyện trên dữ liệu đã được tách từ (word segmentation) trước khi tách BPE thành đơn vị từ phụ. Tiếng Việt là ngôn ngữ đơn lập, ranh giới “từ” không trùng với khoảng trắng, “Bộ Y tế” là một từ ghép gồm ba âm tiết; nếu không tách từ, ba âm tiết này bị mã hóa rời rạc và tổ hợp BPE thu được khác hẳn tổ hợp lúc huấn luyện. Do đó, để khai thác đúng PhoBERT, đầu vào lúc suy luận cũng phải được tách từ bằng công cụ như pyvi, tạo dạng “Bộ_Y_tế”; nếu không, embedding sẽ lệch khỏi phân phối huấn luyện và giảm chất lượng truy xuất (kiểm chứng định lượng ở Thí nghiệm 1, Chương 4).</w:t>
       </w:r>
     </w:p>
     <w:p>
@@ -2460,7 +2610,7 @@
           <w:i w:val="0"/>
           <w:sz w:val="26"/>
         </w:rPr>
-        <w:t>Bên cạnh bi-encoder dựa trên PhoBERT, đề tài còn khảo sát bge-m3 [11], một bộ mã hóa câu đa ngữ hiện đại. bge-m3 dựa trên kiến trúc XLM-RoBERTa (khoảng 568 triệu tham số), tiền huấn luyện trên kho ngữ liệu đa ngữ rất lớn (hơn 100 ngôn ngữ, bao gồm tiếng Việt) và tinh chỉnh cho truy hồi thông tin; mỗi câu/đoạn được biểu diễn bằng vector 1.024 chiều. Ba khác biệt then chốt so với vietnamese-bi-encoder (PhoBERT, 768 chiều): (i) quy mô dữ liệu và tham số lớn hơn nhiều, cho biểu diễn ngữ nghĩa khái quát hơn, đặc biệt hữu ích để bắc cầu giữa ngôn ngữ đời thường và thuật ngữ pháp lý; (ii) bộ tách từ con (sub-word) đa ngữ tự xử lý tiếng Việt nên KHÔNG cần bước tách từ pyvi (dùng văn bản thô); (iii) độ dài ngữ cảnh dài hơn. Đánh đổi là mô hình lớn hơn (chậm hơn, tốn bộ nhớ hơn), chỉ khả thi khi mã hóa toàn corpus trên GPU. Việc so sánh hai mô hình nền và tác động lên câu hỏi đời thường được trình bày ở Mục 4.16.</w:t>
+        <w:t>Bên cạnh bi-encoder dựa trên PhoBERT, đề tài còn khảo sát bge-m3 [11], một bộ mã hóa câu đa ngữ hiện đại. bge-m3 dựa trên kiến trúc XLM-RoBERTa (khoảng 568 triệu tham số), tiền huấn luyện trên kho ngữ liệu đa ngữ rất lớn (hơn 100 ngôn ngữ, bao gồm tiếng Việt) và tinh chỉnh cho truy hồi thông tin; mỗi câu/đoạn được biểu diễn bằng vector 1.024 chiều. Ba khác biệt then chốt so với vietnamese-bi-encoder (PhoBERT, 768 chiều): (i) quy mô dữ liệu và tham số lớn hơn nhiều, cho biểu diễn ngữ nghĩa khái quát hơn, đặc biệt hữu ích để bắc cầu giữa ngôn ngữ đời thường và thuật ngữ pháp lý; (ii) bộ tách từ con (sub-word) đa ngữ tự xử lý tiếng Việt nên không cần bước tách từ pyvi (dùng văn bản thô); (iii) độ dài ngữ cảnh dài hơn. Đánh đổi là mô hình lớn hơn (chậm hơn, tốn bộ nhớ hơn), chỉ khả thi khi mã hóa toàn corpus trên GPU. Việc so sánh hai mô hình nền và tác động lên câu hỏi đời thường được trình bày ở Mục 4.16.</w:t>
       </w:r>
     </w:p>
     <w:p>
@@ -2508,7 +2658,7 @@
           <w:i w:val="0"/>
           <w:sz w:val="26"/>
         </w:rPr>
-        <w:t>ChromaDB [9] sử dụng thuật toán HNSW, có thể hình dung như danh sách bỏ qua (skip-list) trong không gian nhiều chiều: các vector được tổ chức thành đồ thị nhiều tầng, tầng trên thưa với các cạnh “nhảy xa”, tầng đáy chứa toàn bộ điểm với các cạnh ngắn để tinh chỉnh. Khi truy vấn, thuật toán đi từ tầng trên xuống, ở mỗi tầng tham lam di chuyển về phía điểm gần câu hỏi nhất. Hai siêu tham số chính: M (số cạnh tối đa mỗi nút, tăng M tăng độ chính xác và bộ nhớ) và ef (độ rộng tìm kiếm, tăng ef tăng độ chính xác và thời gian). Độ phức tạp truy vấn xấp xỉ O(log N), cho phép phản hồi dưới một giây trên kho gần 400 nghìn vector. ChromaDB còn lưu kèm metadata (số hiệu, loại văn bản, tình trạng hiệu lực…) và cho phép lọc ngay trong truy vấn, đề tài dùng tính năng này để bảo đảm chỉ trả về văn bản còn hiệu lực mà không phải lọc hậu kiểm.</w:t>
+        <w:t>ChromaDB [9] sử dụng thuật toán HNSW [15], có thể hình dung như danh sách bỏ qua (skip-list) trong không gian nhiều chiều: các vector được tổ chức thành đồ thị nhiều tầng, tầng trên thưa với các cạnh “nhảy xa”, tầng đáy chứa toàn bộ điểm với các cạnh ngắn để tinh chỉnh. Khi truy vấn, thuật toán đi từ tầng trên xuống, ở mỗi tầng tham lam di chuyển về phía điểm gần câu hỏi nhất. Hai siêu tham số chính: M (số cạnh tối đa mỗi nút, tăng M tăng độ chính xác và bộ nhớ) và ef (độ rộng tìm kiếm, tăng ef tăng độ chính xác và thời gian). Độ phức tạp truy vấn xấp xỉ O(log N), cho phép phản hồi dưới một giây trên kho gần 400 nghìn vector. ChromaDB còn lưu kèm metadata (số hiệu, loại văn bản, tình trạng hiệu lực…) và cho phép lọc ngay trong truy vấn, đề tài dùng tính năng này để bảo đảm chỉ trả về văn bản còn hiệu lực mà không phải lọc hậu kiểm.</w:t>
       </w:r>
     </w:p>
     <w:p>
@@ -2708,7 +2858,7 @@
           <w:i w:val="0"/>
           <w:sz w:val="26"/>
         </w:rPr>
-        <w:t>Đánh đổi nằm ở chi phí: bi-encoder mã hóa kho N đoạn MỘT LẦN lúc lập chỉ mục, mỗi truy vấn chỉ tốn một lần mã hóa; cross-encoder không tiền tính được (điểm phụ thuộc cả cặp), mỗi truy vấn phải chạy mô hình N lần, bất khả thi với N hàng trăm nghìn. Chiến lược “retrieve-then-rerank” dung hòa: bi-encoder/hybrid lấy nhanh N′ = 30 ứng viên, cross-encoder chỉ chấm lại 30 cặp này để chọn k tốt nhất, chi phí cố định, không phụ thuộc kích thước kho. Đề tài dùng PhoRanker [8] (cross-encoder dựa trên PhoBERT, đầu vào cũng cần tách từ để nhất quán).</w:t>
+        <w:t>Đánh đổi nằm ở chi phí: bi-encoder mã hóa kho N đoạn một lần lúc lập chỉ mục, mỗi truy vấn chỉ tốn một lần mã hóa; cross-encoder không tiền tính được (điểm phụ thuộc cả cặp), mỗi truy vấn phải chạy mô hình N lần, bất khả thi với N hàng trăm nghìn. Chiến lược “retrieve-then-rerank” dung hòa: bi-encoder/hybrid lấy nhanh N′ = 30 ứng viên, cross-encoder chỉ chấm lại 30 cặp này để chọn k tốt nhất, chi phí cố định, không phụ thuộc kích thước kho. Đề tài dùng PhoRanker [8] (cross-encoder dựa trên PhoBERT, đầu vào cũng cần tách từ để nhất quán).</w:t>
       </w:r>
     </w:p>
     <w:p>
@@ -2723,7 +2873,7 @@
           <w:i w:val="0"/>
           <w:sz w:val="26"/>
         </w:rPr>
-        <w:t>Cross-encoder có thể được TINH CHỈNH (fine-tune) cho miền cụ thể. Bài toán xếp hạng lại được đưa về phân loại nhị phân mức cặp: với mỗi cặp (câu hỏi, đoạn), mô hình xuất một điểm s; nhãn 1 nếu đoạn thuộc văn bản đúng, 0 nếu không. Hàm mất mát là entropy chéo nhị phân trên điểm đã qua sigmoid σ(s):</w:t>
+        <w:t>Cross-encoder có thể được tinh chỉnh (fine-tune) cho miền cụ thể. Bài toán xếp hạng lại được đưa về phân loại nhị phân mức cặp: với mỗi cặp (câu hỏi, đoạn), mô hình xuất một điểm s; nhãn 1 nếu đoạn thuộc văn bản đúng, 0 nếu không. Hàm mất mát là entropy chéo nhị phân trên điểm đã qua sigmoid σ(s):</w:t>
       </w:r>
     </w:p>
     <w:p>
@@ -2775,7 +2925,7 @@
           <w:i w:val="0"/>
           <w:sz w:val="26"/>
         </w:rPr>
-        <w:t>Chìa khóa để tinh chỉnh hiệu quả là khai thác MẪU ÂM KHÓ (hard negatives): thay vì lấy đoạn ngẫu nhiên, dùng chính các ứng viên hạng cao do bộ truy xuất trả về nhưng KHÔNG thuộc văn bản đúng, buộc cross-encoder học ranh giới tinh tế giữa “liên quan bề mặt” và “thực sự đúng”. Để tránh khớp quá mức (overfitting) và đánh giá trung thực trên dữ liệu ít, đề tài tách tập theo câu hỏi (train/test rời nhau) và dùng kiểm chứng chéo k-fold (k-fold cross-validation): chia dữ liệu thành k phần, lần lượt huấn luyện trên k−1 phần và đánh giá trên phần còn lại, rồi báo cáo trung bình ± độ lệch chuẩn, bảo đảm kết quả không phụ thuộc một cách chia tập may rủi. Quy trình này được áp dụng cho việc tinh chỉnh reranker ở Mục 4.17.</w:t>
+        <w:t>Chìa khóa để tinh chỉnh hiệu quả là khai thác mẫu âm khó (hard negatives): thay vì lấy đoạn ngẫu nhiên, dùng chính các ứng viên hạng cao do bộ truy xuất trả về nhưng không thuộc văn bản đúng, buộc cross-encoder học ranh giới tinh tế giữa “liên quan bề mặt” và “thực sự đúng”. Để tránh khớp quá mức (overfitting) và đánh giá trung thực trên dữ liệu ít, đề tài tách tập theo câu hỏi (train/test rời nhau) và dùng kiểm chứng chéo k-fold (k-fold cross-validation): chia dữ liệu thành k phần, lần lượt huấn luyện trên k−1 phần và đánh giá trên phần còn lại, rồi báo cáo trung bình ± độ lệch chuẩn, bảo đảm kết quả không phụ thuộc một cách chia tập may rủi. Quy trình này được áp dụng cho việc tinh chỉnh reranker ở Mục 4.17.</w:t>
       </w:r>
     </w:p>
     <w:p>
@@ -2994,6 +3144,39 @@
           <w:sz w:val="26"/>
         </w:rPr>
         <w:t>Kiến trúc RAG được Lewis và cộng sự [1] đề xuất, kết hợp truy xuất tài liệu với mô hình sinh cho các tác vụ đòi hỏi tri thức. Về biểu diễn câu, Sentence-BERT [4] cho thấy tinh chỉnh BERT theo kiến trúc Siamese cải thiện rõ chất lượng đo tương đồng câu. Đối với tiếng Việt, PhoBERT [2] là mô hình nền tảng; trên cơ sở đó các mô hình bi-encoder như vietnamese-bi-encoder [7] và bộ xếp hạng PhoRanker [8] được phát triển cho tìm kiếm và xếp hạng. Về sinh ngôn ngữ tiếng Việt, PhoGPT [3] là một trong các LLM mở quy mô vừa, phù hợp triển khai cục bộ sau lượng tử hóa. Về kỹ thuật truy xuất, BM25 [5] vẫn là chuẩn mạnh cho tìm kiếm từ vựng; việc kết hợp tín hiệu từ vựng và ngữ nghĩa bằng RRF [6] thường vượt trội từng phương pháp đơn lẻ. Đề tài kế thừa các nền tảng này và đóng góp ở khía cạnh tích hợp, tối ưu cho miền pháp luật y tế tiếng Việt trên tài nguyên hạn chế, kèm cơ chế nhận diện số hiệu văn bản.</w:t>
+      </w:r>
+    </w:p>
+    <w:p>
+      <w:pPr>
+        <w:pStyle w:val="Heading2"/>
+        <w:keepNext/>
+        <w:spacing w:before="120" w:after="240" w:line="240" w:lineRule="auto"/>
+        <w:jc w:val="left"/>
+      </w:pPr>
+      <w:r>
+        <w:rPr>
+          <w:rFonts w:ascii="Times New Roman" w:hAnsi="Times New Roman" w:cs="Times New Roman"/>
+          <w:b/>
+          <w:i w:val="0"/>
+          <w:color w:val="000000"/>
+          <w:sz w:val="26"/>
+        </w:rPr>
+        <w:t>1.10 Kết luận chương</w:t>
+      </w:r>
+    </w:p>
+    <w:p>
+      <w:pPr>
+        <w:spacing w:before="200" w:after="0" w:line="360" w:lineRule="auto"/>
+        <w:jc w:val="both"/>
+      </w:pPr>
+      <w:r>
+        <w:rPr>
+          <w:rFonts w:ascii="Times New Roman" w:hAnsi="Times New Roman" w:cs="Times New Roman"/>
+          <w:b w:val="0"/>
+          <w:i w:val="0"/>
+          <w:sz w:val="26"/>
+        </w:rPr>
+        <w:t>Chương 1 đã xác lập bài toán, mục tiêu và bốn câu hỏi nghiên cứu, đồng thời phân tích nền tảng lý thuyết của một hệ RAG tiếng Việt: vì sao chọn RAG thay cho LLM thuần hay tinh chỉnh, vai trò của embedding, cơ sở dữ liệu vector, tìm kiếm hybrid, reranker và mô hình sinh, cùng các độ đo đánh giá. Những phân tích này là căn cứ trực tiếp cho việc lựa chọn công nghệ và thiết kế hệ thống được trình bày ở Chương 2.</w:t>
       </w:r>
     </w:p>
     <w:p>
@@ -3014,6 +3197,21 @@
           <w:caps w:val="true"/>
         </w:rPr>
         <w:t>CHƯƠNG 2 DỮ LIỆU VÀ THIẾT KẾ HỆ THỐNG</w:t>
+      </w:r>
+    </w:p>
+    <w:p>
+      <w:pPr>
+        <w:spacing w:before="200" w:after="0" w:line="360" w:lineRule="auto"/>
+        <w:jc w:val="both"/>
+      </w:pPr>
+      <w:r>
+        <w:rPr>
+          <w:rFonts w:ascii="Times New Roman" w:hAnsi="Times New Roman" w:cs="Times New Roman"/>
+          <w:b w:val="0"/>
+          <w:i w:val="0"/>
+          <w:sz w:val="26"/>
+        </w:rPr>
+        <w:t>Tiếp nối nền tảng lý thuyết ở Chương 1, Chương 2 trình bày khâu dữ liệu và quyết định thiết kế của hệ thống: nguồn dữ liệu và cách lọc theo ngành/hiệu lực, quy trình làm sạch và phân đoạn theo đơn vị ngữ nghĩa pháp lý, khử trùng lặp và thống kê corpus, các bài học từ kiểm định dữ liệu, và việc lựa chọn từng thành phần công nghệ. Chất lượng của khâu này quyết định trực tiếp hiệu quả truy xuất được đo ở Chương 4.</w:t>
       </w:r>
     </w:p>
     <w:p>
@@ -3183,7 +3381,7 @@
           <w:i w:val="0"/>
           <w:sz w:val="26"/>
         </w:rPr>
-        <w:t>Nội dung gốc là văn bản thuần, còn giữ dấu xuống dòng và các mốc “Điều”, “Chương”. Bước làm sạch gồm bốn phép biến đổi có chủ đích: (1) loại ký tự xuống dòng kiểu Windows và ký tự ngăn cột đặc thù của dataset; (2) gộp các khoảng trắng/tab liên tiếp thành một; (3) cắt khoảng trắng quanh dấu xuống dòng và gộp từ ba dòng trống trở lên thành hai; (4) GIỮ NGUYÊN cấu trúc xuống dòng và các ký tự “/ - ( ) %”.</w:t>
+        <w:t>Nội dung gốc là văn bản thuần, còn giữ dấu xuống dòng và các mốc “Điều”, “Chương”. Bước làm sạch gồm bốn phép biến đổi có chủ đích: (1) loại ký tự xuống dòng kiểu Windows và ký tự ngăn cột đặc thù của dataset; (2) gộp các khoảng trắng/tab liên tiếp thành một; (3) cắt khoảng trắng quanh dấu xuống dòng và gộp từ ba dòng trống trở lên thành hai; (4) giữ nguyên cấu trúc xuống dòng và các ký tự “/ - ( ) %”.</w:t>
       </w:r>
     </w:p>
     <w:p>
@@ -4386,6 +4584,39 @@
     </w:p>
     <w:p>
       <w:pPr>
+        <w:pStyle w:val="Heading2"/>
+        <w:keepNext/>
+        <w:spacing w:before="120" w:after="240" w:line="240" w:lineRule="auto"/>
+        <w:jc w:val="left"/>
+      </w:pPr>
+      <w:r>
+        <w:rPr>
+          <w:rFonts w:ascii="Times New Roman" w:hAnsi="Times New Roman" w:cs="Times New Roman"/>
+          <w:b/>
+          <w:i w:val="0"/>
+          <w:color w:val="000000"/>
+          <w:sz w:val="26"/>
+        </w:rPr>
+        <w:t>2.8 Kết luận chương</w:t>
+      </w:r>
+    </w:p>
+    <w:p>
+      <w:pPr>
+        <w:spacing w:before="200" w:after="0" w:line="360" w:lineRule="auto"/>
+        <w:jc w:val="both"/>
+      </w:pPr>
+      <w:r>
+        <w:rPr>
+          <w:rFonts w:ascii="Times New Roman" w:hAnsi="Times New Roman" w:cs="Times New Roman"/>
+          <w:b w:val="0"/>
+          <w:i w:val="0"/>
+          <w:sz w:val="26"/>
+        </w:rPr>
+        <w:t>Chương 2 đã xây dựng kho tri thức sạch gồm 367.462 đoạn từ 21.490 văn bản còn hiệu lực, với quy trình lọc, làm sạch và phân đoạn theo đơn vị Điều có chủ đích, đồng thời rút ra bài học từ việc kiểm định và sửa lỗi pipeline ban đầu. Chương cũng giải thích lựa chọn từng thành phần công nghệ theo hai tiêu chí phù hợp tiếng Việt và chạy được trong giới hạn tài nguyên. Trên nền thiết kế đó, Chương 3 trình bày cách hiện thực hóa thành các module và giao diện hoàn chỉnh.</w:t>
+      </w:r>
+    </w:p>
+    <w:p>
+      <w:pPr>
         <w:pStyle w:val="Heading1"/>
         <w:keepNext/>
         <w:pageBreakBefore/>
@@ -4402,6 +4633,21 @@
           <w:caps w:val="true"/>
         </w:rPr>
         <w:t>CHƯƠNG 3 TRIỂN KHAI HỆ THỐNG</w:t>
+      </w:r>
+    </w:p>
+    <w:p>
+      <w:pPr>
+        <w:spacing w:before="200" w:after="0" w:line="360" w:lineRule="auto"/>
+        <w:jc w:val="both"/>
+      </w:pPr>
+      <w:r>
+        <w:rPr>
+          <w:rFonts w:ascii="Times New Roman" w:hAnsi="Times New Roman" w:cs="Times New Roman"/>
+          <w:b w:val="0"/>
+          <w:i w:val="0"/>
+          <w:sz w:val="26"/>
+        </w:rPr>
+        <w:t>Dựa trên thiết kế ở Chương 2, Chương 3 mô tả việc hiện thực hóa hệ thống: tổ chức các module, quy trình lập chỉ mục có khả năng phục hồi, module truy vấn hybrid kèm nhận diện số hiệu, module sinh và thiết kế prompt, backend cùng giao diện web, và pipeline truy xuất nâng cao cùng quy trình huấn luyện reranker. Đây là cầu nối giữa thiết kế và phần thực nghiệm đánh giá ở Chương 4.</w:t>
       </w:r>
     </w:p>
     <w:p>
@@ -4969,7 +5215,7 @@
           <w:i w:val="0"/>
           <w:sz w:val="26"/>
         </w:rPr>
-        <w:t>Prompt đưa vào PhoGPT tuân theo định dạng hội thoại gốc của mô hình (### Câu hỏi: … ### Trả lời:) và gồm ba phần: (i) chỉ dẫn hệ thống, “CHỈ dựa vào các văn bản được cung cấp để trả lời. Luôn trích dẫn số hiệu văn bản. Nếu thông tin không có trong văn bản, hãy nói rõ là không tìm thấy.”; (ii) ngữ cảnh, k đoạn truy xuất được, mỗi đoạn đánh số [1], [2]… kèm số hiệu và tiêu đề nguồn; (iii) câu hỏi của người dùng. Ba ràng buộc trong chỉ dẫn nhắm vào ba rủi ro: “chỉ dựa vào văn bản” chống bịa từ trí nhớ tham số; “luôn trích dẫn số hiệu” buộc câu trả lời kiểm chứng được; “nói rõ khi không tìm thấy” chống trả lời gượng ép khi ngữ cảnh không đủ.</w:t>
+        <w:t>Prompt đưa vào PhoGPT tuân theo đúng khuôn mẫu hội thoại mà mô hình được huấn luyện, gồm phần đánh dấu câu hỏi và phần đánh dấu câu trả lời theo quy ước của PhoGPT. Nội dung prompt gồm ba phần. Thứ nhất là chỉ dẫn hệ thống, yêu cầu mô hình chỉ dựa vào các văn bản được cung cấp để trả lời, luôn trích dẫn số hiệu văn bản, và nói rõ khi không tìm thấy thông tin. Thứ hai là ngữ cảnh, gồm k đoạn truy xuất được, mỗi đoạn đánh số thứ tự kèm số hiệu và tiêu đề nguồn. Thứ ba là câu hỏi của người dùng. Ba ràng buộc trong chỉ dẫn nhắm vào ba rủi ro tương ứng: ràng buộc chỉ dựa vào văn bản nhằm chống bịa đặt từ trí nhớ tham số; ràng buộc luôn trích dẫn số hiệu buộc câu trả lời phải kiểm chứng được; ràng buộc nói rõ khi không tìm thấy nhằm chống trả lời gượng ép khi ngữ cảnh không đủ.</w:t>
       </w:r>
     </w:p>
     <w:p>
@@ -5448,7 +5694,7 @@
           <w:i w:val="0"/>
           <w:sz w:val="26"/>
         </w:rPr>
-        <w:t>Ngoài pipeline cơ sở (Mục 3.3), đề tài triển khai một pipeline truy xuất nâng cao, kết quả của các thí nghiệm ở Chương 4, nhằm xử lý câu hỏi diễn đạt tự nhiên. Luồng xử lý gồm bốn bước nối tiếp: (1) MỞ RỘNG TRUY VẤN bằng từ điển ánh xạ đời thường → pháp lý (nối thêm thuật ngữ chuẩn khi câu hỏi khớp một cụm đời thường); (2) MỞ RỘNG NGỮ NGHĨA, mã hóa câu hỏi bằng bge-m3, tìm trong một lexicon gồm 12.839 cụm thuật ngữ pháp lý (tiêu đề các Điều, đã mã hóa sẵn) ra top-3 cụm gần nhất rồi nối vào truy vấn; (3) TRUY XUẤT bằng bge-m3 trên chỉ mục vector (collection riêng, mã hóa văn bản thô); (4) XẾP HẠNG LẠI 30 ứng viên đầu bằng reranker đã tinh chỉnh để chọn k đoạn tốt nhất, trước khi đưa sang PhoGPT sinh câu trả lời. Hai bước (1)–(2) là kỹ thuật xác định, không cần huấn luyện; chúng được bật/tắt qua biến môi trường để so sánh.</w:t>
+        <w:t>Ngoài pipeline cơ sở (Mục 3.3), đề tài triển khai một pipeline truy xuất nâng cao, kết quả của các thí nghiệm ở Chương 4, nhằm xử lý câu hỏi diễn đạt tự nhiên. Luồng xử lý gồm bốn bước nối tiếp: (1) mở rộng truy vấn bằng từ điển ánh xạ đời thường → pháp lý (nối thêm thuật ngữ chuẩn khi câu hỏi khớp một cụm đời thường); (2) mở rộng ngữ nghĩa, mã hóa câu hỏi bằng bge-m3, tìm trong một lexicon gồm 12.839 cụm thuật ngữ pháp lý (tiêu đề các Điều, đã mã hóa sẵn) ra top-3 cụm gần nhất rồi nối vào truy vấn; (3) truy xuất bằng bge-m3 trên chỉ mục vector (collection riêng, mã hóa văn bản thô); (4) xếp hạng lại 30 ứng viên đầu bằng reranker đã tinh chỉnh để chọn k đoạn tốt nhất, trước khi đưa sang PhoGPT sinh câu trả lời. Hai bước (1)–(2) là kỹ thuật xác định, không cần huấn luyện; chúng được bật/tắt qua biến môi trường để so sánh.</w:t>
       </w:r>
     </w:p>
     <w:p>
@@ -5463,7 +5709,40 @@
           <w:i w:val="0"/>
           <w:sz w:val="26"/>
         </w:rPr>
-        <w:t>Quy trình huấn luyện reranker (Mục 4.17) gồm bốn giai đoạn, thực hiện trên GPU: (a) DỰNG DỮ LIỆU, với mỗi câu hỏi đời thường trong tập huấn luyện, truy xuất 30 ứng viên bằng bge-m3, gán nhãn dương cho đoạn thuộc văn bản đúng và nhãn âm cho ứng viên hạng cao thuộc văn bản khác (mẫu âm khó), thu được khoảng 1.357 cặp; (b) TINH CHỈNH cross-encoder PhoRanker theo mất mát entropy chéo nhị phân (công thức 1-6), 2 epoch; (c) ĐÁNH GIÁ trên tập kiểm thử giữ riêng; (d) KIỂM CHỨNG CHÉO 5-fold để xác nhận tính ổn định. Lưu ý kỹ thuật: việc tinh chỉnh bge-reranker-v2-m3 (568 triệu tham số) vượt giới hạn 8GB VRAM do trạng thái bộ tối ưu Adam, nên đề tài tinh chỉnh PhoRanker (135 triệu tham số), vừa tài nguyên mà vẫn đạt hiệu quả cao. Toàn bộ mã huấn luyện và dữ liệu đặt trong thư mục train/ (Phụ lục 2).</w:t>
+        <w:t>Quy trình huấn luyện reranker (Mục 4.17) gồm bốn giai đoạn, thực hiện trên GPU: (a) dựng dữ liệu, với mỗi câu hỏi đời thường trong tập huấn luyện, truy xuất 30 ứng viên bằng bge-m3, gán nhãn dương cho đoạn thuộc văn bản đúng và nhãn âm cho ứng viên hạng cao thuộc văn bản khác (mẫu âm khó), thu được khoảng 1.357 cặp; (b) tinh chỉnh cross-encoder PhoRanker theo mất mát entropy chéo nhị phân (công thức 1-6), 2 epoch; (c) đánh giá trên tập kiểm thử giữ riêng; (d) kiểm chứng chéo 5-fold để xác nhận tính ổn định. Lưu ý kỹ thuật: việc tinh chỉnh bge-reranker-v2-m3 (568 triệu tham số) vượt giới hạn 8GB VRAM do trạng thái bộ tối ưu Adam, nên đề tài tinh chỉnh PhoRanker (135 triệu tham số), vừa tài nguyên mà vẫn đạt hiệu quả cao. Toàn bộ mã huấn luyện và dữ liệu đặt trong thư mục train/ (Phụ lục 2).</w:t>
+      </w:r>
+    </w:p>
+    <w:p>
+      <w:pPr>
+        <w:pStyle w:val="Heading2"/>
+        <w:keepNext/>
+        <w:spacing w:before="120" w:after="240" w:line="240" w:lineRule="auto"/>
+        <w:jc w:val="left"/>
+      </w:pPr>
+      <w:r>
+        <w:rPr>
+          <w:rFonts w:ascii="Times New Roman" w:hAnsi="Times New Roman" w:cs="Times New Roman"/>
+          <w:b/>
+          <w:i w:val="0"/>
+          <w:color w:val="000000"/>
+          <w:sz w:val="26"/>
+        </w:rPr>
+        <w:t>3.7 Kết luận chương</w:t>
+      </w:r>
+    </w:p>
+    <w:p>
+      <w:pPr>
+        <w:spacing w:before="200" w:after="0" w:line="360" w:lineRule="auto"/>
+        <w:jc w:val="both"/>
+      </w:pPr>
+      <w:r>
+        <w:rPr>
+          <w:rFonts w:ascii="Times New Roman" w:hAnsi="Times New Roman" w:cs="Times New Roman"/>
+          <w:b w:val="0"/>
+          <w:i w:val="0"/>
+          <w:sz w:val="26"/>
+        </w:rPr>
+        <w:t>Chương 3 đã hiện thực hóa đầy đủ hệ thống: từ lập chỉ mục 367.462 đoạn (có khả năng phục hồi), module truy vấn hybrid kèm nhận diện số hiệu, module sinh có ràng buộc trích dẫn, đến backend FastAPI và giao diện web chạy offline; ngoài ra còn pipeline nâng cao và quy trình huấn luyện reranker. Toàn bộ cấu hình điều khiển qua biến môi trường, thuận tiện cho việc so sánh có đối chứng ở Chương 4.</w:t>
       </w:r>
     </w:p>
     <w:p>
@@ -5484,6 +5763,21 @@
           <w:caps w:val="true"/>
         </w:rPr>
         <w:t>CHƯƠNG 4 THỬ NGHIỆM VÀ ĐÁNH GIÁ</w:t>
+      </w:r>
+    </w:p>
+    <w:p>
+      <w:pPr>
+        <w:spacing w:before="200" w:after="0" w:line="360" w:lineRule="auto"/>
+        <w:jc w:val="both"/>
+      </w:pPr>
+      <w:r>
+        <w:rPr>
+          <w:rFonts w:ascii="Times New Roman" w:hAnsi="Times New Roman" w:cs="Times New Roman"/>
+          <w:b w:val="0"/>
+          <w:i w:val="0"/>
+          <w:sz w:val="26"/>
+        </w:rPr>
+        <w:t>Chương 4 đánh giá hệ thống đã triển khai ở Chương 3 và trả lời bốn câu hỏi nghiên cứu nêu ở Chương 1. Trước hết là thiết lập thực nghiệm và bộ câu hỏi đánh giá, sau đó là chuỗi thí nghiệm có đối chứng đo đóng góp của từng kỹ thuật (CHNC 2), kiểm chứng tính ổn định ở quy mô lớn (CHNC 4), và đặc biệt là việc xử lý câu hỏi diễn đạt tự nhiên cùng các kỹ thuật thu hẹp khoảng cách từ vựng (CHNC 3). Mỗi mục nêu rõ mục đích, số liệu và phân tích, kể cả các kết quả chưa thành công.</w:t>
       </w:r>
     </w:p>
     <w:p>
@@ -6357,7 +6651,7 @@
           <w:color w:val="000000"/>
           <w:sz w:val="26"/>
         </w:rPr>
-        <w:t>4.3 Thí nghiệm 1 — Vai trò của tách từ tiếng Việt</w:t>
+        <w:t>4.3 Thí nghiệm 1: Vai trò của tách từ tiếng Việt</w:t>
       </w:r>
     </w:p>
     <w:p>
@@ -6390,7 +6684,7 @@
           <w:color w:val="000000"/>
           <w:sz w:val="26"/>
         </w:rPr>
-        <w:t>4.4 Thí nghiệm 2 — Đóng góp của reranker</w:t>
+        <w:t>4.4 Thí nghiệm 2: Đóng góp của reranker</w:t>
       </w:r>
     </w:p>
     <w:p>
@@ -6423,7 +6717,7 @@
           <w:color w:val="000000"/>
           <w:sz w:val="26"/>
         </w:rPr>
-        <w:t>4.5 Thí nghiệm 3 — Ảnh hưởng của kích thước chunk</w:t>
+        <w:t>4.5 Thí nghiệm 3: Ảnh hưởng của kích thước chunk</w:t>
       </w:r>
     </w:p>
     <w:p>
@@ -6973,7 +7267,7 @@
           <w:color w:val="000000"/>
           <w:sz w:val="26"/>
         </w:rPr>
-        <w:t>4.6 Thí nghiệm 4 — Truy xuất hybrid</w:t>
+        <w:t>4.6 Thí nghiệm 4: Truy xuất hybrid</w:t>
       </w:r>
     </w:p>
     <w:p>
@@ -9220,7 +9514,7 @@
           <w:i w:val="0"/>
           <w:sz w:val="26"/>
         </w:rPr>
-        <w:t>Phần sinh được khảo sát định tính (KHÔNG phải đánh giá thống kê) trên một mẫu nhỏ gồm 6 câu hỏi, rà soát thủ công, mang tính minh họa. Trên mẫu này, cả 6 câu trả lời đều trích dẫn đúng ít nhất một văn bản liên quan trong số nguồn truy xuất, bám sát điều luật cụ thể (ví dụ Điều 19 Luật Khám bệnh, chữa bệnh; Điều 33 và Điều 79 Luật Dược) và không bịa thông tin ngoài ngữ cảnh. Hạn chế quan sát được: mô hình thỉnh thoảng nêu chi tiết phụ chưa chính xác (một câu trả lời nhắc “Luật Khám bệnh, chữa bệnh 2009” trong khi nguồn trích dẫn là Luật 15/2023/QH15), dù nguồn dẫn vẫn đúng.</w:t>
+        <w:t>Phần sinh được khảo sát định tính (không phải đánh giá thống kê) trên một mẫu nhỏ gồm 6 câu hỏi, rà soát thủ công, mang tính minh họa. Trên mẫu này, cả 6 câu trả lời đều trích dẫn đúng ít nhất một văn bản liên quan trong số nguồn truy xuất, bám sát điều luật cụ thể (ví dụ Điều 19 Luật Khám bệnh, chữa bệnh; Điều 33 và Điều 79 Luật Dược) và không bịa thông tin ngoài ngữ cảnh. Hạn chế quan sát được: mô hình thỉnh thoảng nêu chi tiết phụ chưa chính xác (một câu trả lời nhắc “Luật Khám bệnh, chữa bệnh 2009” trong khi nguồn trích dẫn là Luật 15/2023/QH15), dù nguồn dẫn vẫn đúng.</w:t>
       </w:r>
     </w:p>
     <w:p>
@@ -9235,7 +9529,7 @@
           <w:i w:val="0"/>
           <w:sz w:val="26"/>
         </w:rPr>
-        <w:t>Cần nhấn mạnh: do mẫu chỉ có n = 6, con số “đúng trích dẫn” ở đây KHÔNG có ý nghĩa thống kê, chỉ minh họa rằng ràng buộc trích dẫn trong prompt có tác dụng. Đánh giá phần sinh ở quy mô lớn theo các tiêu chí định lượng (độ trung thực/faithfulness, độ chính xác trích dẫn, tỷ lệ bịa đặt) là một khoảng trống được nêu rõ trong hạn chế và hướng phát triển (Mục 5.3, 5.4).</w:t>
+        <w:t>Cần nhấn mạnh: do mẫu chỉ có n = 6, con số “đúng trích dẫn” ở đây không có ý nghĩa thống kê, chỉ minh họa rằng ràng buộc trích dẫn trong prompt có tác dụng. Đánh giá phần sinh ở quy mô lớn theo các tiêu chí định lượng (độ trung thực/faithfulness, độ chính xác trích dẫn, tỷ lệ bịa đặt) là một khoảng trống được nêu rõ trong hạn chế và hướng phát triển (Mục 5.3, 5.4).</w:t>
       </w:r>
     </w:p>
     <w:p>
@@ -9743,7 +10037,7 @@
           <w:color w:val="000000"/>
           <w:sz w:val="26"/>
         </w:rPr>
-        <w:t>4.12.1 Vấn đề thứ nhất — khoảng cách từ vựng (lexical gap)</w:t>
+        <w:t>4.12.1 Vấn đề thứ nhất: khoảng cách từ vựng (lexical gap)</w:t>
       </w:r>
     </w:p>
     <w:p>
@@ -9907,7 +10201,7 @@
           <w:color w:val="000000"/>
           <w:sz w:val="26"/>
         </w:rPr>
-        <w:t>4.12.2 Vấn đề thứ hai — độ nghiêm ngặt của nhãn (ground-truth)</w:t>
+        <w:t>4.12.2 Vấn đề thứ hai: độ nghiêm ngặt của nhãn (ground-truth)</w:t>
       </w:r>
     </w:p>
     <w:p>
@@ -9922,7 +10216,7 @@
           <w:i w:val="0"/>
           <w:sz w:val="26"/>
         </w:rPr>
-        <w:t>Một phần đáng kể các câu “trượt” theo nhãn nghiêm ngặt thực ra KHÔNG phải do truy xuất sai. Khi soi kết quả, văn bản top-1 trả về thường là nghị định/thông tư HƯỚNG DẪN chính luật được hỏi, đúng nhu cầu thực tế của người dùng, nhưng nhãn ground-truth chỉ ghi luật gốc nên bị tính là trượt. Ví dụ: câu hỏi về điều kiện hành nghề của bác sĩ (nhãn: Luật Khám bệnh, chữa bệnh 15/2023/QH15) trả về top-1 là Nghị định 96/2023/NĐ-CP, nghị định hướng dẫn chính luật đó; câu về quyền lợi bảo hiểm y tế trả về Nghị định 188/2025/NĐ-CP hướng dẫn Luật Bảo hiểm y tế. Với người dùng, nghị định hướng dẫn thường còn hữu ích HƠN luật gốc vì quy định chi tiết, cụ thể hơn.</w:t>
+        <w:t>Một phần đáng kể các câu “trượt” theo nhãn nghiêm ngặt thực ra không phải do truy xuất sai. Khi soi kết quả, văn bản top-1 trả về thường là nghị định/thông tư hướng dẫn chính luật được hỏi, đúng nhu cầu thực tế của người dùng, nhưng nhãn ground-truth chỉ ghi luật gốc nên bị tính là trượt. Ví dụ: câu hỏi về điều kiện hành nghề của bác sĩ (nhãn: Luật Khám bệnh, chữa bệnh 15/2023/QH15) trả về top-1 là Nghị định 96/2023/NĐ-CP, nghị định hướng dẫn chính luật đó; câu về quyền lợi bảo hiểm y tế trả về Nghị định 188/2025/NĐ-CP hướng dẫn Luật Bảo hiểm y tế. Với người dùng, nghị định hướng dẫn thường còn hữu ích hơn luật gốc vì quy định chi tiết, cụ thể hơn.</w:t>
       </w:r>
     </w:p>
     <w:p>
@@ -9937,7 +10231,7 @@
           <w:i w:val="0"/>
           <w:sz w:val="26"/>
         </w:rPr>
-        <w:t>Hệ quả phương pháp: con số 0,160 (nhãn nghiêm ngặt) là CẬN DƯỚI của chất lượng cảm nhận thực tế. Khi đánh giá bổ sung theo mức liên quan-chủ-đề (topic-level relevance, chấp nhận cả văn bản hướng dẫn/hợp nhất nhắc đích danh tên luật, một thực hành chuẩn trong truy hồi thông tin với nhãn phân cấp), cấu hình tốt nhất đạt Hit@10 khoảng 0,74 (chi tiết ở Mục 4.14), phản ánh đúng hơn năng lực thực của hệ thống. Như vậy, một phần “khoảng cách” quan sát được là do thước đo quá hẹp, không phải do hệ thống yếu.</w:t>
+        <w:t>Hệ quả phương pháp: con số 0,160 (nhãn nghiêm ngặt) là cận dưới của chất lượng cảm nhận thực tế. Khi đánh giá bổ sung theo mức liên quan-chủ-đề (topic-level relevance, chấp nhận cả văn bản hướng dẫn/hợp nhất nhắc đích danh tên luật, một thực hành chuẩn trong truy hồi thông tin với nhãn phân cấp), cấu hình tốt nhất đạt Hit@10 khoảng 0,74 (chi tiết ở Mục 4.14), phản ánh đúng hơn năng lực thực của hệ thống. Như vậy, một phần “khoảng cách” quan sát được là do thước đo quá hẹp, không phải do hệ thống yếu.</w:t>
       </w:r>
     </w:p>
     <w:p>
@@ -9955,7 +10249,7 @@
           <w:color w:val="000000"/>
           <w:sz w:val="26"/>
         </w:rPr>
-        <w:t>4.13 Thí nghiệm 5 — Viết lại truy vấn bằng LLM</w:t>
+        <w:t>4.13 Thí nghiệm 5: Viết lại truy vấn bằng LLM</w:t>
       </w:r>
     </w:p>
     <w:p>
@@ -10505,7 +10799,7 @@
           <w:color w:val="000000"/>
           <w:sz w:val="26"/>
         </w:rPr>
-        <w:t>4.14 Thí nghiệm 6 — Từ điển ánh xạ và HyDE</w:t>
+        <w:t>4.14 Thí nghiệm 6: Từ điển ánh xạ và HyDE</w:t>
       </w:r>
     </w:p>
     <w:p>
@@ -10520,7 +10814,7 @@
           <w:i w:val="0"/>
           <w:sz w:val="26"/>
         </w:rPr>
-        <w:t>Từ kết quả âm của viết lại bằng LLM (Mục 4.13), đề tài thử hai hướng khác trên toàn bộ 100 câu diễn đạt tự nhiên (cấu hình Hybrid + Reranker): (i) Từ điển ánh xạ, một bộ từ điển kiểm soát từ vựng ánh xạ cụm từ đời thường sang thuật ngữ pháp lý (ví dụ “quán ăn” → “cơ sở kinh doanh dịch vụ ăn uống”; “quầy thuốc” → “cơ sở bán lẻ thuốc”), nối thêm thuật ngữ vào câu hỏi trước khi truy xuất, cơ chế xác định, không phụ thuộc LLM; (ii) HyDE (Hypothetical Document Embeddings), dùng PhoGPT sinh một đoạn trả lời giả định rồi dùng đoạn đó để truy xuất (Bảng 4.8).</w:t>
+        <w:t>Từ kết quả âm của viết lại bằng LLM (Mục 4.13), đề tài thử hai hướng khác trên toàn bộ 100 câu diễn đạt tự nhiên (cấu hình Hybrid + Reranker): (i) Từ điển ánh xạ, một bộ từ điển kiểm soát từ vựng ánh xạ cụm từ đời thường sang thuật ngữ pháp lý (ví dụ “quán ăn” → “cơ sở kinh doanh dịch vụ ăn uống”; “quầy thuốc” → “cơ sở bán lẻ thuốc”), nối thêm thuật ngữ vào câu hỏi trước khi truy xuất, cơ chế xác định, không phụ thuộc LLM; (ii) HyDE (Hypothetical Document Embeddings) [16], dùng PhoGPT sinh một đoạn trả lời giả định rồi dùng đoạn đó để truy xuất (Bảng 4.8).</w:t>
       </w:r>
     </w:p>
     <w:p>
@@ -11153,7 +11447,7 @@
           <w:i w:val="0"/>
           <w:sz w:val="26"/>
         </w:rPr>
-        <w:t>Kết quả phân hóa rõ. Từ điển ánh xạ cải thiện thực sự: Hit@1 tăng 0,160 → 0,230 (tăng tương đối 44%), MRR tăng 0,283 → 0,362; phân tích chi tiết cho thấy 15 câu chuyển từ trượt sang đúng ở hạng 1 (so với 8 câu bị kéo lệch, ròng +7). Ngược lại, HyDE làm GIẢM hiệu năng (Hit@1 còn 0,090): soi các đoạn giả định cho thấy PhoGPT-4B chèn số hiệu văn bản tự bịa (ví dụ “Nghị định 54/2017/NĐ-CP”, “Nghị định 43/2017/NĐ-CP”) khiến embedding bị “cướp lái” về văn bản mô hình tự nhớ thay vì văn bản đích; khi kết hợp, nhiễu của HyDE triệt tiêu lợi ích của từ điển. Mạch chung với Thí nghiệm 5: mọi kỹ thuật phía truy vấn dựa trên LLM (viết lại, HyDE) đều thất bại do hạn chế của mô hình 3,7 tỷ tham số, trong khi giải pháp kỹ thuật xác định (từ điển) lại thắng, một bài học có giá trị về lựa chọn công cụ phù hợp tài nguyên.</w:t>
+        <w:t>Kết quả phân hóa rõ. Từ điển ánh xạ cải thiện thực sự: Hit@1 tăng 0,160 → 0,230 (tăng tương đối 44%), MRR tăng 0,283 → 0,362; phân tích chi tiết cho thấy 15 câu chuyển từ trượt sang đúng ở hạng 1 (so với 8 câu bị kéo lệch, ròng +7). Ngược lại, HyDE làm giảm hiệu năng (Hit@1 còn 0,090): soi các đoạn giả định cho thấy PhoGPT-4B chèn số hiệu văn bản tự bịa (ví dụ “Nghị định 54/2017/NĐ-CP”, “Nghị định 43/2017/NĐ-CP”) khiến embedding bị “cướp lái” về văn bản mô hình tự nhớ thay vì văn bản đích; khi kết hợp, nhiễu của HyDE triệt tiêu lợi ích của từ điển. Mạch chung với Thí nghiệm 5: mọi kỹ thuật phía truy vấn dựa trên LLM (viết lại, HyDE) đều thất bại do hạn chế của mô hình 3,7 tỷ tham số, trong khi giải pháp kỹ thuật xác định (từ điển) lại thắng, một bài học có giá trị về lựa chọn công cụ phù hợp tài nguyên.</w:t>
       </w:r>
     </w:p>
     <w:p>
@@ -11168,7 +11462,7 @@
           <w:i w:val="0"/>
           <w:sz w:val="26"/>
         </w:rPr>
-        <w:t>Một phân tích phương pháp quan trọng: phần lớn các câu vẫn “trượt” theo nhãn nghiêm ngặt thực ra trả về đúng văn bản dưới luật hướng dẫn chính luật được hỏi (ví dụ Nghị định 96/2023/NĐ-CP hướng dẫn Luật Khám bệnh, chữa bệnh; Nghị định 188/2025/NĐ-CP hướng dẫn Luật Bảo hiểm y tế), đúng nhu cầu thực tế nhưng không trùng nhãn luật gốc. Khi đánh giá theo mức liên quan-chủ-đề (topic-level: chấp nhận cả văn bản hướng dẫn/hợp nhất nhắc đích danh tên luật, một thực hành chuẩn trong truy hồi thông tin), cấu hình từ điển đạt Hit@10 khoảng 0,74 và Hit@1 0,35. Như vậy con số 0,160 theo nhãn nghiêm ngặt là CẬN DƯỚI của chất lượng cảm nhận thực tế, phản ánh độ hẹp của nhãn chứ không phải lỗi truy xuất.</w:t>
+        <w:t>Một phân tích phương pháp quan trọng: phần lớn các câu vẫn “trượt” theo nhãn nghiêm ngặt thực ra trả về đúng văn bản dưới luật hướng dẫn chính luật được hỏi (ví dụ Nghị định 96/2023/NĐ-CP hướng dẫn Luật Khám bệnh, chữa bệnh; Nghị định 188/2025/NĐ-CP hướng dẫn Luật Bảo hiểm y tế), đúng nhu cầu thực tế nhưng không trùng nhãn luật gốc. Khi đánh giá theo mức liên quan-chủ-đề (topic-level: chấp nhận cả văn bản hướng dẫn/hợp nhất nhắc đích danh tên luật, một thực hành chuẩn trong truy hồi thông tin), cấu hình từ điển đạt Hit@10 khoảng 0,74 và Hit@1 0,35. Như vậy con số 0,160 theo nhãn nghiêm ngặt là cận dưới của chất lượng cảm nhận thực tế, phản ánh độ hẹp của nhãn chứ không phải lỗi truy xuất.</w:t>
       </w:r>
     </w:p>
     <w:p>
@@ -11242,7 +11536,7 @@
           <w:color w:val="000000"/>
           <w:sz w:val="26"/>
         </w:rPr>
-        <w:t>4.15 Thí nghiệm 7 — Tinh chỉnh bộ mã hóa (proof-of-concept)</w:t>
+        <w:t>4.15 Thí nghiệm 7: Tinh chỉnh bộ mã hóa (proof-of-concept)</w:t>
       </w:r>
     </w:p>
     <w:p>
@@ -11793,7 +12087,7 @@
           <w:i w:val="0"/>
           <w:sz w:val="26"/>
         </w:rPr>
-        <w:t>Kết quả là một kết quả âm dứt khoát: tinh chỉnh nhỏ không cải thiện (ngang mô hình gốc trong khoảng nhiễu), còn tinh chỉnh lớn làm GIẢM mạnh hiệu năng (MRR 0,301 → 0,136, giảm hơn một nửa). Nguyên nhân được phân tích: (i) dữ liệu tuy lớn nhưng vẫn là câu hỏi HÌNH THỨC sinh từ tiêu đề Điều, không phải câu đời thường, nên kéo mô hình lệch khỏi phân bố câu người dân hỏi; (ii) hiện tượng quên thảm họa (catastrophic forgetting), bộ mã hóa nền vốn đã được huấn luyện tốt, việc tinh chỉnh một epoch với negatives khó làm hỏng cấu trúc ngữ nghĩa sẵn có; (iii) giới hạn độ dài chuỗi để khả thi trên CPU. Bài học khoa học: đòn bẩy đúng không phải “nhiều dữ liệu hình thức” mà là ĐÚNG LOẠI dữ liệu, câu hỏi đời thường có gán nhãn quy mô lớn, cùng tài nguyên huấn luyện phù hợp (GPU, độ dài chuỗi đầy đủ, nhiều epoch kèm dừng sớm theo tập kiểm định). Đây là cơ sở thực nghiệm trực tiếp cho hướng phát triển ở Chương 5, thay vì một đề xuất suy đoán.</w:t>
+        <w:t>Kết quả là một kết quả âm dứt khoát: tinh chỉnh nhỏ không cải thiện (ngang mô hình gốc trong khoảng nhiễu), còn tinh chỉnh lớn làm giảm mạnh hiệu năng (MRR 0,301 → 0,136, giảm hơn một nửa). Nguyên nhân được phân tích: (i) dữ liệu tuy lớn nhưng vẫn là câu hỏi hình thức sinh từ tiêu đề Điều, không phải câu đời thường, nên kéo mô hình lệch khỏi phân bố câu người dân hỏi; (ii) hiện tượng quên thảm họa (catastrophic forgetting), bộ mã hóa nền vốn đã được huấn luyện tốt, việc tinh chỉnh một epoch với negatives khó làm hỏng cấu trúc ngữ nghĩa sẵn có; (iii) giới hạn độ dài chuỗi để khả thi trên CPU. Bài học khoa học: đòn bẩy đúng không phải “nhiều dữ liệu hình thức” mà là đúng loại dữ liệu, câu hỏi đời thường có gán nhãn quy mô lớn, cùng tài nguyên huấn luyện phù hợp (GPU, độ dài chuỗi đầy đủ, nhiều epoch kèm dừng sớm theo tập kiểm định). Đây là cơ sở thực nghiệm trực tiếp cho hướng phát triển ở Chương 5, thay vì một đề xuất suy đoán.</w:t>
       </w:r>
     </w:p>
     <w:p>
@@ -11811,7 +12105,7 @@
           <w:color w:val="000000"/>
           <w:sz w:val="26"/>
         </w:rPr>
-        <w:t>4.16 Thí nghiệm 8 — Nâng cấp mô hình embedding (bge-m3)</w:t>
+        <w:t>4.16 Thí nghiệm 8: Nâng cấp mô hình embedding (bge-m3)</w:t>
       </w:r>
     </w:p>
     <w:p>
@@ -11826,7 +12120,7 @@
           <w:i w:val="0"/>
           <w:sz w:val="26"/>
         </w:rPr>
-        <w:t>Thí nghiệm 7 chỉ ra đòn bẩy còn lại là dữ liệu/mô hình mạnh hơn. Thay vì tinh chỉnh (vốn thiếu dữ liệu đời thường), đề tài thử HƯỚNG KHÁC: thay mô hình embedding nền PhoBERT bằng bge-m3, một bộ mã hóa đa ngữ hiện đại (568 triệu tham số, vector 1.024 chiều, hỗ trợ tiếng Việt, tối ưu cho truy xuất). Toàn bộ 367.462 đoạn được mã hóa lại bằng bge-m3 trên GPU (RTX 4060, fp16), bước này bất khả thi trên CPU nhưng chỉ mất khoảng một giờ trên GPU. So sánh truy xuất vector (mở, toàn corpus): trên câu mẫu, Hit@1 tăng 0,595 → 0,675 và MRR 0,707 → 0,780; trên câu tự nhiên, Hit@1 (nghiêm ngặt) tăng 0,13 → 0,20. Mô hình mạnh hơn cải thiện ĐỒNG THỜI cả câu mẫu lẫn câu tự nhiên mà không cần dữ liệu huấn luyện (Hình 4.8).</w:t>
+        <w:t>Thí nghiệm 7 chỉ ra đòn bẩy còn lại là dữ liệu/mô hình mạnh hơn. Thay vì tinh chỉnh (vốn thiếu dữ liệu đời thường), đề tài thử hướng khác: thay mô hình embedding nền PhoBERT bằng bge-m3, một bộ mã hóa đa ngữ hiện đại (568 triệu tham số, vector 1.024 chiều, hỗ trợ tiếng Việt, tối ưu cho truy xuất). Toàn bộ 367.462 đoạn được mã hóa lại bằng bge-m3 trên GPU (RTX 4060, fp16), bước này bất khả thi trên CPU nhưng chỉ mất khoảng một giờ trên GPU. So sánh truy xuất vector (mở, toàn corpus): trên câu mẫu, Hit@1 tăng 0,595 → 0,675 và MRR 0,707 → 0,780; trên câu tự nhiên, Hit@1 (nghiêm ngặt) tăng 0,13 → 0,20. Mô hình mạnh hơn cải thiện đồng thời cả câu mẫu lẫn câu tự nhiên mà không cần dữ liệu huấn luyện (Hình 4.8).</w:t>
       </w:r>
     </w:p>
     <w:p>
@@ -11897,7 +12191,7 @@
           <w:i w:val="0"/>
           <w:sz w:val="26"/>
         </w:rPr>
-        <w:t>Quan trọng hơn, việc cô lập từng thành phần trên bge-m3 (Bảng 4.11) cho một phát hiện đáng giá về pipeline: cấu hình tốt nhất là bge-m3 vector kết hợp từ điển ánh xạ (Hit@1 nghiêm ngặt 0,340; topic-level Hit@1 0,45 và Hit@10 0,79), trong khi reranker (cả PhoRanker lẫn bge-reranker-v2-m3 cùng họ) và BM25-hybrid lại LÀM GIẢM hiệu năng. Nguyên nhân không phải lỗi kỹ thuật: reranker xếp theo độ liên quan thực, mà với câu hỏi đời thường, văn bản liên quan nhất thường là nghị định hướng dẫn (dưới luật), bị reranker đẩy lên hạng nhất, khiến luật gốc được gán nhãn tụt xuống và Hit@1 nghiêm ngặt giảm (đây chính là vấn đề nhãn ở Mục 4.12.2 thể hiện ở tầng xếp hạng). Bài học: pipeline phải được tinh chỉnh theo từng mô hình nền; cấu hình tối ưu cho PhoBERT (hybrid + reranker) không còn tối ưu cho bge-m3.</w:t>
+        <w:t>Quan trọng hơn, việc cô lập từng thành phần trên bge-m3 (Bảng 4.11) cho một phát hiện đáng giá về pipeline: cấu hình tốt nhất là bge-m3 vector kết hợp từ điển ánh xạ (Hit@1 nghiêm ngặt 0,340; topic-level Hit@1 0,45 và Hit@10 0,79), trong khi reranker (cả PhoRanker lẫn bge-reranker-v2-m3 cùng họ) và BM25-hybrid lại làm giảm hiệu năng. Nguyên nhân không phải lỗi kỹ thuật: reranker xếp theo độ liên quan thực, mà với câu hỏi đời thường, văn bản liên quan nhất thường là nghị định hướng dẫn (dưới luật), bị reranker đẩy lên hạng nhất, khiến luật gốc được gán nhãn tụt xuống và Hit@1 nghiêm ngặt giảm (đây chính là vấn đề nhãn ở Mục 4.12.2 thể hiện ở tầng xếp hạng). Bài học: pipeline phải được tinh chỉnh theo từng mô hình nền; cấu hình tối ưu cho PhoBERT (hybrid + reranker) không còn tối ưu cho bge-m3.</w:t>
       </w:r>
     </w:p>
     <w:p>
@@ -12530,7 +12824,7 @@
           <w:i w:val="0"/>
           <w:sz w:val="26"/>
         </w:rPr>
-        <w:t>Cuối cùng, đề tài mở rộng từ điển ánh xạ ở quy mô tối đa bằng cách tự động: trích sạch 12.839 cụm thuật ngữ pháp lý (tiêu đề các “Điều” trong toàn corpus), mã hóa bằng bge-m3, rồi với mỗi câu hỏi đời thường nối thêm top-3 cụm pháp lý gần nhất về ngữ nghĩa (mở rộng truy vấn theo từ điển kiểm soát mở rộng). Tham số được chọn trên tập huấn luyện (71 câu) và báo cáo trên tập kiểm thử giữ riêng (29 câu) để tránh khớp quá mức. Kết hợp từ điển tay (chính xác cao) với lexicon ngữ nghĩa (độ phủ rộng) nâng Hit@1 nghiêm ngặt lên 0,360 và topic-level Hit@10 lên 0,940 (Bảng 4.11), toàn bộ không cần dữ liệu huấn luyện gán nhãn. Đáng chú ý, mở rộng ngữ nghĩa ĐƠN LẺ kém hơn từ điển tay, nhưng KẾT HỢP thì vượt, minh chứng hai nguồn bổ trợ nhau.</w:t>
+        <w:t>Cuối cùng, đề tài mở rộng từ điển ánh xạ ở quy mô tối đa bằng cách tự động: trích sạch 12.839 cụm thuật ngữ pháp lý (tiêu đề các “Điều” trong toàn corpus), mã hóa bằng bge-m3, rồi với mỗi câu hỏi đời thường nối thêm top-3 cụm pháp lý gần nhất về ngữ nghĩa (mở rộng truy vấn theo từ điển kiểm soát mở rộng). Tham số được chọn trên tập huấn luyện (71 câu) và báo cáo trên tập kiểm thử giữ riêng (29 câu) để tránh khớp quá mức. Kết hợp từ điển tay (chính xác cao) với lexicon ngữ nghĩa (độ phủ rộng) nâng Hit@1 nghiêm ngặt lên 0,360 và topic-level Hit@10 lên 0,940 (Bảng 4.11), toàn bộ không cần dữ liệu huấn luyện gán nhãn. Đáng chú ý, mở rộng ngữ nghĩa đơn lẻ kém hơn từ điển tay, nhưng kết hợp thì vượt, minh chứng hai nguồn bổ trợ nhau.</w:t>
       </w:r>
     </w:p>
     <w:p>
@@ -12548,7 +12842,7 @@
           <w:color w:val="000000"/>
           <w:sz w:val="26"/>
         </w:rPr>
-        <w:t>4.17 Thí nghiệm 9 — Mở rộng đánh giá và tinh chỉnh reranker</w:t>
+        <w:t>4.17 Thí nghiệm 9: Mở rộng đánh giá và tinh chỉnh reranker</w:t>
       </w:r>
     </w:p>
     <w:p>
@@ -13002,7 +13296,7 @@
           <w:i w:val="0"/>
           <w:sz w:val="26"/>
         </w:rPr>
-        <w:t>Lưu ý cách đọc Bảng 4.12: ba dòng đầu (bge-m3, +từ điển, +ngữ nghĩa) là ước lượng MỘT lần chạy trên toàn bộ 228 câu (điểm đơn, không có khoảng tin cậy), còn dòng reranker là trung bình ± độ lệch chuẩn qua 5-fold. Do đó bước nhảy 0,289 → 0,785 cần hiểu là so sánh giữa điểm đơn và trung bình CV; để chặt chẽ hơn, các dòng điểm đơn nên kèm khoảng tin cậy bootstrap trong nghiên cứu tiếp theo.</w:t>
+        <w:t>Lưu ý cách đọc Bảng 4.12: ba dòng đầu (bge-m3, +từ điển, +ngữ nghĩa) là ước lượng một lần chạy trên toàn bộ 228 câu (điểm đơn, không có khoảng tin cậy), còn dòng reranker là trung bình ± độ lệch chuẩn qua 5-fold. Do đó bước nhảy 0,289 → 0,785 cần hiểu là so sánh giữa điểm đơn và trung bình CV; để chặt chẽ hơn, các dòng điểm đơn nên kèm khoảng tin cậy bootstrap trong nghiên cứu tiếp theo.</w:t>
       </w:r>
     </w:p>
     <w:p>
@@ -13017,7 +13311,7 @@
           <w:i w:val="0"/>
           <w:sz w:val="26"/>
         </w:rPr>
-        <w:t>Reranker fine-tune cải thiện mạnh và ổn định: Hit@1 nghiêm ngặt trung bình 0,785 ± 0,026 qua 5 fold (từng fold 0,74–0,82), MRR 0,831 ± 0,027, chứng tỏ kết quả không do may mắn chia tập. Quan trọng, reranker này cũng nâng câu MẪU từ 0,675 lên 0,925 mà không làm hại câu chuẩn; cả hai bộ đánh giá đều nằm ngoài dữ liệu huấn luyện reranker. Kết quả này đảo ngược kết quả âm của reranker thô và là cấu hình tốt nhất toàn cục.</w:t>
+        <w:t>Reranker fine-tune cải thiện mạnh và ổn định: Hit@1 nghiêm ngặt trung bình 0,785 ± 0,026 qua 5 fold (từng fold 0,74–0,82), MRR 0,831 ± 0,027, chứng tỏ kết quả không do may mắn chia tập. Quan trọng, reranker này cũng nâng câu mẫu từ 0,675 lên 0,925 mà không làm hại câu chuẩn; cả hai bộ đánh giá đều nằm ngoài dữ liệu huấn luyện reranker. Kết quả này đảo ngược kết quả âm của reranker thô và là cấu hình tốt nhất toàn cục.</w:t>
       </w:r>
     </w:p>
     <w:p>
@@ -13032,7 +13326,7 @@
           <w:i w:val="0"/>
           <w:sz w:val="26"/>
         </w:rPr>
-        <w:t>Lưu ý trung thực: mức tăng rất lớn đặt ra nghi vấn liệu reranker có chỉ ghi nhớ “các mã luật này là đáp án” hay không, do 5-fold ở trên chia theo CÂU HỎI nên cùng một luật đích có thể xuất hiện ở cả train lẫn test. Để kiểm chứng định lượng, đề tài chạy thêm kiểm chứng chéo CHIA THEO LĨNH VỰC (leave-one-domain-out, 9 fold): mỗi fold giữ riêng toàn bộ một lĩnh vực và train trên các lĩnh vực còn lại, do đó không luật nào của tập kiểm thử từng xuất hiện khi huấn luyện.</w:t>
+        <w:t>Lưu ý trung thực: mức tăng rất lớn đặt ra nghi vấn liệu reranker có chỉ ghi nhớ “các mã luật này là đáp án” hay không, do 5-fold ở trên chia theo câu hỏi nên cùng một luật đích có thể xuất hiện ở cả train lẫn test. Để kiểm chứng định lượng, đề tài chạy thêm kiểm chứng chéo chia theo lĩnh vực (leave-one-domain-out, 9 fold): mỗi fold giữ riêng toàn bộ một lĩnh vực và train trên các lĩnh vực còn lại, do đó không luật nào của tập kiểm thử từng xuất hiện khi huấn luyện.</w:t>
       </w:r>
     </w:p>
     <w:p>
@@ -13315,7 +13609,7 @@
           <w:i w:val="0"/>
           <w:sz w:val="26"/>
         </w:rPr>
-        <w:t>Kết quả chia theo lĩnh vực (0,762) gần như tương đương chia theo câu hỏi (0,785): ngay cả với những luật chưa từng thấy khi huấn luyện, reranker vẫn xếp đúng. Điều này PHẦN LỚN LOẠI TRỪ giả thuyết ghi nhớ mã luật và cho thấy reranker học được tín hiệu liên quan tổng quát. Độ lệch chuẩn cao hơn (0,180) cho thấy có phụ thuộc lĩnh vực: một số lĩnh vực mới khó hơn (an toàn thực phẩm 0,48; khám chữa bệnh và phòng bệnh khoảng 0,55), số khác rất cao (rượu bia 1,00; thuốc lá 0,96). Dù vậy, câu hỏi “xếp luật gốc lên trên nghị định hướng dẫn có phục vụ người dùng tốt hơn không” vẫn nên được chuyên gia pháp lý thẩm định (phiếu thẩm định đã lập, Phụ lục 2).</w:t>
+        <w:t>Kết quả chia theo lĩnh vực (0,762) gần như tương đương chia theo câu hỏi (0,785): ngay cả với những luật chưa từng thấy khi huấn luyện, reranker vẫn xếp đúng. Điều này phần lớn loại trừ giả thuyết ghi nhớ mã luật và cho thấy reranker học được tín hiệu liên quan tổng quát. Độ lệch chuẩn cao hơn (0,180) cho thấy có phụ thuộc lĩnh vực: một số lĩnh vực mới khó hơn (an toàn thực phẩm 0,48; khám chữa bệnh và phòng bệnh khoảng 0,55), số khác rất cao (rượu bia 1,00; thuốc lá 0,96). Dù vậy, câu hỏi “xếp luật gốc lên trên nghị định hướng dẫn có phục vụ người dùng tốt hơn không” vẫn nên được chuyên gia pháp lý thẩm định (phiếu thẩm định đã lập, Phụ lục 2).</w:t>
       </w:r>
     </w:p>
     <w:p>
@@ -14077,7 +14371,7 @@
           <w:i w:val="0"/>
           <w:sz w:val="26"/>
         </w:rPr>
-        <w:t>Năm bài học rút ra. Thứ nhất, trong điều kiện mô hình nhỏ (PhoGPT 3,7 tỷ tham số), các hướng dựa trên mô hình SINH (viết lại, HyDE) đều thất bại do năng lực tuân thủ chỉ dẫn kém và bịa trích dẫn; giải pháp kỹ thuật XÁC ĐỊNH (từ điển ánh xạ) lại cải thiện thực. Thứ hai, ‘nhiều dữ liệu’ không đồng nghĩa ‘cải thiện’: tinh chỉnh bộ mã hóa với 8.000 cặp câu HÌNH THỨC còn làm hệ thống tệ đi, ĐÚNG LOẠI dữ liệu quan trọng hơn số lượng. Thứ ba, NÂNG CẤP MÔ HÌNH NỀN (bge-m3) cải thiện đồng thời mọi nhóm câu mà không cần dữ liệu huấn luyện; kết hợp từ điển + mở rộng ngữ nghĩa tự động đưa Hit@1 câu tự nhiên từ 0,160 lên 0,360. Thứ tư, pipeline phải tinh chỉnh theo mô hình nền: reranker/BM25 thô (tối ưu cho PhoBERT) làm giảm bge-m3, nhưng reranker được FINE-TUNE ĐÚNG dữ liệu (câu đời thường → đoạn luật đúng) lại là đòn bẩy MẠNH NHẤT, nâng Hit@1 lên 0,785 ± 0,026 (5-fold CV) và câu mẫu lên 0,925. Thứ năm, cần báo cáo trung thực cả thành công lẫn thất bại, và phân biệt ‘lỗi hệ thống’ với ‘lỗi/đặc thù của phép đo’ (nhãn nghiêm ngặt).</w:t>
+        <w:t>Năm bài học rút ra. Thứ nhất, trong điều kiện mô hình nhỏ (PhoGPT 3,7 tỷ tham số), các hướng dựa trên mô hình sinh (viết lại, HyDE) đều thất bại do năng lực tuân thủ chỉ dẫn kém và bịa trích dẫn; giải pháp kỹ thuật xác định (từ điển ánh xạ) lại cải thiện thực. Thứ hai, ‘nhiều dữ liệu’ không đồng nghĩa ‘cải thiện’: tinh chỉnh bộ mã hóa với 8.000 cặp câu hình thức còn làm hệ thống tệ đi, đúng loại dữ liệu quan trọng hơn số lượng. Thứ ba, nâng cấp mô hình nền (bge-m3) cải thiện đồng thời mọi nhóm câu mà không cần dữ liệu huấn luyện; kết hợp từ điển + mở rộng ngữ nghĩa tự động đưa Hit@1 câu tự nhiên từ 0,160 lên 0,360. Thứ tư, pipeline phải tinh chỉnh theo mô hình nền: reranker/BM25 thô (tối ưu cho PhoBERT) làm giảm bge-m3, nhưng reranker được fine-tune đúng dữ liệu (câu đời thường → đoạn luật đúng) lại là đòn bẩy mạnh nhất, nâng Hit@1 lên 0,785 ± 0,026 (5-fold CV) và câu mẫu lên 0,925. Thứ năm, cần báo cáo trung thực cả thành công lẫn thất bại, và phân biệt ‘lỗi hệ thống’ với ‘lỗi/đặc thù của phép đo’ (nhãn nghiêm ngặt).</w:t>
       </w:r>
     </w:p>
     <w:p>
@@ -14093,6 +14387,39 @@
           <w:sz w:val="26"/>
         </w:rPr>
         <w:t>Kết luận: khoảng cách từ vựng, thách thức lớn nhất, đã được thu hẹp mạnh bằng chuỗi kỹ thuật bổ trợ: từ điển ánh xạ + mô hình nền bge-m3 + mở rộng ngữ nghĩa (không cần dữ liệu huấn luyện), rồi reranker fine-tune (kiểm chứng 5-fold) đưa Hit@1 câu tự nhiên từ 0,160 lên ≈ 0,785 và câu mẫu lên 0,925. Việc báo cáo đầy đủ các kết quả âm (viết lại, HyDE, tinh chỉnh bộ mã hóa, lexicon quá lớn) kèm phân tích nguyên nhân, phát hiện ‘pipeline phụ thuộc mô hình nền’, và cảnh báo trung thực về cơ chế của reranker (cần thẩm định chuyên gia), là đóng góp về phương pháp của đồ án.</w:t>
+      </w:r>
+    </w:p>
+    <w:p>
+      <w:pPr>
+        <w:pStyle w:val="Heading2"/>
+        <w:keepNext/>
+        <w:spacing w:before="120" w:after="240" w:line="240" w:lineRule="auto"/>
+        <w:jc w:val="left"/>
+      </w:pPr>
+      <w:r>
+        <w:rPr>
+          <w:rFonts w:ascii="Times New Roman" w:hAnsi="Times New Roman" w:cs="Times New Roman"/>
+          <w:b/>
+          <w:i w:val="0"/>
+          <w:color w:val="000000"/>
+          <w:sz w:val="26"/>
+        </w:rPr>
+        <w:t>4.19 Kết luận chương</w:t>
+      </w:r>
+    </w:p>
+    <w:p>
+      <w:pPr>
+        <w:spacing w:before="200" w:after="0" w:line="360" w:lineRule="auto"/>
+        <w:jc w:val="both"/>
+      </w:pPr>
+      <w:r>
+        <w:rPr>
+          <w:rFonts w:ascii="Times New Roman" w:hAnsi="Times New Roman" w:cs="Times New Roman"/>
+          <w:b w:val="0"/>
+          <w:i w:val="0"/>
+          <w:sz w:val="26"/>
+        </w:rPr>
+        <w:t>Chương 4 đã trả lời bốn câu hỏi nghiên cứu bằng thực nghiệm có đối chứng. CHNC 2: từng kỹ thuật được định lượng, trong đó tách từ và hybrid đóng góp rõ rệt, còn reranker thô tùy thuộc phân bố câu hỏi (Mục 4.3–4.8). CHNC 4: kết quả ổn định khi mở rộng lên 650 câu và qua kiểm chứng chéo (Mục 4.9, 4.17). CHNC 3: với câu hỏi diễn đạt tự nhiên, chuỗi kỹ thuật bge-m3 + từ điển ánh xạ + mở rộng ngữ nghĩa + reranker fine-tune nâng Hit@1 từ 0,160 lên khoảng 0,785 (kiểm chứng chéo), đồng thời báo cáo trung thực các hướng chưa thành công (Mục 4.12–4.18). CHNC 1 được khẳng định qua toàn bộ: một hệ RAG tiếng Việt hoàn chỉnh vận hành được trong giới hạn tài nguyên. Những kết quả này là cơ sở cho kết luận và hướng phát triển ở Chương 5.</w:t>
       </w:r>
     </w:p>
     <w:p>
@@ -14117,6 +14444,21 @@
     </w:p>
     <w:p>
       <w:pPr>
+        <w:spacing w:before="200" w:after="0" w:line="360" w:lineRule="auto"/>
+        <w:jc w:val="both"/>
+      </w:pPr>
+      <w:r>
+        <w:rPr>
+          <w:rFonts w:ascii="Times New Roman" w:hAnsi="Times New Roman" w:cs="Times New Roman"/>
+          <w:b w:val="0"/>
+          <w:i w:val="0"/>
+          <w:sz w:val="26"/>
+        </w:rPr>
+        <w:t>Trên cơ sở các kết quả thực nghiệm ở Chương 4, Chương 5 tổng kết những đóng góp chính của đề tài, nêu tính mới và khả năng ứng dụng, thẳng thắn chỉ ra các hạn chế, và đề xuất hướng phát triển tiếp theo.</w:t>
+      </w:r>
+    </w:p>
+    <w:p>
+      <w:pPr>
         <w:pStyle w:val="Heading2"/>
         <w:keepNext/>
         <w:spacing w:before="120" w:after="240" w:line="240" w:lineRule="auto"/>
@@ -14178,7 +14520,7 @@
           <w:i w:val="0"/>
           <w:sz w:val="26"/>
         </w:rPr>
-        <w:t>Tính mới của đề tài thể hiện ở việc kết hợp và kiểm chứng có hệ thống nhiều kỹ thuật phù hợp tiếng Việt và miền pháp luật. Cấu hình cơ sở gồm bi-encoder dựa trên PhoBERT, hybrid BM25+vector kèm nhận diện số hiệu văn bản, reranker PhoRanker và sinh có ràng buộc trích dẫn bằng PhoGPT. Trên cơ sở đó, đề tài xác lập một cấu hình ĐỀ XUẤT mạnh hơn cho câu hỏi đời thường, gồm: mô hình nền bge-m3, từ điển ánh xạ đời thường sang pháp lý, mở rộng truy vấn theo ngữ nghĩa, và reranker được fine-tune trên dữ liệu của miền. Một phát hiện đáng chú ý: pipeline phải được tinh chỉnh theo mô hình nền, vì reranker và BM25 vốn tối ưu cho PhoBERT lại làm giảm hiệu năng khi đặt sau bge-m3, còn reranker được fine-tune thì mới phát huy. Điểm khác biệt so với các hệ RAG phổ thông là cơ chế nhận diện số hiệu văn bản, giúp khắc phục điểm yếu của tìm kiếm ngữ nghĩa với định danh chính xác.</w:t>
+        <w:t>Tính mới của đề tài thể hiện ở việc kết hợp và kiểm chứng có hệ thống nhiều kỹ thuật phù hợp tiếng Việt và miền pháp luật. Cấu hình cơ sở gồm bi-encoder dựa trên PhoBERT, hybrid BM25+vector kèm nhận diện số hiệu văn bản, reranker PhoRanker và sinh có ràng buộc trích dẫn bằng PhoGPT. Trên cơ sở đó, đề tài xác lập một cấu hình đề xuất mạnh hơn cho câu hỏi đời thường, gồm: mô hình nền bge-m3, từ điển ánh xạ đời thường sang pháp lý, mở rộng truy vấn theo ngữ nghĩa, và reranker được fine-tune trên dữ liệu của miền. Một phát hiện đáng chú ý: pipeline phải được tinh chỉnh theo mô hình nền, vì reranker và BM25 vốn tối ưu cho PhoBERT lại làm giảm hiệu năng khi đặt sau bge-m3, còn reranker được fine-tune thì mới phát huy. Điểm khác biệt so với các hệ RAG phổ thông là cơ chế nhận diện số hiệu văn bản, giúp khắc phục điểm yếu của tìm kiếm ngữ nghĩa với định danh chính xác.</w:t>
       </w:r>
     </w:p>
     <w:p>
@@ -14256,7 +14598,7 @@
           <w:i w:val="0"/>
           <w:sz w:val="26"/>
         </w:rPr>
-        <w:t>Các kỹ thuật phía truy vấn dựa trên LLM nhỏ (viết lại, HyDE) và tinh chỉnh bộ mã hóa với dữ liệu sẵn có đều CHƯA cải thiện được câu hỏi tự nhiên, bị giới hạn bởi năng lực mô hình 3,7 tỷ tham số và thiếu dữ liệu huấn luyện đúng loại (câu đời thường có nhãn).</w:t>
+        <w:t>Các kỹ thuật phía truy vấn dựa trên LLM nhỏ (viết lại, HyDE) và tinh chỉnh bộ mã hóa với dữ liệu sẵn có đều chưa cải thiện được câu hỏi tự nhiên, bị giới hạn bởi năng lực mô hình 3,7 tỷ tham số và thiếu dữ liệu huấn luyện đúng loại (câu đời thường có nhãn).</w:t>
       </w:r>
     </w:p>
     <w:p>
@@ -14649,6 +14991,126 @@
           <w:sz w:val="26"/>
         </w:rPr>
         <w:t>J. Chen et al., “BGE M3-Embedding: Multi-Lingual, Multi-Functionality, Multi-Granularity Text Embeddings Through Self-Knowledge Distillation,” arXiv:2402.03216, 2024. [Online]. Available: https://huggingface.co/BAAI/bge-m3</w:t>
+      </w:r>
+    </w:p>
+    <w:p>
+      <w:pPr>
+        <w:spacing w:line="360" w:lineRule="auto" w:before="0" w:after="120"/>
+        <w:ind w:left="567" w:hanging="567"/>
+      </w:pPr>
+      <w:r>
+        <w:rPr>
+          <w:rFonts w:ascii="Times New Roman" w:hAnsi="Times New Roman" w:cs="Times New Roman"/>
+          <w:b w:val="0"/>
+          <w:i w:val="0"/>
+          <w:sz w:val="26"/>
+        </w:rPr>
+        <w:t xml:space="preserve">[12] </w:t>
+      </w:r>
+      <w:r>
+        <w:rPr>
+          <w:rFonts w:ascii="Times New Roman" w:hAnsi="Times New Roman" w:cs="Times New Roman"/>
+          <w:b w:val="0"/>
+          <w:i w:val="0"/>
+          <w:sz w:val="26"/>
+        </w:rPr>
+        <w:t>Z. Ji et al., “Survey of Hallucination in Natural Language Generation,” ACM Computing Surveys, vol. 55, no. 12, 2023.</w:t>
+      </w:r>
+    </w:p>
+    <w:p>
+      <w:pPr>
+        <w:spacing w:line="360" w:lineRule="auto" w:before="0" w:after="120"/>
+        <w:ind w:left="567" w:hanging="567"/>
+      </w:pPr>
+      <w:r>
+        <w:rPr>
+          <w:rFonts w:ascii="Times New Roman" w:hAnsi="Times New Roman" w:cs="Times New Roman"/>
+          <w:b w:val="0"/>
+          <w:i w:val="0"/>
+          <w:sz w:val="26"/>
+        </w:rPr>
+        <w:t xml:space="preserve">[13] </w:t>
+      </w:r>
+      <w:r>
+        <w:rPr>
+          <w:rFonts w:ascii="Times New Roman" w:hAnsi="Times New Roman" w:cs="Times New Roman"/>
+          <w:b w:val="0"/>
+          <w:i w:val="0"/>
+          <w:sz w:val="26"/>
+        </w:rPr>
+        <w:t>A. Vaswani et al., “Attention Is All You Need,” in Advances in Neural Information Processing Systems (NeurIPS), 2017.</w:t>
+      </w:r>
+    </w:p>
+    <w:p>
+      <w:pPr>
+        <w:spacing w:line="360" w:lineRule="auto" w:before="0" w:after="120"/>
+        <w:ind w:left="567" w:hanging="567"/>
+      </w:pPr>
+      <w:r>
+        <w:rPr>
+          <w:rFonts w:ascii="Times New Roman" w:hAnsi="Times New Roman" w:cs="Times New Roman"/>
+          <w:b w:val="0"/>
+          <w:i w:val="0"/>
+          <w:sz w:val="26"/>
+        </w:rPr>
+        <w:t xml:space="preserve">[14] </w:t>
+      </w:r>
+      <w:r>
+        <w:rPr>
+          <w:rFonts w:ascii="Times New Roman" w:hAnsi="Times New Roman" w:cs="Times New Roman"/>
+          <w:b w:val="0"/>
+          <w:i w:val="0"/>
+          <w:sz w:val="26"/>
+        </w:rPr>
+        <w:t>Y. Liu et al., “RoBERTa: A Robustly Optimized BERT Pretraining Approach,” arXiv:1907.11692, 2019.</w:t>
+      </w:r>
+    </w:p>
+    <w:p>
+      <w:pPr>
+        <w:spacing w:line="360" w:lineRule="auto" w:before="0" w:after="120"/>
+        <w:ind w:left="567" w:hanging="567"/>
+      </w:pPr>
+      <w:r>
+        <w:rPr>
+          <w:rFonts w:ascii="Times New Roman" w:hAnsi="Times New Roman" w:cs="Times New Roman"/>
+          <w:b w:val="0"/>
+          <w:i w:val="0"/>
+          <w:sz w:val="26"/>
+        </w:rPr>
+        <w:t xml:space="preserve">[15] </w:t>
+      </w:r>
+      <w:r>
+        <w:rPr>
+          <w:rFonts w:ascii="Times New Roman" w:hAnsi="Times New Roman" w:cs="Times New Roman"/>
+          <w:b w:val="0"/>
+          <w:i w:val="0"/>
+          <w:sz w:val="26"/>
+        </w:rPr>
+        <w:t>Yu. A. Malkov and D. A. Yashunin, “Efficient and Robust Approximate Nearest Neighbor Search Using Hierarchical Navigable Small World Graphs,” IEEE Trans. Pattern Analysis and Machine Intelligence, vol. 42, no. 4, 2020.</w:t>
+      </w:r>
+    </w:p>
+    <w:p>
+      <w:pPr>
+        <w:spacing w:line="360" w:lineRule="auto" w:before="0" w:after="120"/>
+        <w:ind w:left="567" w:hanging="567"/>
+      </w:pPr>
+      <w:r>
+        <w:rPr>
+          <w:rFonts w:ascii="Times New Roman" w:hAnsi="Times New Roman" w:cs="Times New Roman"/>
+          <w:b w:val="0"/>
+          <w:i w:val="0"/>
+          <w:sz w:val="26"/>
+        </w:rPr>
+        <w:t xml:space="preserve">[16] </w:t>
+      </w:r>
+      <w:r>
+        <w:rPr>
+          <w:rFonts w:ascii="Times New Roman" w:hAnsi="Times New Roman" w:cs="Times New Roman"/>
+          <w:b w:val="0"/>
+          <w:i w:val="0"/>
+          <w:sz w:val="26"/>
+        </w:rPr>
+        <w:t>L. Gao, X. Ma, J. Lin, and J. Callan, “Precise Zero-Shot Dense Retrieval without Relevance Labels (HyDE),” in Proc. ACL, 2023.</w:t>
       </w:r>
     </w:p>
     <w:p>

</xml_diff>